<commit_message>
docs: styled Word version - cover page, heading colors, shaded code blocks, table headers, page numbers; add styling script
</commit_message>
<xml_diff>
--- a/docs/walkthrough.docx
+++ b/docs/walkthrough.docx
@@ -2,30 +2,6 @@
 <file path=word/document.xml><?xml version="1.0" encoding="utf-8"?>
 <w:document xmlns:w="http://schemas.openxmlformats.org/wordprocessingml/2006/main" xmlns:m="http://schemas.openxmlformats.org/officeDocument/2006/math" xmlns:r="http://schemas.openxmlformats.org/officeDocument/2006/relationships" xmlns:o="urn:schemas-microsoft-com:office:office" xmlns:v="urn:schemas-microsoft-com:vml" xmlns:w10="urn:schemas-microsoft-com:office:word" xmlns:a="http://schemas.openxmlformats.org/drawingml/2006/main" xmlns:pic="http://schemas.openxmlformats.org/drawingml/2006/picture" xmlns:wp="http://schemas.openxmlformats.org/drawingml/2006/wordprocessingDrawing">
   <w:body>
-    <w:p>
-      <w:pPr>
-        <w:pStyle w:val="Title"/>
-      </w:pPr>
-      <w:r>
-        <w:t xml:space="preserve">DocuTrust Walkthrough — SAST, Secrets Scanning, and Live Secret Verification</w:t>
-      </w:r>
-    </w:p>
-    <w:p>
-      <w:pPr>
-        <w:pStyle w:val="Author"/>
-      </w:pPr>
-      <w:r>
-        <w:t xml:space="preserve">DevSecOps Project 1</w:t>
-      </w:r>
-    </w:p>
-    <w:p>
-      <w:pPr>
-        <w:pStyle w:val="Date"/>
-      </w:pPr>
-      <w:r>
-        <w:t xml:space="preserve">2026-08-18</w:t>
-      </w:r>
-    </w:p>
     <w:sdt>
       <w:sdtPr>
         <w:docPartObj>
@@ -54,6 +30,102 @@
     </w:sdt>
     <w:bookmarkStart w:id="101" w:name="Xee5ab2b315e0a51b995ef048254650fded623cb"/>
     <w:p>
+      <w:r>
+        <w:br/>
+      </w:r>
+    </w:p>
+    <w:p>
+      <w:pPr>
+        <w:jc w:val="center"/>
+      </w:pPr>
+      <w:r>
+        <w:t>DocuTrust</w:t>
+      </w:r>
+      <w:r>
+        <w:rPr>
+          <w:b/>
+          <w:color w:val="1F4E79"/>
+          <w:sz w:val="80"/>
+        </w:rPr>
+        <w:t>DocuTrust</w:t>
+      </w:r>
+    </w:p>
+    <w:p>
+      <w:pPr>
+        <w:jc w:val="center"/>
+      </w:pPr>
+      <w:r>
+        <w:t>DevSecOps Project 1 — Walkthrough</w:t>
+      </w:r>
+      <w:r>
+        <w:rPr>
+          <w:color w:val="2E74B5"/>
+          <w:sz w:val="40"/>
+        </w:rPr>
+        <w:t>DevSecOps Project 1 — Walkthrough</w:t>
+      </w:r>
+    </w:p>
+    <w:p>
+      <w:pPr>
+        <w:jc w:val="center"/>
+      </w:pPr>
+      <w:r>
+        <w:t>SAST · Secrets Scanning · Live Secret Verification</w:t>
+      </w:r>
+      <w:r>
+        <w:rPr>
+          <w:i/>
+          <w:sz w:val="26"/>
+        </w:rPr>
+        <w:t>SAST · Secrets Scanning · Live Secret Verification</w:t>
+      </w:r>
+    </w:p>
+    <w:p>
+      <w:pPr>
+        <w:jc w:val="center"/>
+      </w:pPr>
+      <w:r>
+        <w:rPr>
+          <w:color w:val="A6A6A6"/>
+        </w:rPr>
+        <w:t xml:space="preserve">— — — — — — — — — — — — </w:t>
+      </w:r>
+    </w:p>
+    <w:p>
+      <w:pPr>
+        <w:jc w:val="center"/>
+      </w:pPr>
+      <w:r>
+        <w:t>Every command in this walkthrough actually ran, and every output quoted is real captured output from the tools — with evidence files and screenshots cited along the way.</w:t>
+      </w:r>
+      <w:r>
+        <w:rPr>
+          <w:color w:val="595959"/>
+          <w:sz w:val="20"/>
+        </w:rPr>
+        <w:t>Every command in this walkthrough actually ran, and every output quoted is real captured output from the tools — with evidence files and screenshots cited along the way.</w:t>
+      </w:r>
+    </w:p>
+    <w:p>
+      <w:pPr>
+        <w:jc w:val="center"/>
+      </w:pPr>
+      <w:r>
+        <w:t>August 2026</w:t>
+      </w:r>
+      <w:r>
+        <w:rPr>
+          <w:sz w:val="22"/>
+        </w:rPr>
+        <w:t>August 2026</w:t>
+      </w:r>
+    </w:p>
+    <w:p>
+      <w:r>
+        <w:br w:type="page"/>
+      </w:r>
+    </w:p>
+    <w:p>
       <w:pPr>
         <w:pStyle w:val="Heading1"/>
       </w:pPr>
@@ -301,8 +373,8 @@
       <w:tblPr>
         <w:tblStyle w:val="Table"/>
         <w:tblW w:type="pct" w:w="5000"/>
+        <w:jc w:val="center"/>
         <w:tblLook w:firstRow="1" w:lastRow="0" w:firstColumn="0" w:lastColumn="0" w:noHBand="0" w:noVBand="0" w:val="0020"/>
-        <w:jc w:val="start"/>
       </w:tblPr>
       <w:tblGrid>
         <w:gridCol w:w="2640"/>
@@ -314,37 +386,52 @@
           <w:tblHeader w:val="true"/>
         </w:trPr>
         <w:tc>
-          <w:tcPr/>
+          <w:tcPr>
+            <w:shd w:val="clear" w:color="auto" w:fill="DEEAF6"/>
+          </w:tcPr>
           <w:p>
             <w:pPr>
               <w:pStyle w:val="Compact"/>
               <w:jc w:val="left"/>
             </w:pPr>
             <w:r>
+              <w:rPr>
+                <w:b/>
+              </w:rPr>
               <w:t xml:space="preserve">Seeded finding</w:t>
             </w:r>
           </w:p>
         </w:tc>
         <w:tc>
-          <w:tcPr/>
+          <w:tcPr>
+            <w:shd w:val="clear" w:color="auto" w:fill="DEEAF6"/>
+          </w:tcPr>
           <w:p>
             <w:pPr>
               <w:pStyle w:val="Compact"/>
               <w:jc w:val="left"/>
             </w:pPr>
             <w:r>
+              <w:rPr>
+                <w:b/>
+              </w:rPr>
               <w:t xml:space="preserve">What it is</w:t>
             </w:r>
           </w:p>
         </w:tc>
         <w:tc>
-          <w:tcPr/>
+          <w:tcPr>
+            <w:shd w:val="clear" w:color="auto" w:fill="DEEAF6"/>
+          </w:tcPr>
           <w:p>
             <w:pPr>
               <w:pStyle w:val="Compact"/>
               <w:jc w:val="left"/>
             </w:pPr>
             <w:r>
+              <w:rPr>
+                <w:b/>
+              </w:rPr>
               <w:t xml:space="preserve">Is it a real problem?</w:t>
             </w:r>
           </w:p>
@@ -623,8 +710,8 @@
       <w:tblPr>
         <w:tblStyle w:val="Table"/>
         <w:tblW w:type="pct" w:w="5000"/>
+        <w:jc w:val="center"/>
         <w:tblLook w:firstRow="1" w:lastRow="0" w:firstColumn="0" w:lastColumn="0" w:noHBand="0" w:noVBand="0" w:val="0020"/>
-        <w:jc w:val="start"/>
       </w:tblPr>
       <w:tblGrid>
         <w:gridCol w:w="2640"/>
@@ -636,37 +723,52 @@
           <w:tblHeader w:val="true"/>
         </w:trPr>
         <w:tc>
-          <w:tcPr/>
+          <w:tcPr>
+            <w:shd w:val="clear" w:color="auto" w:fill="DEEAF6"/>
+          </w:tcPr>
           <w:p>
             <w:pPr>
               <w:pStyle w:val="Compact"/>
               <w:jc w:val="left"/>
             </w:pPr>
             <w:r>
+              <w:rPr>
+                <w:b/>
+              </w:rPr>
               <w:t xml:space="preserve">Stage</w:t>
             </w:r>
           </w:p>
         </w:tc>
         <w:tc>
-          <w:tcPr/>
+          <w:tcPr>
+            <w:shd w:val="clear" w:color="auto" w:fill="DEEAF6"/>
+          </w:tcPr>
           <w:p>
             <w:pPr>
               <w:pStyle w:val="Compact"/>
               <w:jc w:val="left"/>
             </w:pPr>
             <w:r>
+              <w:rPr>
+                <w:b/>
+              </w:rPr>
               <w:t xml:space="preserve">What you do</w:t>
             </w:r>
           </w:p>
         </w:tc>
         <w:tc>
-          <w:tcPr/>
+          <w:tcPr>
+            <w:shd w:val="clear" w:color="auto" w:fill="DEEAF6"/>
+          </w:tcPr>
           <w:p>
             <w:pPr>
               <w:pStyle w:val="Compact"/>
               <w:jc w:val="left"/>
             </w:pPr>
             <w:r>
+              <w:rPr>
+                <w:b/>
+              </w:rPr>
               <w:t xml:space="preserve">Why</w:t>
             </w:r>
           </w:p>
@@ -1212,6 +1314,8 @@
     <w:p>
       <w:pPr>
         <w:pStyle w:val="SourceCode"/>
+        <w:shd w:val="clear" w:color="auto" w:fill="F2F2F2"/>
+        <w:spacing w:after="0" w:before="0"/>
       </w:pPr>
       <w:r>
         <w:rPr>
@@ -1255,6 +1359,8 @@
     <w:p>
       <w:pPr>
         <w:pStyle w:val="SourceCode"/>
+        <w:shd w:val="clear" w:color="auto" w:fill="F2F2F2"/>
+        <w:spacing w:after="0" w:before="0"/>
       </w:pPr>
       <w:r>
         <w:rPr>
@@ -1298,6 +1404,8 @@
     <w:p>
       <w:pPr>
         <w:pStyle w:val="SourceCode"/>
+        <w:shd w:val="clear" w:color="auto" w:fill="F2F2F2"/>
+        <w:spacing w:after="0" w:before="0"/>
       </w:pPr>
       <w:r>
         <w:rPr>
@@ -1344,6 +1452,8 @@
     <w:p>
       <w:pPr>
         <w:pStyle w:val="SourceCode"/>
+        <w:shd w:val="clear" w:color="auto" w:fill="F2F2F2"/>
+        <w:spacing w:after="0" w:before="0"/>
       </w:pPr>
       <w:r>
         <w:rPr>
@@ -1387,6 +1497,8 @@
     <w:p>
       <w:pPr>
         <w:pStyle w:val="SourceCode"/>
+        <w:shd w:val="clear" w:color="auto" w:fill="F2F2F2"/>
+        <w:spacing w:after="0" w:before="0"/>
       </w:pPr>
       <w:r>
         <w:rPr>
@@ -1513,6 +1625,8 @@
     <w:p>
       <w:pPr>
         <w:pStyle w:val="SourceCode"/>
+        <w:shd w:val="clear" w:color="auto" w:fill="F2F2F2"/>
+        <w:spacing w:after="0" w:before="0"/>
       </w:pPr>
       <w:r>
         <w:rPr>
@@ -1536,6 +1650,8 @@
     <w:p>
       <w:pPr>
         <w:pStyle w:val="SourceCode"/>
+        <w:shd w:val="clear" w:color="auto" w:fill="F2F2F2"/>
+        <w:spacing w:after="0" w:before="0"/>
       </w:pPr>
       <w:r>
         <w:rPr>
@@ -1736,6 +1852,8 @@
     <w:p>
       <w:pPr>
         <w:pStyle w:val="SourceCode"/>
+        <w:shd w:val="clear" w:color="auto" w:fill="F2F2F2"/>
+        <w:spacing w:after="0" w:before="0"/>
       </w:pPr>
       <w:r>
         <w:rPr>
@@ -1773,6 +1891,8 @@
     <w:p>
       <w:pPr>
         <w:pStyle w:val="SourceCode"/>
+        <w:shd w:val="clear" w:color="auto" w:fill="F2F2F2"/>
+        <w:spacing w:after="0" w:before="0"/>
       </w:pPr>
       <w:r>
         <w:rPr>
@@ -1854,6 +1974,8 @@
     <w:p>
       <w:pPr>
         <w:pStyle w:val="SourceCode"/>
+        <w:shd w:val="clear" w:color="auto" w:fill="F2F2F2"/>
+        <w:spacing w:after="0" w:before="0"/>
       </w:pPr>
       <w:r>
         <w:rPr>
@@ -1891,6 +2013,8 @@
     <w:p>
       <w:pPr>
         <w:pStyle w:val="SourceCode"/>
+        <w:shd w:val="clear" w:color="auto" w:fill="F2F2F2"/>
+        <w:spacing w:after="0" w:before="0"/>
       </w:pPr>
       <w:r>
         <w:rPr>
@@ -2191,6 +2315,8 @@
     <w:p>
       <w:pPr>
         <w:pStyle w:val="SourceCode"/>
+        <w:shd w:val="clear" w:color="auto" w:fill="F2F2F2"/>
+        <w:spacing w:after="0" w:before="0"/>
       </w:pPr>
       <w:r>
         <w:rPr>
@@ -2236,6 +2362,8 @@
     <w:p>
       <w:pPr>
         <w:pStyle w:val="SourceCode"/>
+        <w:shd w:val="clear" w:color="auto" w:fill="F2F2F2"/>
+        <w:spacing w:after="0" w:before="0"/>
       </w:pPr>
       <w:r>
         <w:rPr>
@@ -2397,6 +2525,8 @@
     <w:p>
       <w:pPr>
         <w:pStyle w:val="SourceCode"/>
+        <w:shd w:val="clear" w:color="auto" w:fill="F2F2F2"/>
+        <w:spacing w:after="0" w:before="0"/>
       </w:pPr>
       <w:r>
         <w:rPr>
@@ -2521,6 +2651,8 @@
     <w:p>
       <w:pPr>
         <w:pStyle w:val="SourceCode"/>
+        <w:shd w:val="clear" w:color="auto" w:fill="F2F2F2"/>
+        <w:spacing w:after="0" w:before="0"/>
       </w:pPr>
       <w:r>
         <w:rPr>
@@ -2558,6 +2690,8 @@
     <w:p>
       <w:pPr>
         <w:pStyle w:val="SourceCode"/>
+        <w:shd w:val="clear" w:color="auto" w:fill="F2F2F2"/>
+        <w:spacing w:after="0" w:before="0"/>
       </w:pPr>
       <w:r>
         <w:rPr>
@@ -2604,6 +2738,8 @@
     <w:p>
       <w:pPr>
         <w:pStyle w:val="SourceCode"/>
+        <w:shd w:val="clear" w:color="auto" w:fill="F2F2F2"/>
+        <w:spacing w:after="0" w:before="0"/>
       </w:pPr>
       <w:r>
         <w:rPr>
@@ -2621,6 +2757,8 @@
     <w:p>
       <w:pPr>
         <w:pStyle w:val="SourceCode"/>
+        <w:shd w:val="clear" w:color="auto" w:fill="F2F2F2"/>
+        <w:spacing w:after="0" w:before="0"/>
       </w:pPr>
       <w:r>
         <w:rPr>
@@ -2762,6 +2900,8 @@
     <w:p>
       <w:pPr>
         <w:pStyle w:val="SourceCode"/>
+        <w:shd w:val="clear" w:color="auto" w:fill="F2F2F2"/>
+        <w:spacing w:after="0" w:before="0"/>
       </w:pPr>
       <w:r>
         <w:rPr>
@@ -2972,6 +3112,8 @@
     <w:p>
       <w:pPr>
         <w:pStyle w:val="SourceCode"/>
+        <w:shd w:val="clear" w:color="auto" w:fill="F2F2F2"/>
+        <w:spacing w:after="0" w:before="0"/>
       </w:pPr>
       <w:r>
         <w:rPr>
@@ -3145,8 +3287,8 @@
       <w:tblPr>
         <w:tblStyle w:val="Table"/>
         <w:tblW w:type="pct" w:w="5000"/>
+        <w:jc w:val="center"/>
         <w:tblLook w:firstRow="1" w:lastRow="0" w:firstColumn="0" w:lastColumn="0" w:noHBand="0" w:noVBand="0" w:val="0020"/>
-        <w:jc w:val="start"/>
       </w:tblPr>
       <w:tblGrid>
         <w:gridCol w:w="3960"/>
@@ -3157,25 +3299,35 @@
           <w:tblHeader w:val="true"/>
         </w:trPr>
         <w:tc>
-          <w:tcPr/>
+          <w:tcPr>
+            <w:shd w:val="clear" w:color="auto" w:fill="DEEAF6"/>
+          </w:tcPr>
           <w:p>
             <w:pPr>
               <w:pStyle w:val="Compact"/>
               <w:jc w:val="left"/>
             </w:pPr>
             <w:r>
+              <w:rPr>
+                <w:b/>
+              </w:rPr>
               <w:t xml:space="preserve">Part</w:t>
             </w:r>
           </w:p>
         </w:tc>
         <w:tc>
-          <w:tcPr/>
+          <w:tcPr>
+            <w:shd w:val="clear" w:color="auto" w:fill="DEEAF6"/>
+          </w:tcPr>
           <w:p>
             <w:pPr>
               <w:pStyle w:val="Compact"/>
               <w:jc w:val="left"/>
             </w:pPr>
             <w:r>
+              <w:rPr>
+                <w:b/>
+              </w:rPr>
               <w:t xml:space="preserve">What it does</w:t>
             </w:r>
           </w:p>
@@ -3625,6 +3777,8 @@
     <w:p>
       <w:pPr>
         <w:pStyle w:val="SourceCode"/>
+        <w:shd w:val="clear" w:color="auto" w:fill="F2F2F2"/>
+        <w:spacing w:after="0" w:before="0"/>
       </w:pPr>
       <w:r>
         <w:rPr>
@@ -3672,6 +3826,8 @@
     <w:p>
       <w:pPr>
         <w:pStyle w:val="SourceCode"/>
+        <w:shd w:val="clear" w:color="auto" w:fill="F2F2F2"/>
+        <w:spacing w:after="0" w:before="0"/>
       </w:pPr>
       <w:r>
         <w:rPr>
@@ -3798,6 +3954,8 @@
     <w:p>
       <w:pPr>
         <w:pStyle w:val="SourceCode"/>
+        <w:shd w:val="clear" w:color="auto" w:fill="F2F2F2"/>
+        <w:spacing w:after="0" w:before="0"/>
       </w:pPr>
       <w:r>
         <w:rPr>
@@ -3815,6 +3973,8 @@
     <w:p>
       <w:pPr>
         <w:pStyle w:val="SourceCode"/>
+        <w:shd w:val="clear" w:color="auto" w:fill="F2F2F2"/>
+        <w:spacing w:after="0" w:before="0"/>
       </w:pPr>
       <w:r>
         <w:rPr>
@@ -3927,6 +4087,8 @@
     <w:p>
       <w:pPr>
         <w:pStyle w:val="SourceCode"/>
+        <w:shd w:val="clear" w:color="auto" w:fill="F2F2F2"/>
+        <w:spacing w:after="0" w:before="0"/>
       </w:pPr>
       <w:r>
         <w:rPr>
@@ -4055,6 +4217,8 @@
     <w:p>
       <w:pPr>
         <w:pStyle w:val="SourceCode"/>
+        <w:shd w:val="clear" w:color="auto" w:fill="F2F2F2"/>
+        <w:spacing w:after="0" w:before="0"/>
       </w:pPr>
       <w:r>
         <w:rPr>
@@ -4305,6 +4469,8 @@
     <w:p>
       <w:pPr>
         <w:pStyle w:val="SourceCode"/>
+        <w:shd w:val="clear" w:color="auto" w:fill="F2F2F2"/>
+        <w:spacing w:after="0" w:before="0"/>
       </w:pPr>
       <w:r>
         <w:rPr>
@@ -4399,6 +4565,8 @@
     <w:p>
       <w:pPr>
         <w:pStyle w:val="SourceCode"/>
+        <w:shd w:val="clear" w:color="auto" w:fill="F2F2F2"/>
+        <w:spacing w:after="0" w:before="0"/>
       </w:pPr>
       <w:r>
         <w:rPr>
@@ -4505,6 +4673,8 @@
     <w:p>
       <w:pPr>
         <w:pStyle w:val="SourceCode"/>
+        <w:shd w:val="clear" w:color="auto" w:fill="F2F2F2"/>
+        <w:spacing w:after="0" w:before="0"/>
       </w:pPr>
       <w:r>
         <w:rPr>
@@ -4566,6 +4736,8 @@
     <w:p>
       <w:pPr>
         <w:pStyle w:val="SourceCode"/>
+        <w:shd w:val="clear" w:color="auto" w:fill="F2F2F2"/>
+        <w:spacing w:after="0" w:before="0"/>
       </w:pPr>
       <w:r>
         <w:rPr>
@@ -4591,6 +4763,8 @@
     <w:p>
       <w:pPr>
         <w:pStyle w:val="SourceCode"/>
+        <w:shd w:val="clear" w:color="auto" w:fill="F2F2F2"/>
+        <w:spacing w:after="0" w:before="0"/>
       </w:pPr>
       <w:r>
         <w:rPr>
@@ -4778,6 +4952,8 @@
     <w:p>
       <w:pPr>
         <w:pStyle w:val="SourceCode"/>
+        <w:shd w:val="clear" w:color="auto" w:fill="F2F2F2"/>
+        <w:spacing w:after="0" w:before="0"/>
       </w:pPr>
       <w:r>
         <w:rPr>
@@ -4803,6 +4979,8 @@
     <w:p>
       <w:pPr>
         <w:pStyle w:val="SourceCode"/>
+        <w:shd w:val="clear" w:color="auto" w:fill="F2F2F2"/>
+        <w:spacing w:after="0" w:before="0"/>
       </w:pPr>
       <w:r>
         <w:rPr>
@@ -4946,6 +5124,8 @@
     <w:p>
       <w:pPr>
         <w:pStyle w:val="SourceCode"/>
+        <w:shd w:val="clear" w:color="auto" w:fill="F2F2F2"/>
+        <w:spacing w:after="0" w:before="0"/>
       </w:pPr>
       <w:r>
         <w:rPr>
@@ -5026,8 +5206,8 @@
       <w:tblPr>
         <w:tblStyle w:val="Table"/>
         <w:tblW w:type="pct" w:w="5000"/>
+        <w:jc w:val="center"/>
         <w:tblLook w:firstRow="1" w:lastRow="0" w:firstColumn="0" w:lastColumn="0" w:noHBand="0" w:noVBand="0" w:val="0020"/>
-        <w:jc w:val="start"/>
       </w:tblPr>
       <w:tblGrid>
         <w:gridCol w:w="3960"/>
@@ -5038,25 +5218,35 @@
           <w:tblHeader w:val="true"/>
         </w:trPr>
         <w:tc>
-          <w:tcPr/>
+          <w:tcPr>
+            <w:shd w:val="clear" w:color="auto" w:fill="DEEAF6"/>
+          </w:tcPr>
           <w:p>
             <w:pPr>
               <w:pStyle w:val="Compact"/>
               <w:jc w:val="left"/>
             </w:pPr>
             <w:r>
+              <w:rPr>
+                <w:b/>
+              </w:rPr>
               <w:t xml:space="preserve">Part</w:t>
             </w:r>
           </w:p>
         </w:tc>
         <w:tc>
-          <w:tcPr/>
+          <w:tcPr>
+            <w:shd w:val="clear" w:color="auto" w:fill="DEEAF6"/>
+          </w:tcPr>
           <w:p>
             <w:pPr>
               <w:pStyle w:val="Compact"/>
               <w:jc w:val="left"/>
             </w:pPr>
             <w:r>
+              <w:rPr>
+                <w:b/>
+              </w:rPr>
               <w:t xml:space="preserve">What it does</w:t>
             </w:r>
           </w:p>
@@ -5308,6 +5498,8 @@
     <w:p>
       <w:pPr>
         <w:pStyle w:val="SourceCode"/>
+        <w:shd w:val="clear" w:color="auto" w:fill="F2F2F2"/>
+        <w:spacing w:after="0" w:before="0"/>
       </w:pPr>
       <w:r>
         <w:rPr>
@@ -5497,6 +5689,8 @@
     <w:p>
       <w:pPr>
         <w:pStyle w:val="SourceCode"/>
+        <w:shd w:val="clear" w:color="auto" w:fill="F2F2F2"/>
+        <w:spacing w:after="0" w:before="0"/>
       </w:pPr>
       <w:r>
         <w:rPr>
@@ -5546,6 +5740,8 @@
     <w:p>
       <w:pPr>
         <w:pStyle w:val="SourceCode"/>
+        <w:shd w:val="clear" w:color="auto" w:fill="F2F2F2"/>
+        <w:spacing w:after="0" w:before="0"/>
       </w:pPr>
       <w:r>
         <w:rPr>
@@ -5571,6 +5767,8 @@
     <w:p>
       <w:pPr>
         <w:pStyle w:val="SourceCode"/>
+        <w:shd w:val="clear" w:color="auto" w:fill="F2F2F2"/>
+        <w:spacing w:after="0" w:before="0"/>
       </w:pPr>
       <w:r>
         <w:rPr>
@@ -5780,6 +5978,8 @@
     <w:p>
       <w:pPr>
         <w:pStyle w:val="SourceCode"/>
+        <w:shd w:val="clear" w:color="auto" w:fill="F2F2F2"/>
+        <w:spacing w:after="0" w:before="0"/>
       </w:pPr>
       <w:r>
         <w:rPr>
@@ -5811,6 +6011,8 @@
     <w:p>
       <w:pPr>
         <w:pStyle w:val="SourceCode"/>
+        <w:shd w:val="clear" w:color="auto" w:fill="F2F2F2"/>
+        <w:spacing w:after="0" w:before="0"/>
       </w:pPr>
       <w:r>
         <w:rPr>
@@ -6225,6 +6427,8 @@
     <w:p>
       <w:pPr>
         <w:pStyle w:val="SourceCode"/>
+        <w:shd w:val="clear" w:color="auto" w:fill="F2F2F2"/>
+        <w:spacing w:after="0" w:before="0"/>
       </w:pPr>
       <w:r>
         <w:rPr>
@@ -6305,8 +6509,8 @@
       <w:tblPr>
         <w:tblStyle w:val="Table"/>
         <w:tblW w:type="pct" w:w="5000"/>
+        <w:jc w:val="center"/>
         <w:tblLook w:firstRow="1" w:lastRow="0" w:firstColumn="0" w:lastColumn="0" w:noHBand="0" w:noVBand="0" w:val="0020"/>
-        <w:jc w:val="start"/>
       </w:tblPr>
       <w:tblGrid>
         <w:gridCol w:w="3960"/>
@@ -6317,25 +6521,35 @@
           <w:tblHeader w:val="true"/>
         </w:trPr>
         <w:tc>
-          <w:tcPr/>
+          <w:tcPr>
+            <w:shd w:val="clear" w:color="auto" w:fill="DEEAF6"/>
+          </w:tcPr>
           <w:p>
             <w:pPr>
               <w:pStyle w:val="Compact"/>
               <w:jc w:val="left"/>
             </w:pPr>
             <w:r>
+              <w:rPr>
+                <w:b/>
+              </w:rPr>
               <w:t xml:space="preserve">Part</w:t>
             </w:r>
           </w:p>
         </w:tc>
         <w:tc>
-          <w:tcPr/>
+          <w:tcPr>
+            <w:shd w:val="clear" w:color="auto" w:fill="DEEAF6"/>
+          </w:tcPr>
           <w:p>
             <w:pPr>
               <w:pStyle w:val="Compact"/>
               <w:jc w:val="left"/>
             </w:pPr>
             <w:r>
+              <w:rPr>
+                <w:b/>
+              </w:rPr>
               <w:t xml:space="preserve">What it does</w:t>
             </w:r>
           </w:p>
@@ -6538,6 +6752,8 @@
     <w:p>
       <w:pPr>
         <w:pStyle w:val="SourceCode"/>
+        <w:shd w:val="clear" w:color="auto" w:fill="F2F2F2"/>
+        <w:spacing w:after="0" w:before="0"/>
       </w:pPr>
       <w:r>
         <w:rPr>
@@ -6981,6 +7197,8 @@
     <w:p>
       <w:pPr>
         <w:pStyle w:val="SourceCode"/>
+        <w:shd w:val="clear" w:color="auto" w:fill="F2F2F2"/>
+        <w:spacing w:after="0" w:before="0"/>
       </w:pPr>
       <w:r>
         <w:rPr>
@@ -7154,6 +7372,8 @@
     <w:p>
       <w:pPr>
         <w:pStyle w:val="SourceCode"/>
+        <w:shd w:val="clear" w:color="auto" w:fill="F2F2F2"/>
+        <w:spacing w:after="0" w:before="0"/>
       </w:pPr>
       <w:r>
         <w:rPr>
@@ -7187,6 +7407,8 @@
     <w:p>
       <w:pPr>
         <w:pStyle w:val="SourceCode"/>
+        <w:shd w:val="clear" w:color="auto" w:fill="F2F2F2"/>
+        <w:spacing w:after="0" w:before="0"/>
       </w:pPr>
       <w:r>
         <w:rPr>
@@ -7492,6 +7714,8 @@
     <w:p>
       <w:pPr>
         <w:pStyle w:val="SourceCode"/>
+        <w:shd w:val="clear" w:color="auto" w:fill="F2F2F2"/>
+        <w:spacing w:after="0" w:before="0"/>
       </w:pPr>
       <w:r>
         <w:rPr>
@@ -8213,6 +8437,8 @@
     <w:p>
       <w:pPr>
         <w:pStyle w:val="SourceCode"/>
+        <w:shd w:val="clear" w:color="auto" w:fill="F2F2F2"/>
+        <w:spacing w:after="0" w:before="0"/>
       </w:pPr>
       <w:r>
         <w:rPr>
@@ -8281,6 +8507,8 @@
     <w:p>
       <w:pPr>
         <w:pStyle w:val="SourceCode"/>
+        <w:shd w:val="clear" w:color="auto" w:fill="F2F2F2"/>
+        <w:spacing w:after="0" w:before="0"/>
       </w:pPr>
       <w:r>
         <w:rPr>
@@ -8494,6 +8722,8 @@
     <w:p>
       <w:pPr>
         <w:pStyle w:val="SourceCode"/>
+        <w:shd w:val="clear" w:color="auto" w:fill="F2F2F2"/>
+        <w:spacing w:after="0" w:before="0"/>
       </w:pPr>
       <w:r>
         <w:rPr>
@@ -8562,8 +8792,8 @@
       <w:tblPr>
         <w:tblStyle w:val="Table"/>
         <w:tblW w:type="pct" w:w="5000"/>
+        <w:jc w:val="center"/>
         <w:tblLook w:firstRow="1" w:lastRow="0" w:firstColumn="0" w:lastColumn="0" w:noHBand="0" w:noVBand="0" w:val="0020"/>
-        <w:jc w:val="start"/>
       </w:tblPr>
       <w:tblGrid>
         <w:gridCol w:w="3960"/>
@@ -8574,25 +8804,35 @@
           <w:tblHeader w:val="true"/>
         </w:trPr>
         <w:tc>
-          <w:tcPr/>
+          <w:tcPr>
+            <w:shd w:val="clear" w:color="auto" w:fill="DEEAF6"/>
+          </w:tcPr>
           <w:p>
             <w:pPr>
               <w:pStyle w:val="Compact"/>
               <w:jc w:val="left"/>
             </w:pPr>
             <w:r>
+              <w:rPr>
+                <w:b/>
+              </w:rPr>
               <w:t xml:space="preserve">Part</w:t>
             </w:r>
           </w:p>
         </w:tc>
         <w:tc>
-          <w:tcPr/>
+          <w:tcPr>
+            <w:shd w:val="clear" w:color="auto" w:fill="DEEAF6"/>
+          </w:tcPr>
           <w:p>
             <w:pPr>
               <w:pStyle w:val="Compact"/>
               <w:jc w:val="left"/>
             </w:pPr>
             <w:r>
+              <w:rPr>
+                <w:b/>
+              </w:rPr>
               <w:t xml:space="preserve">What it does</w:t>
             </w:r>
           </w:p>
@@ -8741,6 +8981,8 @@
     <w:p>
       <w:pPr>
         <w:pStyle w:val="SourceCode"/>
+        <w:shd w:val="clear" w:color="auto" w:fill="F2F2F2"/>
+        <w:spacing w:after="0" w:before="0"/>
       </w:pPr>
       <w:r>
         <w:rPr>
@@ -9002,6 +9244,8 @@
     <w:p>
       <w:pPr>
         <w:pStyle w:val="SourceCode"/>
+        <w:shd w:val="clear" w:color="auto" w:fill="F2F2F2"/>
+        <w:spacing w:after="0" w:before="0"/>
       </w:pPr>
       <w:r>
         <w:rPr>
@@ -9104,6 +9348,8 @@
     <w:p>
       <w:pPr>
         <w:pStyle w:val="SourceCode"/>
+        <w:shd w:val="clear" w:color="auto" w:fill="F2F2F2"/>
+        <w:spacing w:after="0" w:before="0"/>
       </w:pPr>
       <w:r>
         <w:rPr>
@@ -9142,8 +9388,8 @@
       <w:tblPr>
         <w:tblStyle w:val="Table"/>
         <w:tblW w:type="auto" w:w="0"/>
+        <w:jc w:val="center"/>
         <w:tblLook w:firstRow="1" w:lastRow="0" w:firstColumn="0" w:lastColumn="0" w:noHBand="0" w:noVBand="0" w:val="0020"/>
-        <w:jc w:val="start"/>
       </w:tblPr>
       <w:tblGrid>
         <w:gridCol w:w="3960"/>
@@ -9154,25 +9400,35 @@
           <w:tblHeader w:val="true"/>
         </w:trPr>
         <w:tc>
-          <w:tcPr/>
+          <w:tcPr>
+            <w:shd w:val="clear" w:color="auto" w:fill="DEEAF6"/>
+          </w:tcPr>
           <w:p>
             <w:pPr>
               <w:pStyle w:val="Compact"/>
               <w:jc w:val="left"/>
             </w:pPr>
             <w:r>
+              <w:rPr>
+                <w:b/>
+              </w:rPr>
               <w:t xml:space="preserve">Part</w:t>
             </w:r>
           </w:p>
         </w:tc>
         <w:tc>
-          <w:tcPr/>
+          <w:tcPr>
+            <w:shd w:val="clear" w:color="auto" w:fill="DEEAF6"/>
+          </w:tcPr>
           <w:p>
             <w:pPr>
               <w:pStyle w:val="Compact"/>
               <w:jc w:val="left"/>
             </w:pPr>
             <w:r>
+              <w:rPr>
+                <w:b/>
+              </w:rPr>
               <w:t xml:space="preserve">What it does</w:t>
             </w:r>
           </w:p>
@@ -9660,6 +9916,8 @@
     <w:p>
       <w:pPr>
         <w:pStyle w:val="SourceCode"/>
+        <w:shd w:val="clear" w:color="auto" w:fill="F2F2F2"/>
+        <w:spacing w:after="0" w:before="0"/>
       </w:pPr>
       <w:r>
         <w:rPr>
@@ -9799,6 +10057,8 @@
     <w:p>
       <w:pPr>
         <w:pStyle w:val="SourceCode"/>
+        <w:shd w:val="clear" w:color="auto" w:fill="F2F2F2"/>
+        <w:spacing w:after="0" w:before="0"/>
       </w:pPr>
       <w:r>
         <w:rPr>
@@ -9912,6 +10172,8 @@
     <w:p>
       <w:pPr>
         <w:pStyle w:val="SourceCode"/>
+        <w:shd w:val="clear" w:color="auto" w:fill="F2F2F2"/>
+        <w:spacing w:after="0" w:before="0"/>
       </w:pPr>
       <w:r>
         <w:rPr>
@@ -10045,6 +10307,8 @@
     <w:p>
       <w:pPr>
         <w:pStyle w:val="SourceCode"/>
+        <w:shd w:val="clear" w:color="auto" w:fill="F2F2F2"/>
+        <w:spacing w:after="0" w:before="0"/>
       </w:pPr>
       <w:r>
         <w:rPr>
@@ -10317,6 +10581,8 @@
     <w:p>
       <w:pPr>
         <w:pStyle w:val="SourceCode"/>
+        <w:shd w:val="clear" w:color="auto" w:fill="F2F2F2"/>
+        <w:spacing w:after="0" w:before="0"/>
       </w:pPr>
       <w:r>
         <w:rPr>
@@ -10936,6 +11202,8 @@
     <w:p>
       <w:pPr>
         <w:pStyle w:val="SourceCode"/>
+        <w:shd w:val="clear" w:color="auto" w:fill="F2F2F2"/>
+        <w:spacing w:after="0" w:before="0"/>
       </w:pPr>
       <w:r>
         <w:rPr>
@@ -10953,6 +11221,8 @@
     <w:p>
       <w:pPr>
         <w:pStyle w:val="SourceCode"/>
+        <w:shd w:val="clear" w:color="auto" w:fill="F2F2F2"/>
+        <w:spacing w:after="0" w:before="0"/>
       </w:pPr>
       <w:r>
         <w:rPr>
@@ -10970,6 +11240,8 @@
     <w:p>
       <w:pPr>
         <w:pStyle w:val="SourceCode"/>
+        <w:shd w:val="clear" w:color="auto" w:fill="F2F2F2"/>
+        <w:spacing w:after="0" w:before="0"/>
       </w:pPr>
       <w:r>
         <w:rPr>
@@ -10995,6 +11267,8 @@
     <w:p>
       <w:pPr>
         <w:pStyle w:val="SourceCode"/>
+        <w:shd w:val="clear" w:color="auto" w:fill="F2F2F2"/>
+        <w:spacing w:after="0" w:before="0"/>
       </w:pPr>
       <w:r>
         <w:rPr>
@@ -11043,6 +11317,8 @@
     <w:p>
       <w:pPr>
         <w:pStyle w:val="SourceCode"/>
+        <w:shd w:val="clear" w:color="auto" w:fill="F2F2F2"/>
+        <w:spacing w:after="0" w:before="0"/>
       </w:pPr>
       <w:r>
         <w:rPr>
@@ -11407,6 +11683,8 @@
     <w:p>
       <w:pPr>
         <w:pStyle w:val="SourceCode"/>
+        <w:shd w:val="clear" w:color="auto" w:fill="F2F2F2"/>
+        <w:spacing w:after="0" w:before="0"/>
       </w:pPr>
       <w:r>
         <w:rPr>
@@ -11432,6 +11710,8 @@
     <w:p>
       <w:pPr>
         <w:pStyle w:val="SourceCode"/>
+        <w:shd w:val="clear" w:color="auto" w:fill="F2F2F2"/>
+        <w:spacing w:after="0" w:before="0"/>
       </w:pPr>
       <w:r>
         <w:rPr>
@@ -11475,6 +11755,8 @@
     <w:p>
       <w:pPr>
         <w:pStyle w:val="SourceCode"/>
+        <w:shd w:val="clear" w:color="auto" w:fill="F2F2F2"/>
+        <w:spacing w:after="0" w:before="0"/>
       </w:pPr>
       <w:r>
         <w:rPr>
@@ -11769,6 +12051,8 @@
     <w:p>
       <w:pPr>
         <w:pStyle w:val="SourceCode"/>
+        <w:shd w:val="clear" w:color="auto" w:fill="F2F2F2"/>
+        <w:spacing w:after="0" w:before="0"/>
       </w:pPr>
       <w:r>
         <w:rPr>
@@ -11965,6 +12249,8 @@
     <w:p>
       <w:pPr>
         <w:pStyle w:val="SourceCode"/>
+        <w:shd w:val="clear" w:color="auto" w:fill="F2F2F2"/>
+        <w:spacing w:after="0" w:before="0"/>
       </w:pPr>
       <w:r>
         <w:rPr>
@@ -12181,6 +12467,8 @@
     <w:p>
       <w:pPr>
         <w:pStyle w:val="SourceCode"/>
+        <w:shd w:val="clear" w:color="auto" w:fill="F2F2F2"/>
+        <w:spacing w:after="0" w:before="0"/>
       </w:pPr>
       <w:r>
         <w:rPr>
@@ -12355,6 +12643,8 @@
     <w:p>
       <w:pPr>
         <w:pStyle w:val="SourceCode"/>
+        <w:shd w:val="clear" w:color="auto" w:fill="F2F2F2"/>
+        <w:spacing w:after="0" w:before="0"/>
       </w:pPr>
       <w:r>
         <w:rPr>
@@ -12504,6 +12794,8 @@
     <w:p>
       <w:pPr>
         <w:pStyle w:val="SourceCode"/>
+        <w:shd w:val="clear" w:color="auto" w:fill="F2F2F2"/>
+        <w:spacing w:after="0" w:before="0"/>
       </w:pPr>
       <w:r>
         <w:rPr>
@@ -12527,6 +12819,8 @@
     <w:p>
       <w:pPr>
         <w:pStyle w:val="SourceCode"/>
+        <w:shd w:val="clear" w:color="auto" w:fill="F2F2F2"/>
+        <w:spacing w:after="0" w:before="0"/>
       </w:pPr>
       <w:r>
         <w:rPr>
@@ -12687,6 +12981,8 @@
     <w:p>
       <w:pPr>
         <w:pStyle w:val="SourceCode"/>
+        <w:shd w:val="clear" w:color="auto" w:fill="F2F2F2"/>
+        <w:spacing w:after="0" w:before="0"/>
       </w:pPr>
       <w:r>
         <w:rPr>
@@ -12765,6 +13061,8 @@
     <w:p>
       <w:pPr>
         <w:pStyle w:val="SourceCode"/>
+        <w:shd w:val="clear" w:color="auto" w:fill="F2F2F2"/>
+        <w:spacing w:after="0" w:before="0"/>
       </w:pPr>
       <w:r>
         <w:rPr>
@@ -12844,6 +13142,8 @@
     <w:p>
       <w:pPr>
         <w:pStyle w:val="SourceCode"/>
+        <w:shd w:val="clear" w:color="auto" w:fill="F2F2F2"/>
+        <w:spacing w:after="0" w:before="0"/>
       </w:pPr>
       <w:r>
         <w:rPr>
@@ -12892,6 +13192,8 @@
     <w:p>
       <w:pPr>
         <w:pStyle w:val="SourceCode"/>
+        <w:shd w:val="clear" w:color="auto" w:fill="F2F2F2"/>
+        <w:spacing w:after="0" w:before="0"/>
       </w:pPr>
       <w:r>
         <w:rPr>
@@ -13154,6 +13456,8 @@
     <w:p>
       <w:pPr>
         <w:pStyle w:val="SourceCode"/>
+        <w:shd w:val="clear" w:color="auto" w:fill="F2F2F2"/>
+        <w:spacing w:after="0" w:before="0"/>
       </w:pPr>
       <w:r>
         <w:rPr>
@@ -13234,6 +13538,8 @@
     <w:p>
       <w:pPr>
         <w:pStyle w:val="SourceCode"/>
+        <w:shd w:val="clear" w:color="auto" w:fill="F2F2F2"/>
+        <w:spacing w:after="0" w:before="0"/>
       </w:pPr>
       <w:r>
         <w:rPr>
@@ -13597,8 +13903,8 @@
       <w:tblPr>
         <w:tblStyle w:val="Table"/>
         <w:tblW w:type="pct" w:w="5000"/>
+        <w:jc w:val="center"/>
         <w:tblLook w:firstRow="1" w:lastRow="0" w:firstColumn="0" w:lastColumn="0" w:noHBand="0" w:noVBand="0" w:val="0020"/>
-        <w:jc w:val="start"/>
       </w:tblPr>
       <w:tblGrid>
         <w:gridCol w:w="2640"/>
@@ -13610,37 +13916,52 @@
           <w:tblHeader w:val="true"/>
         </w:trPr>
         <w:tc>
-          <w:tcPr/>
+          <w:tcPr>
+            <w:shd w:val="clear" w:color="auto" w:fill="DEEAF6"/>
+          </w:tcPr>
           <w:p>
             <w:pPr>
               <w:pStyle w:val="Compact"/>
               <w:jc w:val="left"/>
             </w:pPr>
             <w:r>
+              <w:rPr>
+                <w:b/>
+              </w:rPr>
               <w:t xml:space="preserve">Job</w:t>
             </w:r>
           </w:p>
         </w:tc>
         <w:tc>
-          <w:tcPr/>
+          <w:tcPr>
+            <w:shd w:val="clear" w:color="auto" w:fill="DEEAF6"/>
+          </w:tcPr>
           <w:p>
             <w:pPr>
               <w:pStyle w:val="Compact"/>
               <w:jc w:val="left"/>
             </w:pPr>
             <w:r>
+              <w:rPr>
+                <w:b/>
+              </w:rPr>
               <w:t xml:space="preserve">What it runs</w:t>
             </w:r>
           </w:p>
         </w:tc>
         <w:tc>
-          <w:tcPr/>
+          <w:tcPr>
+            <w:shd w:val="clear" w:color="auto" w:fill="DEEAF6"/>
+          </w:tcPr>
           <w:p>
             <w:pPr>
               <w:pStyle w:val="Compact"/>
               <w:jc w:val="left"/>
             </w:pPr>
             <w:r>
+              <w:rPr>
+                <w:b/>
+              </w:rPr>
               <w:t xml:space="preserve">How it blocks</w:t>
             </w:r>
           </w:p>
@@ -14200,6 +14521,8 @@
     <w:p>
       <w:pPr>
         <w:pStyle w:val="SourceCode"/>
+        <w:shd w:val="clear" w:color="auto" w:fill="F2F2F2"/>
+        <w:spacing w:after="0" w:before="0"/>
       </w:pPr>
       <w:r>
         <w:rPr>
@@ -14818,8 +15141,8 @@
       <w:tblPr>
         <w:tblStyle w:val="Table"/>
         <w:tblW w:type="pct" w:w="5000"/>
+        <w:jc w:val="center"/>
         <w:tblLook w:firstRow="1" w:lastRow="0" w:firstColumn="0" w:lastColumn="0" w:noHBand="0" w:noVBand="0" w:val="0020"/>
-        <w:jc w:val="start"/>
       </w:tblPr>
       <w:tblGrid>
         <w:gridCol w:w="3960"/>
@@ -14830,25 +15153,35 @@
           <w:tblHeader w:val="true"/>
         </w:trPr>
         <w:tc>
-          <w:tcPr/>
+          <w:tcPr>
+            <w:shd w:val="clear" w:color="auto" w:fill="DEEAF6"/>
+          </w:tcPr>
           <w:p>
             <w:pPr>
               <w:pStyle w:val="Compact"/>
               <w:jc w:val="left"/>
             </w:pPr>
             <w:r>
+              <w:rPr>
+                <w:b/>
+              </w:rPr>
               <w:t xml:space="preserve">Evidence</w:t>
             </w:r>
           </w:p>
         </w:tc>
         <w:tc>
-          <w:tcPr/>
+          <w:tcPr>
+            <w:shd w:val="clear" w:color="auto" w:fill="DEEAF6"/>
+          </w:tcPr>
           <w:p>
             <w:pPr>
               <w:pStyle w:val="Compact"/>
               <w:jc w:val="left"/>
             </w:pPr>
             <w:r>
+              <w:rPr>
+                <w:b/>
+              </w:rPr>
               <w:t xml:space="preserve">Deliverable</w:t>
             </w:r>
           </w:p>
@@ -15098,13 +15431,48 @@
     </w:tbl>
     <w:bookmarkEnd w:id="100"/>
     <w:bookmarkEnd w:id="101"/>
-    <w:sectPr/>
+    <w:sectPr>
+      <w:footerReference w:type="default" r:id="rId9"/>
+    </w:sectPr>
   </w:body>
 </w:document>
 </file>
 
 <file path=word/comments.xml><?xml version="1.0" encoding="utf-8"?>
 <w:comments xmlns:w="http://schemas.openxmlformats.org/wordprocessingml/2006/main" xmlns:m="http://schemas.openxmlformats.org/officeDocument/2006/math" xmlns:r="http://schemas.openxmlformats.org/officeDocument/2006/relationships" xmlns:o="urn:schemas-microsoft-com:office:office" xmlns:v="urn:schemas-microsoft-com:vml" xmlns:w10="urn:schemas-microsoft-com:office:word" xmlns:a="http://schemas.openxmlformats.org/drawingml/2006/main" xmlns:pic="http://schemas.openxmlformats.org/drawingml/2006/picture" xmlns:wp="http://schemas.openxmlformats.org/drawingml/2006/wordprocessingDrawing"/>
+</file>
+
+<file path=word/footer1.xml><?xml version="1.0" encoding="utf-8"?>
+<w:ftr xmlns:m="http://schemas.openxmlformats.org/officeDocument/2006/math" xmlns:mc="http://schemas.openxmlformats.org/markup-compatibility/2006" xmlns:mo="http://schemas.microsoft.com/office/mac/office/2008/main" xmlns:mv="urn:schemas-microsoft-com:mac:vml" xmlns:o="urn:schemas-microsoft-com:office:office" xmlns:r="http://schemas.openxmlformats.org/officeDocument/2006/relationships" xmlns:v="urn:schemas-microsoft-com:vml" xmlns:w10="urn:schemas-microsoft-com:office:word" xmlns:w14="http://schemas.microsoft.com/office/word/2010/wordml" xmlns:w="http://schemas.openxmlformats.org/wordprocessingml/2006/main" xmlns:wne="http://schemas.microsoft.com/office/word/2006/wordml" xmlns:wp14="http://schemas.microsoft.com/office/word/2010/wordprocessingDrawing" xmlns:wp="http://schemas.openxmlformats.org/drawingml/2006/wordprocessingDrawing" xmlns:wpc="http://schemas.microsoft.com/office/word/2010/wordprocessingCanvas" xmlns:wpg="http://schemas.microsoft.com/office/word/2010/wordprocessingGroup" xmlns:wpi="http://schemas.microsoft.com/office/word/2010/wordprocessingInk" xmlns:wps="http://schemas.microsoft.com/office/word/2010/wordprocessingShape" mc:Ignorable="w14 wp14">
+  <w:p>
+    <w:pPr>
+      <w:pStyle w:val="Footer"/>
+      <w:jc w:val="center"/>
+    </w:pPr>
+    <w:r>
+      <w:rPr>
+        <w:sz w:val="18"/>
+      </w:rPr>
+      <w:t xml:space="preserve">Page </w:t>
+    </w:r>
+    <w:fldSimple w:instr="PAGE \* MERGEFORMAT">
+      <w:r>
+        <w:t>1</w:t>
+      </w:r>
+    </w:fldSimple>
+    <w:r>
+      <w:rPr>
+        <w:sz w:val="18"/>
+      </w:rPr>
+      <w:t xml:space="preserve"> of </w:t>
+    </w:r>
+    <w:fldSimple w:instr="NUMPAGES \* MERGEFORMAT">
+      <w:r>
+        <w:t>1</w:t>
+      </w:r>
+    </w:fldSimple>
+  </w:p>
+</w:ftr>
 </file>
 
 <file path=word/footnotes.xml><?xml version="1.0" encoding="utf-8"?>
@@ -15626,8 +15994,8 @@
       <w:rFonts w:asciiTheme="majorHAnsi" w:cstheme="majorBidi" w:eastAsiaTheme="majorEastAsia" w:hAnsiTheme="majorHAnsi"/>
       <w:b/>
       <w:bCs/>
-      <w:color w:themeColor="accent1" w:val="4F81BD"/>
-      <w:sz w:val="32"/>
+      <w:color w:val="1F4E79"/>
+      <w:sz w:val="34"/>
       <w:szCs w:val="32"/>
     </w:rPr>
   </w:style>
@@ -15648,8 +16016,8 @@
       <w:rFonts w:asciiTheme="majorHAnsi" w:cstheme="majorBidi" w:eastAsiaTheme="majorEastAsia" w:hAnsiTheme="majorHAnsi"/>
       <w:b/>
       <w:bCs/>
-      <w:color w:themeColor="accent1" w:val="4F81BD"/>
-      <w:sz w:val="28"/>
+      <w:color w:val="1F4E79"/>
+      <w:sz w:val="26"/>
       <w:szCs w:val="28"/>
     </w:rPr>
   </w:style>

</xml_diff>

<commit_message>
docs: highlight all commands in red in the Word walkthrough
Style script now matches each code paragraph back to its markdown block
(robust to pandoc's line merging/wrapping) and colors only bash-command
blocks red; tool output and file-content blocks stay black. Walkthrough
notes that red lines are the commands to type.
</commit_message>
<xml_diff>
--- a/docs/walkthrough.docx
+++ b/docs/walkthrough.docx
@@ -1256,6 +1256,46 @@
         <w:t xml:space="preserve">.</w:t>
       </w:r>
     </w:p>
+    <w:p>
+      <w:pPr>
+        <w:numPr>
+          <w:ilvl w:val="0"/>
+          <w:numId w:val="1002"/>
+        </w:numPr>
+        <w:pStyle w:val="Compact"/>
+      </w:pPr>
+      <w:r>
+        <w:t xml:space="preserve">In the Word version of this guide, every command is printed in</w:t>
+      </w:r>
+      <w:r>
+        <w:t xml:space="preserve"> </w:t>
+      </w:r>
+      <w:r>
+        <w:rPr>
+          <w:bCs/>
+          <w:b/>
+        </w:rPr>
+        <w:t xml:space="preserve">red</w:t>
+      </w:r>
+      <w:r>
+        <w:t xml:space="preserve"> </w:t>
+      </w:r>
+      <w:r>
+        <w:t xml:space="preserve">—</w:t>
+      </w:r>
+      <w:r>
+        <w:t xml:space="preserve"> </w:t>
+      </w:r>
+      <w:r>
+        <w:t xml:space="preserve">those are the lines you type. Everything else (explanations, file</w:t>
+      </w:r>
+      <w:r>
+        <w:t xml:space="preserve"> </w:t>
+      </w:r>
+      <w:r>
+        <w:t xml:space="preserve">contents, tool output) stays black.</w:t>
+      </w:r>
+    </w:p>
     <w:bookmarkEnd w:id="21"/>
     <w:bookmarkStart w:id="22" w:name="step-1.1-check-what-you-already-have"/>
     <w:p>
@@ -1320,18 +1360,21 @@
       <w:r>
         <w:rPr>
           <w:rStyle w:val="ExtensionTok"/>
+          <w:color w:val="C00000"/>
         </w:rPr>
         <w:t xml:space="preserve">node</w:t>
       </w:r>
       <w:r>
         <w:rPr>
           <w:rStyle w:val="NormalTok"/>
+          <w:color w:val="C00000"/>
         </w:rPr>
         <w:t xml:space="preserve"> </w:t>
       </w:r>
       <w:r>
         <w:rPr>
           <w:rStyle w:val="AttributeTok"/>
+          <w:color w:val="C00000"/>
         </w:rPr>
         <w:t xml:space="preserve">--version</w:t>
       </w:r>
@@ -1365,18 +1408,21 @@
       <w:r>
         <w:rPr>
           <w:rStyle w:val="ExtensionTok"/>
+          <w:color w:val="C00000"/>
         </w:rPr>
         <w:t xml:space="preserve">npm</w:t>
       </w:r>
       <w:r>
         <w:rPr>
           <w:rStyle w:val="NormalTok"/>
+          <w:color w:val="C00000"/>
         </w:rPr>
         <w:t xml:space="preserve"> </w:t>
       </w:r>
       <w:r>
         <w:rPr>
           <w:rStyle w:val="AttributeTok"/>
+          <w:color w:val="C00000"/>
         </w:rPr>
         <w:t xml:space="preserve">--version</w:t>
       </w:r>
@@ -1410,18 +1456,21 @@
       <w:r>
         <w:rPr>
           <w:rStyle w:val="ExtensionTok"/>
+          <w:color w:val="C00000"/>
         </w:rPr>
         <w:t xml:space="preserve">docker</w:t>
       </w:r>
       <w:r>
         <w:rPr>
           <w:rStyle w:val="NormalTok"/>
+          <w:color w:val="C00000"/>
         </w:rPr>
         <w:t xml:space="preserve"> </w:t>
       </w:r>
       <w:r>
         <w:rPr>
           <w:rStyle w:val="AttributeTok"/>
+          <w:color w:val="C00000"/>
         </w:rPr>
         <w:t xml:space="preserve">--version</w:t>
       </w:r>
@@ -1458,18 +1507,21 @@
       <w:r>
         <w:rPr>
           <w:rStyle w:val="ExtensionTok"/>
+          <w:color w:val="C00000"/>
         </w:rPr>
         <w:t xml:space="preserve">psql</w:t>
       </w:r>
       <w:r>
         <w:rPr>
           <w:rStyle w:val="NormalTok"/>
+          <w:color w:val="C00000"/>
         </w:rPr>
         <w:t xml:space="preserve"> </w:t>
       </w:r>
       <w:r>
         <w:rPr>
           <w:rStyle w:val="AttributeTok"/>
+          <w:color w:val="C00000"/>
         </w:rPr>
         <w:t xml:space="preserve">--version</w:t>
       </w:r>
@@ -1503,18 +1555,21 @@
       <w:r>
         <w:rPr>
           <w:rStyle w:val="ExtensionTok"/>
+          <w:color w:val="C00000"/>
         </w:rPr>
         <w:t xml:space="preserve">curl</w:t>
       </w:r>
       <w:r>
         <w:rPr>
           <w:rStyle w:val="NormalTok"/>
+          <w:color w:val="C00000"/>
         </w:rPr>
         <w:t xml:space="preserve"> </w:t>
       </w:r>
       <w:r>
         <w:rPr>
           <w:rStyle w:val="AttributeTok"/>
+          <w:color w:val="C00000"/>
         </w:rPr>
         <w:t xml:space="preserve">--version</w:t>
       </w:r>
@@ -1631,18 +1686,21 @@
       <w:r>
         <w:rPr>
           <w:rStyle w:val="ExtensionTok"/>
+          <w:color w:val="C00000"/>
         </w:rPr>
         <w:t xml:space="preserve">node</w:t>
       </w:r>
       <w:r>
         <w:rPr>
           <w:rStyle w:val="NormalTok"/>
+          <w:color w:val="C00000"/>
         </w:rPr>
         <w:t xml:space="preserve"> </w:t>
       </w:r>
       <w:r>
         <w:rPr>
           <w:rStyle w:val="AttributeTok"/>
+          <w:color w:val="C00000"/>
         </w:rPr>
         <w:t xml:space="preserve">--version</w:t>
       </w:r>
@@ -1656,18 +1714,21 @@
       <w:r>
         <w:rPr>
           <w:rStyle w:val="ExtensionTok"/>
+          <w:color w:val="C00000"/>
         </w:rPr>
         <w:t xml:space="preserve">npm</w:t>
       </w:r>
       <w:r>
         <w:rPr>
           <w:rStyle w:val="NormalTok"/>
+          <w:color w:val="C00000"/>
         </w:rPr>
         <w:t xml:space="preserve"> </w:t>
       </w:r>
       <w:r>
         <w:rPr>
           <w:rStyle w:val="AttributeTok"/>
+          <w:color w:val="C00000"/>
         </w:rPr>
         <w:t xml:space="preserve">--version</w:t>
       </w:r>
@@ -1858,24 +1919,28 @@
       <w:r>
         <w:rPr>
           <w:rStyle w:val="FunctionTok"/>
+          <w:color w:val="C00000"/>
         </w:rPr>
         <w:t xml:space="preserve">sudo</w:t>
       </w:r>
       <w:r>
         <w:rPr>
           <w:rStyle w:val="NormalTok"/>
+          <w:color w:val="C00000"/>
         </w:rPr>
         <w:t xml:space="preserve"> apt-get install </w:t>
       </w:r>
       <w:r>
         <w:rPr>
           <w:rStyle w:val="AttributeTok"/>
+          <w:color w:val="C00000"/>
         </w:rPr>
         <w:t xml:space="preserve">-y</w:t>
       </w:r>
       <w:r>
         <w:rPr>
           <w:rStyle w:val="NormalTok"/>
+          <w:color w:val="C00000"/>
         </w:rPr>
         <w:t xml:space="preserve"> docker.io</w:t>
       </w:r>
@@ -1897,12 +1962,14 @@
       <w:r>
         <w:rPr>
           <w:rStyle w:val="ExtensionTok"/>
+          <w:color w:val="C00000"/>
         </w:rPr>
         <w:t xml:space="preserve">docker</w:t>
       </w:r>
       <w:r>
         <w:rPr>
           <w:rStyle w:val="NormalTok"/>
+          <w:color w:val="C00000"/>
         </w:rPr>
         <w:t xml:space="preserve"> ps</w:t>
       </w:r>
@@ -1980,24 +2047,28 @@
       <w:r>
         <w:rPr>
           <w:rStyle w:val="FunctionTok"/>
+          <w:color w:val="C00000"/>
         </w:rPr>
         <w:t xml:space="preserve">sudo</w:t>
       </w:r>
       <w:r>
         <w:rPr>
           <w:rStyle w:val="NormalTok"/>
+          <w:color w:val="C00000"/>
         </w:rPr>
         <w:t xml:space="preserve"> apt-get install </w:t>
       </w:r>
       <w:r>
         <w:rPr>
           <w:rStyle w:val="AttributeTok"/>
+          <w:color w:val="C00000"/>
         </w:rPr>
         <w:t xml:space="preserve">-y</w:t>
       </w:r>
       <w:r>
         <w:rPr>
           <w:rStyle w:val="NormalTok"/>
+          <w:color w:val="C00000"/>
         </w:rPr>
         <w:t xml:space="preserve"> postgresql</w:t>
       </w:r>
@@ -2019,6 +2090,7 @@
       <w:r>
         <w:rPr>
           <w:rStyle w:val="ExtensionTok"/>
+          <w:color w:val="C00000"/>
         </w:rPr>
         <w:t xml:space="preserve">pg_isready</w:t>
       </w:r>
@@ -2321,12 +2393,14 @@
       <w:r>
         <w:rPr>
           <w:rStyle w:val="ExtensionTok"/>
+          <w:color w:val="C00000"/>
         </w:rPr>
         <w:t xml:space="preserve">pipx</w:t>
       </w:r>
       <w:r>
         <w:rPr>
           <w:rStyle w:val="NormalTok"/>
+          <w:color w:val="C00000"/>
         </w:rPr>
         <w:t xml:space="preserve"> install semgrep</w:t>
       </w:r>
@@ -2368,18 +2442,21 @@
       <w:r>
         <w:rPr>
           <w:rStyle w:val="ExtensionTok"/>
+          <w:color w:val="C00000"/>
         </w:rPr>
         <w:t xml:space="preserve">semgrep</w:t>
       </w:r>
       <w:r>
         <w:rPr>
           <w:rStyle w:val="NormalTok"/>
+          <w:color w:val="C00000"/>
         </w:rPr>
         <w:t xml:space="preserve"> </w:t>
       </w:r>
       <w:r>
         <w:rPr>
           <w:rStyle w:val="AttributeTok"/>
+          <w:color w:val="C00000"/>
         </w:rPr>
         <w:t xml:space="preserve">--version</w:t>
       </w:r>
@@ -2531,54 +2608,63 @@
       <w:r>
         <w:rPr>
           <w:rStyle w:val="ExtensionTok"/>
+          <w:color w:val="C00000"/>
         </w:rPr>
         <w:t xml:space="preserve">curl</w:t>
       </w:r>
       <w:r>
         <w:rPr>
           <w:rStyle w:val="NormalTok"/>
+          <w:color w:val="C00000"/>
         </w:rPr>
         <w:t xml:space="preserve"> </w:t>
       </w:r>
       <w:r>
         <w:rPr>
           <w:rStyle w:val="AttributeTok"/>
+          <w:color w:val="C00000"/>
         </w:rPr>
         <w:t xml:space="preserve">-sL</w:t>
       </w:r>
       <w:r>
         <w:rPr>
           <w:rStyle w:val="NormalTok"/>
+          <w:color w:val="C00000"/>
         </w:rPr>
         <w:t xml:space="preserve"> </w:t>
       </w:r>
       <w:r>
         <w:rPr>
           <w:rStyle w:val="AttributeTok"/>
+          <w:color w:val="C00000"/>
         </w:rPr>
         <w:t xml:space="preserve">-o</w:t>
       </w:r>
       <w:r>
         <w:rPr>
           <w:rStyle w:val="NormalTok"/>
+          <w:color w:val="C00000"/>
         </w:rPr>
         <w:t xml:space="preserve"> gitleaks.tar.gz </w:t>
       </w:r>
       <w:r>
         <w:rPr>
           <w:rStyle w:val="OperatorTok"/>
+          <w:color w:val="C00000"/>
         </w:rPr>
         <w:t xml:space="preserve">&lt;</w:t>
       </w:r>
       <w:r>
         <w:rPr>
           <w:rStyle w:val="NormalTok"/>
+          <w:color w:val="C00000"/>
         </w:rPr>
         <w:t xml:space="preserve">the download URL you copied</w:t>
       </w:r>
       <w:r>
         <w:rPr>
           <w:rStyle w:val="OperatorTok"/>
+          <w:color w:val="C00000"/>
         </w:rPr>
         <w:t xml:space="preserve">&gt;</w:t>
       </w:r>
@@ -2657,24 +2743,28 @@
       <w:r>
         <w:rPr>
           <w:rStyle w:val="FunctionTok"/>
+          <w:color w:val="C00000"/>
         </w:rPr>
         <w:t xml:space="preserve">tar</w:t>
       </w:r>
       <w:r>
         <w:rPr>
           <w:rStyle w:val="NormalTok"/>
+          <w:color w:val="C00000"/>
         </w:rPr>
         <w:t xml:space="preserve"> </w:t>
       </w:r>
       <w:r>
         <w:rPr>
           <w:rStyle w:val="AttributeTok"/>
+          <w:color w:val="C00000"/>
         </w:rPr>
         <w:t xml:space="preserve">-xzf</w:t>
       </w:r>
       <w:r>
         <w:rPr>
           <w:rStyle w:val="NormalTok"/>
+          <w:color w:val="C00000"/>
         </w:rPr>
         <w:t xml:space="preserve"> gitleaks.tar.gz</w:t>
       </w:r>
@@ -2696,12 +2786,14 @@
       <w:r>
         <w:rPr>
           <w:rStyle w:val="ExtensionTok"/>
+          <w:color w:val="C00000"/>
         </w:rPr>
         <w:t xml:space="preserve">./gitleaks</w:t>
       </w:r>
       <w:r>
         <w:rPr>
           <w:rStyle w:val="NormalTok"/>
+          <w:color w:val="C00000"/>
         </w:rPr>
         <w:t xml:space="preserve"> version</w:t>
       </w:r>
@@ -2744,12 +2836,14 @@
       <w:r>
         <w:rPr>
           <w:rStyle w:val="FunctionTok"/>
+          <w:color w:val="C00000"/>
         </w:rPr>
         <w:t xml:space="preserve">sudo</w:t>
       </w:r>
       <w:r>
         <w:rPr>
           <w:rStyle w:val="NormalTok"/>
+          <w:color w:val="C00000"/>
         </w:rPr>
         <w:t xml:space="preserve"> mv gitleaks /usr/local/bin/</w:t>
       </w:r>
@@ -2763,12 +2857,14 @@
       <w:r>
         <w:rPr>
           <w:rStyle w:val="ExtensionTok"/>
+          <w:color w:val="C00000"/>
         </w:rPr>
         <w:t xml:space="preserve">gitleaks</w:t>
       </w:r>
       <w:r>
         <w:rPr>
           <w:rStyle w:val="NormalTok"/>
+          <w:color w:val="C00000"/>
         </w:rPr>
         <w:t xml:space="preserve"> version</w:t>
       </w:r>
@@ -2906,120 +3002,140 @@
       <w:r>
         <w:rPr>
           <w:rStyle w:val="ExtensionTok"/>
+          <w:color w:val="C00000"/>
         </w:rPr>
         <w:t xml:space="preserve">node</w:t>
       </w:r>
       <w:r>
         <w:rPr>
           <w:rStyle w:val="NormalTok"/>
+          <w:color w:val="C00000"/>
         </w:rPr>
         <w:t xml:space="preserve"> </w:t>
       </w:r>
       <w:r>
         <w:rPr>
           <w:rStyle w:val="AttributeTok"/>
+          <w:color w:val="C00000"/>
         </w:rPr>
         <w:t xml:space="preserve">--version</w:t>
       </w:r>
       <w:r>
         <w:rPr>
           <w:rStyle w:val="NormalTok"/>
+          <w:color w:val="C00000"/>
         </w:rPr>
         <w:t xml:space="preserve"> </w:t>
       </w:r>
       <w:r>
         <w:rPr>
           <w:rStyle w:val="KeywordTok"/>
+          <w:color w:val="C00000"/>
         </w:rPr>
         <w:t xml:space="preserve">&amp;&amp;</w:t>
       </w:r>
       <w:r>
         <w:rPr>
           <w:rStyle w:val="NormalTok"/>
+          <w:color w:val="C00000"/>
         </w:rPr>
         <w:t xml:space="preserve"> </w:t>
       </w:r>
       <w:r>
         <w:rPr>
           <w:rStyle w:val="ExtensionTok"/>
+          <w:color w:val="C00000"/>
         </w:rPr>
         <w:t xml:space="preserve">npm</w:t>
       </w:r>
       <w:r>
         <w:rPr>
           <w:rStyle w:val="NormalTok"/>
+          <w:color w:val="C00000"/>
         </w:rPr>
         <w:t xml:space="preserve"> </w:t>
       </w:r>
       <w:r>
         <w:rPr>
           <w:rStyle w:val="AttributeTok"/>
+          <w:color w:val="C00000"/>
         </w:rPr>
         <w:t xml:space="preserve">--version</w:t>
       </w:r>
       <w:r>
         <w:rPr>
           <w:rStyle w:val="NormalTok"/>
+          <w:color w:val="C00000"/>
         </w:rPr>
         <w:t xml:space="preserve"> </w:t>
       </w:r>
       <w:r>
         <w:rPr>
           <w:rStyle w:val="KeywordTok"/>
+          <w:color w:val="C00000"/>
         </w:rPr>
         <w:t xml:space="preserve">&amp;&amp;</w:t>
       </w:r>
       <w:r>
         <w:rPr>
           <w:rStyle w:val="NormalTok"/>
+          <w:color w:val="C00000"/>
         </w:rPr>
         <w:t xml:space="preserve"> </w:t>
       </w:r>
       <w:r>
         <w:rPr>
           <w:rStyle w:val="ExtensionTok"/>
+          <w:color w:val="C00000"/>
         </w:rPr>
         <w:t xml:space="preserve">semgrep</w:t>
       </w:r>
       <w:r>
         <w:rPr>
           <w:rStyle w:val="NormalTok"/>
+          <w:color w:val="C00000"/>
         </w:rPr>
         <w:t xml:space="preserve"> </w:t>
       </w:r>
       <w:r>
         <w:rPr>
           <w:rStyle w:val="AttributeTok"/>
+          <w:color w:val="C00000"/>
         </w:rPr>
         <w:t xml:space="preserve">--version</w:t>
       </w:r>
       <w:r>
         <w:rPr>
           <w:rStyle w:val="NormalTok"/>
+          <w:color w:val="C00000"/>
         </w:rPr>
         <w:t xml:space="preserve"> </w:t>
       </w:r>
       <w:r>
         <w:rPr>
           <w:rStyle w:val="KeywordTok"/>
+          <w:color w:val="C00000"/>
         </w:rPr>
         <w:t xml:space="preserve">&amp;&amp;</w:t>
       </w:r>
       <w:r>
         <w:rPr>
           <w:rStyle w:val="NormalTok"/>
+          <w:color w:val="C00000"/>
         </w:rPr>
         <w:t xml:space="preserve"> </w:t>
       </w:r>
       <w:r>
         <w:rPr>
           <w:rStyle w:val="ExtensionTok"/>
+          <w:color w:val="C00000"/>
         </w:rPr>
         <w:t xml:space="preserve">gitleaks</w:t>
       </w:r>
       <w:r>
         <w:rPr>
           <w:rStyle w:val="NormalTok"/>
+          <w:color w:val="C00000"/>
         </w:rPr>
         <w:t xml:space="preserve"> version</w:t>
       </w:r>
@@ -3118,159 +3234,198 @@
       <w:r>
         <w:rPr>
           <w:rStyle w:val="ExtensionTok"/>
+          <w:color w:val="C00000"/>
         </w:rPr>
         <w:t xml:space="preserve">docker</w:t>
       </w:r>
       <w:r>
         <w:rPr>
           <w:rStyle w:val="NormalTok"/>
+          <w:color w:val="C00000"/>
         </w:rPr>
         <w:t xml:space="preserve"> run </w:t>
       </w:r>
       <w:r>
         <w:rPr>
           <w:rStyle w:val="AttributeTok"/>
+          <w:color w:val="C00000"/>
         </w:rPr>
         <w:t xml:space="preserve">-d</w:t>
       </w:r>
       <w:r>
         <w:rPr>
           <w:rStyle w:val="NormalTok"/>
+          <w:color w:val="C00000"/>
         </w:rPr>
         <w:t xml:space="preserve"> </w:t>
       </w:r>
       <w:r>
         <w:rPr>
           <w:rStyle w:val="AttributeTok"/>
+          <w:color w:val="C00000"/>
         </w:rPr>
         <w:t xml:space="preserve">--name</w:t>
       </w:r>
       <w:r>
         <w:rPr>
           <w:rStyle w:val="NormalTok"/>
+          <w:color w:val="C00000"/>
         </w:rPr>
         <w:t xml:space="preserve"> docutrust-postgres </w:t>
       </w:r>
       <w:r>
         <w:rPr>
           <w:rStyle w:val="DataTypeTok"/>
+          <w:color w:val="C00000"/>
         </w:rPr>
         <w:t xml:space="preserve">\</w:t>
       </w:r>
       <w:r>
+        <w:rPr>
+          <w:color w:val="C00000"/>
+        </w:rPr>
         <w:br/>
       </w:r>
       <w:r>
         <w:rPr>
           <w:rStyle w:val="NormalTok"/>
+          <w:color w:val="C00000"/>
         </w:rPr>
         <w:t xml:space="preserve">  </w:t>
       </w:r>
       <w:r>
         <w:rPr>
           <w:rStyle w:val="AttributeTok"/>
+          <w:color w:val="C00000"/>
         </w:rPr>
         <w:t xml:space="preserve">-e</w:t>
       </w:r>
       <w:r>
         <w:rPr>
           <w:rStyle w:val="NormalTok"/>
+          <w:color w:val="C00000"/>
         </w:rPr>
         <w:t xml:space="preserve"> POSTGRES_USER=docutrust </w:t>
       </w:r>
       <w:r>
         <w:rPr>
           <w:rStyle w:val="DataTypeTok"/>
+          <w:color w:val="C00000"/>
         </w:rPr>
         <w:t xml:space="preserve">\</w:t>
       </w:r>
       <w:r>
+        <w:rPr>
+          <w:color w:val="C00000"/>
+        </w:rPr>
         <w:br/>
       </w:r>
       <w:r>
         <w:rPr>
           <w:rStyle w:val="NormalTok"/>
+          <w:color w:val="C00000"/>
         </w:rPr>
         <w:t xml:space="preserve">  </w:t>
       </w:r>
       <w:r>
         <w:rPr>
           <w:rStyle w:val="AttributeTok"/>
+          <w:color w:val="C00000"/>
         </w:rPr>
         <w:t xml:space="preserve">-e</w:t>
       </w:r>
       <w:r>
         <w:rPr>
           <w:rStyle w:val="NormalTok"/>
+          <w:color w:val="C00000"/>
         </w:rPr>
         <w:t xml:space="preserve"> POSTGRES_PASSWORD=docutrust_dev_password </w:t>
       </w:r>
       <w:r>
         <w:rPr>
           <w:rStyle w:val="DataTypeTok"/>
+          <w:color w:val="C00000"/>
         </w:rPr>
         <w:t xml:space="preserve">\</w:t>
       </w:r>
       <w:r>
+        <w:rPr>
+          <w:color w:val="C00000"/>
+        </w:rPr>
         <w:br/>
       </w:r>
       <w:r>
         <w:rPr>
           <w:rStyle w:val="NormalTok"/>
+          <w:color w:val="C00000"/>
         </w:rPr>
         <w:t xml:space="preserve">  </w:t>
       </w:r>
       <w:r>
         <w:rPr>
           <w:rStyle w:val="AttributeTok"/>
+          <w:color w:val="C00000"/>
         </w:rPr>
         <w:t xml:space="preserve">-e</w:t>
       </w:r>
       <w:r>
         <w:rPr>
           <w:rStyle w:val="NormalTok"/>
+          <w:color w:val="C00000"/>
         </w:rPr>
         <w:t xml:space="preserve"> POSTGRES_DB=docutrust </w:t>
       </w:r>
       <w:r>
         <w:rPr>
           <w:rStyle w:val="DataTypeTok"/>
+          <w:color w:val="C00000"/>
         </w:rPr>
         <w:t xml:space="preserve">\</w:t>
       </w:r>
       <w:r>
+        <w:rPr>
+          <w:color w:val="C00000"/>
+        </w:rPr>
         <w:br/>
       </w:r>
       <w:r>
         <w:rPr>
           <w:rStyle w:val="NormalTok"/>
+          <w:color w:val="C00000"/>
         </w:rPr>
         <w:t xml:space="preserve">  </w:t>
       </w:r>
       <w:r>
         <w:rPr>
           <w:rStyle w:val="AttributeTok"/>
+          <w:color w:val="C00000"/>
         </w:rPr>
         <w:t xml:space="preserve">-p</w:t>
       </w:r>
       <w:r>
         <w:rPr>
           <w:rStyle w:val="NormalTok"/>
+          <w:color w:val="C00000"/>
         </w:rPr>
         <w:t xml:space="preserve"> 5432:5432 </w:t>
       </w:r>
       <w:r>
         <w:rPr>
           <w:rStyle w:val="DataTypeTok"/>
+          <w:color w:val="C00000"/>
         </w:rPr>
         <w:t xml:space="preserve">\</w:t>
       </w:r>
       <w:r>
+        <w:rPr>
+          <w:color w:val="C00000"/>
+        </w:rPr>
         <w:br/>
       </w:r>
       <w:r>
         <w:rPr>
           <w:rStyle w:val="NormalTok"/>
+          <w:color w:val="C00000"/>
         </w:rPr>
         <w:t xml:space="preserve">  postgres:16.4</w:t>
       </w:r>
@@ -3783,42 +3938,49 @@
       <w:r>
         <w:rPr>
           <w:rStyle w:val="FunctionTok"/>
+          <w:color w:val="C00000"/>
         </w:rPr>
         <w:t xml:space="preserve">sudo</w:t>
       </w:r>
       <w:r>
         <w:rPr>
           <w:rStyle w:val="NormalTok"/>
+          <w:color w:val="C00000"/>
         </w:rPr>
         <w:t xml:space="preserve"> </w:t>
       </w:r>
       <w:r>
         <w:rPr>
           <w:rStyle w:val="AttributeTok"/>
+          <w:color w:val="C00000"/>
         </w:rPr>
         <w:t xml:space="preserve">-u</w:t>
       </w:r>
       <w:r>
         <w:rPr>
           <w:rStyle w:val="NormalTok"/>
+          <w:color w:val="C00000"/>
         </w:rPr>
         <w:t xml:space="preserve"> postgres psql </w:t>
       </w:r>
       <w:r>
         <w:rPr>
           <w:rStyle w:val="AttributeTok"/>
+          <w:color w:val="C00000"/>
         </w:rPr>
         <w:t xml:space="preserve">-c</w:t>
       </w:r>
       <w:r>
         <w:rPr>
           <w:rStyle w:val="NormalTok"/>
+          <w:color w:val="C00000"/>
         </w:rPr>
         <w:t xml:space="preserve"> </w:t>
       </w:r>
       <w:r>
         <w:rPr>
           <w:rStyle w:val="StringTok"/>
+          <w:color w:val="C00000"/>
         </w:rPr>
         <w:t xml:space="preserve">"CREATE ROLE docutrust WITH LOGIN PASSWORD 'docutrust_dev_password';"</w:t>
       </w:r>
@@ -3832,42 +3994,49 @@
       <w:r>
         <w:rPr>
           <w:rStyle w:val="FunctionTok"/>
+          <w:color w:val="C00000"/>
         </w:rPr>
         <w:t xml:space="preserve">sudo</w:t>
       </w:r>
       <w:r>
         <w:rPr>
           <w:rStyle w:val="NormalTok"/>
+          <w:color w:val="C00000"/>
         </w:rPr>
         <w:t xml:space="preserve"> </w:t>
       </w:r>
       <w:r>
         <w:rPr>
           <w:rStyle w:val="AttributeTok"/>
+          <w:color w:val="C00000"/>
         </w:rPr>
         <w:t xml:space="preserve">-u</w:t>
       </w:r>
       <w:r>
         <w:rPr>
           <w:rStyle w:val="NormalTok"/>
+          <w:color w:val="C00000"/>
         </w:rPr>
         <w:t xml:space="preserve"> postgres psql </w:t>
       </w:r>
       <w:r>
         <w:rPr>
           <w:rStyle w:val="AttributeTok"/>
+          <w:color w:val="C00000"/>
         </w:rPr>
         <w:t xml:space="preserve">-c</w:t>
       </w:r>
       <w:r>
         <w:rPr>
           <w:rStyle w:val="NormalTok"/>
+          <w:color w:val="C00000"/>
         </w:rPr>
         <w:t xml:space="preserve"> </w:t>
       </w:r>
       <w:r>
         <w:rPr>
           <w:rStyle w:val="StringTok"/>
+          <w:color w:val="C00000"/>
         </w:rPr>
         <w:t xml:space="preserve">"CREATE DATABASE docutrust OWNER docutrust;"</w:t>
       </w:r>
@@ -3960,12 +4129,14 @@
       <w:r>
         <w:rPr>
           <w:rStyle w:val="BuiltInTok"/>
+          <w:color w:val="C00000"/>
         </w:rPr>
         <w:t xml:space="preserve">cd</w:t>
       </w:r>
       <w:r>
         <w:rPr>
           <w:rStyle w:val="NormalTok"/>
+          <w:color w:val="C00000"/>
         </w:rPr>
         <w:t xml:space="preserve"> docutrust</w:t>
       </w:r>
@@ -3979,12 +4150,14 @@
       <w:r>
         <w:rPr>
           <w:rStyle w:val="ExtensionTok"/>
+          <w:color w:val="C00000"/>
         </w:rPr>
         <w:t xml:space="preserve">npm</w:t>
       </w:r>
       <w:r>
         <w:rPr>
           <w:rStyle w:val="NormalTok"/>
+          <w:color w:val="C00000"/>
         </w:rPr>
         <w:t xml:space="preserve"> install</w:t>
       </w:r>
@@ -4093,12 +4266,14 @@
       <w:r>
         <w:rPr>
           <w:rStyle w:val="FunctionTok"/>
+          <w:color w:val="C00000"/>
         </w:rPr>
         <w:t xml:space="preserve">cp</w:t>
       </w:r>
       <w:r>
         <w:rPr>
           <w:rStyle w:val="NormalTok"/>
+          <w:color w:val="C00000"/>
         </w:rPr>
         <w:t xml:space="preserve"> .env.example .env.local</w:t>
       </w:r>
@@ -4475,12 +4650,14 @@
       <w:r>
         <w:rPr>
           <w:rStyle w:val="BuiltInTok"/>
+          <w:color w:val="C00000"/>
         </w:rPr>
         <w:t xml:space="preserve">source</w:t>
       </w:r>
       <w:r>
         <w:rPr>
           <w:rStyle w:val="NormalTok"/>
+          <w:color w:val="C00000"/>
         </w:rPr>
         <w:t xml:space="preserve"> .env.local</w:t>
       </w:r>
@@ -4571,12 +4748,14 @@
       <w:r>
         <w:rPr>
           <w:rStyle w:val="ExtensionTok"/>
+          <w:color w:val="C00000"/>
         </w:rPr>
         <w:t xml:space="preserve">npm</w:t>
       </w:r>
       <w:r>
         <w:rPr>
           <w:rStyle w:val="NormalTok"/>
+          <w:color w:val="C00000"/>
         </w:rPr>
         <w:t xml:space="preserve"> run migrate</w:t>
       </w:r>
@@ -4742,12 +4921,14 @@
       <w:r>
         <w:rPr>
           <w:rStyle w:val="ExtensionTok"/>
+          <w:color w:val="C00000"/>
         </w:rPr>
         <w:t xml:space="preserve">node</w:t>
       </w:r>
       <w:r>
         <w:rPr>
           <w:rStyle w:val="NormalTok"/>
+          <w:color w:val="C00000"/>
         </w:rPr>
         <w:t xml:space="preserve"> src/index.js</w:t>
       </w:r>
@@ -4958,12 +5139,14 @@
       <w:r>
         <w:rPr>
           <w:rStyle w:val="ExtensionTok"/>
+          <w:color w:val="C00000"/>
         </w:rPr>
         <w:t xml:space="preserve">curl</w:t>
       </w:r>
       <w:r>
         <w:rPr>
           <w:rStyle w:val="NormalTok"/>
+          <w:color w:val="C00000"/>
         </w:rPr>
         <w:t xml:space="preserve"> localhost:3000/healthz</w:t>
       </w:r>
@@ -5130,66 +5313,77 @@
       <w:r>
         <w:rPr>
           <w:rStyle w:val="ExtensionTok"/>
+          <w:color w:val="C00000"/>
         </w:rPr>
         <w:t xml:space="preserve">curl</w:t>
       </w:r>
       <w:r>
         <w:rPr>
           <w:rStyle w:val="NormalTok"/>
+          <w:color w:val="C00000"/>
         </w:rPr>
         <w:t xml:space="preserve"> </w:t>
       </w:r>
       <w:r>
         <w:rPr>
           <w:rStyle w:val="AttributeTok"/>
+          <w:color w:val="C00000"/>
         </w:rPr>
         <w:t xml:space="preserve">-X</w:t>
       </w:r>
       <w:r>
         <w:rPr>
           <w:rStyle w:val="NormalTok"/>
+          <w:color w:val="C00000"/>
         </w:rPr>
         <w:t xml:space="preserve"> POST localhost:3000/documents </w:t>
       </w:r>
       <w:r>
         <w:rPr>
           <w:rStyle w:val="AttributeTok"/>
+          <w:color w:val="C00000"/>
         </w:rPr>
         <w:t xml:space="preserve">-H</w:t>
       </w:r>
       <w:r>
         <w:rPr>
           <w:rStyle w:val="NormalTok"/>
+          <w:color w:val="C00000"/>
         </w:rPr>
         <w:t xml:space="preserve"> </w:t>
       </w:r>
       <w:r>
         <w:rPr>
           <w:rStyle w:val="StringTok"/>
+          <w:color w:val="C00000"/>
         </w:rPr>
         <w:t xml:space="preserve">'Content-Type: application/json'</w:t>
       </w:r>
       <w:r>
         <w:rPr>
           <w:rStyle w:val="NormalTok"/>
+          <w:color w:val="C00000"/>
         </w:rPr>
         <w:t xml:space="preserve"> </w:t>
       </w:r>
       <w:r>
         <w:rPr>
           <w:rStyle w:val="AttributeTok"/>
+          <w:color w:val="C00000"/>
         </w:rPr>
         <w:t xml:space="preserve">-d</w:t>
       </w:r>
       <w:r>
         <w:rPr>
           <w:rStyle w:val="NormalTok"/>
+          <w:color w:val="C00000"/>
         </w:rPr>
         <w:t xml:space="preserve"> </w:t>
       </w:r>
       <w:r>
         <w:rPr>
           <w:rStyle w:val="StringTok"/>
+          <w:color w:val="C00000"/>
         </w:rPr>
         <w:t xml:space="preserve">'{"title":"Quarterly Report","body":"Q2 numbers"}'</w:t>
       </w:r>
@@ -5695,12 +5889,14 @@
       <w:r>
         <w:rPr>
           <w:rStyle w:val="ExtensionTok"/>
+          <w:color w:val="C00000"/>
         </w:rPr>
         <w:t xml:space="preserve">curl</w:t>
       </w:r>
       <w:r>
         <w:rPr>
           <w:rStyle w:val="NormalTok"/>
+          <w:color w:val="C00000"/>
         </w:rPr>
         <w:t xml:space="preserve"> localhost:3000/documents/1</w:t>
       </w:r>
@@ -5746,12 +5942,14 @@
       <w:r>
         <w:rPr>
           <w:rStyle w:val="ExtensionTok"/>
+          <w:color w:val="C00000"/>
         </w:rPr>
         <w:t xml:space="preserve">curl</w:t>
       </w:r>
       <w:r>
         <w:rPr>
           <w:rStyle w:val="NormalTok"/>
+          <w:color w:val="C00000"/>
         </w:rPr>
         <w:t xml:space="preserve"> localhost:3000/documents/1/render</w:t>
       </w:r>
@@ -5984,18 +6182,21 @@
       <w:r>
         <w:rPr>
           <w:rStyle w:val="ExtensionTok"/>
+          <w:color w:val="C00000"/>
         </w:rPr>
         <w:t xml:space="preserve">curl</w:t>
       </w:r>
       <w:r>
         <w:rPr>
           <w:rStyle w:val="NormalTok"/>
+          <w:color w:val="C00000"/>
         </w:rPr>
         <w:t xml:space="preserve"> </w:t>
       </w:r>
       <w:r>
         <w:rPr>
           <w:rStyle w:val="StringTok"/>
+          <w:color w:val="C00000"/>
         </w:rPr>
         <w:t xml:space="preserve">"localhost:3000/documents/search?q=quarterly"</w:t>
       </w:r>
@@ -6433,66 +6634,77 @@
       <w:r>
         <w:rPr>
           <w:rStyle w:val="ExtensionTok"/>
+          <w:color w:val="C00000"/>
         </w:rPr>
         <w:t xml:space="preserve">semgrep</w:t>
       </w:r>
       <w:r>
         <w:rPr>
           <w:rStyle w:val="NormalTok"/>
+          <w:color w:val="C00000"/>
         </w:rPr>
         <w:t xml:space="preserve"> </w:t>
       </w:r>
       <w:r>
         <w:rPr>
           <w:rStyle w:val="AttributeTok"/>
+          <w:color w:val="C00000"/>
         </w:rPr>
         <w:t xml:space="preserve">--metrics</w:t>
       </w:r>
       <w:r>
         <w:rPr>
           <w:rStyle w:val="OperatorTok"/>
+          <w:color w:val="C00000"/>
         </w:rPr>
         <w:t xml:space="preserve">=</w:t>
       </w:r>
       <w:r>
         <w:rPr>
           <w:rStyle w:val="NormalTok"/>
+          <w:color w:val="C00000"/>
         </w:rPr>
         <w:t xml:space="preserve">off </w:t>
       </w:r>
       <w:r>
         <w:rPr>
           <w:rStyle w:val="AttributeTok"/>
+          <w:color w:val="C00000"/>
         </w:rPr>
         <w:t xml:space="preserve">--config</w:t>
       </w:r>
       <w:r>
         <w:rPr>
           <w:rStyle w:val="OperatorTok"/>
+          <w:color w:val="C00000"/>
         </w:rPr>
         <w:t xml:space="preserve">=</w:t>
       </w:r>
       <w:r>
         <w:rPr>
           <w:rStyle w:val="NormalTok"/>
+          <w:color w:val="C00000"/>
         </w:rPr>
         <w:t xml:space="preserve">p/owasp-top-ten </w:t>
       </w:r>
       <w:r>
         <w:rPr>
           <w:rStyle w:val="AttributeTok"/>
+          <w:color w:val="C00000"/>
         </w:rPr>
         <w:t xml:space="preserve">--config</w:t>
       </w:r>
       <w:r>
         <w:rPr>
           <w:rStyle w:val="OperatorTok"/>
+          <w:color w:val="C00000"/>
         </w:rPr>
         <w:t xml:space="preserve">=</w:t>
       </w:r>
       <w:r>
         <w:rPr>
           <w:rStyle w:val="NormalTok"/>
+          <w:color w:val="C00000"/>
         </w:rPr>
         <w:t xml:space="preserve">p/javascript src/</w:t>
       </w:r>
@@ -7203,66 +7415,77 @@
       <w:r>
         <w:rPr>
           <w:rStyle w:val="ExtensionTok"/>
+          <w:color w:val="C00000"/>
         </w:rPr>
         <w:t xml:space="preserve">curl</w:t>
       </w:r>
       <w:r>
         <w:rPr>
           <w:rStyle w:val="NormalTok"/>
+          <w:color w:val="C00000"/>
         </w:rPr>
         <w:t xml:space="preserve"> </w:t>
       </w:r>
       <w:r>
         <w:rPr>
           <w:rStyle w:val="AttributeTok"/>
+          <w:color w:val="C00000"/>
         </w:rPr>
         <w:t xml:space="preserve">-X</w:t>
       </w:r>
       <w:r>
         <w:rPr>
           <w:rStyle w:val="NormalTok"/>
+          <w:color w:val="C00000"/>
         </w:rPr>
         <w:t xml:space="preserve"> POST localhost:3000/documents </w:t>
       </w:r>
       <w:r>
         <w:rPr>
           <w:rStyle w:val="AttributeTok"/>
+          <w:color w:val="C00000"/>
         </w:rPr>
         <w:t xml:space="preserve">-H</w:t>
       </w:r>
       <w:r>
         <w:rPr>
           <w:rStyle w:val="NormalTok"/>
+          <w:color w:val="C00000"/>
         </w:rPr>
         <w:t xml:space="preserve"> </w:t>
       </w:r>
       <w:r>
         <w:rPr>
           <w:rStyle w:val="StringTok"/>
+          <w:color w:val="C00000"/>
         </w:rPr>
         <w:t xml:space="preserve">'Content-Type: application/json'</w:t>
       </w:r>
       <w:r>
         <w:rPr>
           <w:rStyle w:val="NormalTok"/>
+          <w:color w:val="C00000"/>
         </w:rPr>
         <w:t xml:space="preserve"> </w:t>
       </w:r>
       <w:r>
         <w:rPr>
           <w:rStyle w:val="AttributeTok"/>
+          <w:color w:val="C00000"/>
         </w:rPr>
         <w:t xml:space="preserve">-d</w:t>
       </w:r>
       <w:r>
         <w:rPr>
           <w:rStyle w:val="NormalTok"/>
+          <w:color w:val="C00000"/>
         </w:rPr>
         <w:t xml:space="preserve"> </w:t>
       </w:r>
       <w:r>
         <w:rPr>
           <w:rStyle w:val="StringTok"/>
+          <w:color w:val="C00000"/>
         </w:rPr>
         <w:t xml:space="preserve">'{"title":"&lt;script&gt;alert(1)&lt;/script&gt;","body":"hello"}'</w:t>
       </w:r>
@@ -7378,12 +7601,14 @@
       <w:r>
         <w:rPr>
           <w:rStyle w:val="ExtensionTok"/>
+          <w:color w:val="C00000"/>
         </w:rPr>
         <w:t xml:space="preserve">curl</w:t>
       </w:r>
       <w:r>
         <w:rPr>
           <w:rStyle w:val="NormalTok"/>
+          <w:color w:val="C00000"/>
         </w:rPr>
         <w:t xml:space="preserve"> localhost:3000/documents/2/render</w:t>
       </w:r>
@@ -8443,42 +8668,49 @@
       <w:r>
         <w:rPr>
           <w:rStyle w:val="ExtensionTok"/>
+          <w:color w:val="C00000"/>
         </w:rPr>
         <w:t xml:space="preserve">semgrep</w:t>
       </w:r>
       <w:r>
         <w:rPr>
           <w:rStyle w:val="NormalTok"/>
+          <w:color w:val="C00000"/>
         </w:rPr>
         <w:t xml:space="preserve"> </w:t>
       </w:r>
       <w:r>
         <w:rPr>
           <w:rStyle w:val="AttributeTok"/>
+          <w:color w:val="C00000"/>
         </w:rPr>
         <w:t xml:space="preserve">--metrics</w:t>
       </w:r>
       <w:r>
         <w:rPr>
           <w:rStyle w:val="OperatorTok"/>
+          <w:color w:val="C00000"/>
         </w:rPr>
         <w:t xml:space="preserve">=</w:t>
       </w:r>
       <w:r>
         <w:rPr>
           <w:rStyle w:val="NormalTok"/>
+          <w:color w:val="C00000"/>
         </w:rPr>
         <w:t xml:space="preserve">off </w:t>
       </w:r>
       <w:r>
         <w:rPr>
           <w:rStyle w:val="AttributeTok"/>
+          <w:color w:val="C00000"/>
         </w:rPr>
         <w:t xml:space="preserve">--config</w:t>
       </w:r>
       <w:r>
         <w:rPr>
           <w:rStyle w:val="NormalTok"/>
+          <w:color w:val="C00000"/>
         </w:rPr>
         <w:t xml:space="preserve"> semgrep/rules/ src/</w:t>
       </w:r>
@@ -8728,54 +8960,63 @@
       <w:r>
         <w:rPr>
           <w:rStyle w:val="ExtensionTok"/>
+          <w:color w:val="C00000"/>
         </w:rPr>
         <w:t xml:space="preserve">semgrep</w:t>
       </w:r>
       <w:r>
         <w:rPr>
           <w:rStyle w:val="NormalTok"/>
+          <w:color w:val="C00000"/>
         </w:rPr>
         <w:t xml:space="preserve"> </w:t>
       </w:r>
       <w:r>
         <w:rPr>
           <w:rStyle w:val="AttributeTok"/>
+          <w:color w:val="C00000"/>
         </w:rPr>
         <w:t xml:space="preserve">--metrics</w:t>
       </w:r>
       <w:r>
         <w:rPr>
           <w:rStyle w:val="OperatorTok"/>
+          <w:color w:val="C00000"/>
         </w:rPr>
         <w:t xml:space="preserve">=</w:t>
       </w:r>
       <w:r>
         <w:rPr>
           <w:rStyle w:val="NormalTok"/>
+          <w:color w:val="C00000"/>
         </w:rPr>
         <w:t xml:space="preserve">off </w:t>
       </w:r>
       <w:r>
         <w:rPr>
           <w:rStyle w:val="AttributeTok"/>
+          <w:color w:val="C00000"/>
         </w:rPr>
         <w:t xml:space="preserve">--config</w:t>
       </w:r>
       <w:r>
         <w:rPr>
           <w:rStyle w:val="NormalTok"/>
+          <w:color w:val="C00000"/>
         </w:rPr>
         <w:t xml:space="preserve"> semgrep/rules/ </w:t>
       </w:r>
       <w:r>
         <w:rPr>
           <w:rStyle w:val="AttributeTok"/>
+          <w:color w:val="C00000"/>
         </w:rPr>
         <w:t xml:space="preserve">--error</w:t>
       </w:r>
       <w:r>
         <w:rPr>
           <w:rStyle w:val="NormalTok"/>
+          <w:color w:val="C00000"/>
         </w:rPr>
         <w:t xml:space="preserve"> src/ evidence/05-custom-rule/test-cases.js</w:t>
       </w:r>
@@ -9354,24 +9595,28 @@
       <w:r>
         <w:rPr>
           <w:rStyle w:val="ExtensionTok"/>
+          <w:color w:val="C00000"/>
         </w:rPr>
         <w:t xml:space="preserve">gitleaks</w:t>
       </w:r>
       <w:r>
         <w:rPr>
           <w:rStyle w:val="NormalTok"/>
+          <w:color w:val="C00000"/>
         </w:rPr>
         <w:t xml:space="preserve"> detect </w:t>
       </w:r>
       <w:r>
         <w:rPr>
           <w:rStyle w:val="AttributeTok"/>
+          <w:color w:val="C00000"/>
         </w:rPr>
         <w:t xml:space="preserve">--source</w:t>
       </w:r>
       <w:r>
         <w:rPr>
           <w:rStyle w:val="NormalTok"/>
+          <w:color w:val="C00000"/>
         </w:rPr>
         <w:t xml:space="preserve"> .</w:t>
       </w:r>
@@ -10063,36 +10308,42 @@
       <w:r>
         <w:rPr>
           <w:rStyle w:val="ExtensionTok"/>
+          <w:color w:val="C00000"/>
         </w:rPr>
         <w:t xml:space="preserve">gitleaks</w:t>
       </w:r>
       <w:r>
         <w:rPr>
           <w:rStyle w:val="NormalTok"/>
+          <w:color w:val="C00000"/>
         </w:rPr>
         <w:t xml:space="preserve"> detect </w:t>
       </w:r>
       <w:r>
         <w:rPr>
           <w:rStyle w:val="AttributeTok"/>
+          <w:color w:val="C00000"/>
         </w:rPr>
         <w:t xml:space="preserve">--source</w:t>
       </w:r>
       <w:r>
         <w:rPr>
           <w:rStyle w:val="NormalTok"/>
+          <w:color w:val="C00000"/>
         </w:rPr>
         <w:t xml:space="preserve"> . </w:t>
       </w:r>
       <w:r>
         <w:rPr>
           <w:rStyle w:val="AttributeTok"/>
+          <w:color w:val="C00000"/>
         </w:rPr>
         <w:t xml:space="preserve">-c</w:t>
       </w:r>
       <w:r>
         <w:rPr>
           <w:rStyle w:val="NormalTok"/>
+          <w:color w:val="C00000"/>
         </w:rPr>
         <w:t xml:space="preserve"> gitleaks.toml</w:t>
       </w:r>
@@ -10587,54 +10838,63 @@
       <w:r>
         <w:rPr>
           <w:rStyle w:val="ExtensionTok"/>
+          <w:color w:val="C00000"/>
         </w:rPr>
         <w:t xml:space="preserve">gitleaks</w:t>
       </w:r>
       <w:r>
         <w:rPr>
           <w:rStyle w:val="NormalTok"/>
+          <w:color w:val="C00000"/>
         </w:rPr>
         <w:t xml:space="preserve"> detect </w:t>
       </w:r>
       <w:r>
         <w:rPr>
           <w:rStyle w:val="AttributeTok"/>
+          <w:color w:val="C00000"/>
         </w:rPr>
         <w:t xml:space="preserve">--source</w:t>
       </w:r>
       <w:r>
         <w:rPr>
           <w:rStyle w:val="NormalTok"/>
+          <w:color w:val="C00000"/>
         </w:rPr>
         <w:t xml:space="preserve"> . </w:t>
       </w:r>
       <w:r>
         <w:rPr>
           <w:rStyle w:val="AttributeTok"/>
+          <w:color w:val="C00000"/>
         </w:rPr>
         <w:t xml:space="preserve">-c</w:t>
       </w:r>
       <w:r>
         <w:rPr>
           <w:rStyle w:val="NormalTok"/>
+          <w:color w:val="C00000"/>
         </w:rPr>
         <w:t xml:space="preserve"> gitleaks.toml </w:t>
       </w:r>
       <w:r>
         <w:rPr>
           <w:rStyle w:val="AttributeTok"/>
+          <w:color w:val="C00000"/>
         </w:rPr>
         <w:t xml:space="preserve">--log-opts</w:t>
       </w:r>
       <w:r>
         <w:rPr>
           <w:rStyle w:val="OperatorTok"/>
+          <w:color w:val="C00000"/>
         </w:rPr>
         <w:t xml:space="preserve">=</w:t>
       </w:r>
       <w:r>
         <w:rPr>
           <w:rStyle w:val="StringTok"/>
+          <w:color w:val="C00000"/>
         </w:rPr>
         <w:t xml:space="preserve">"--all"</w:t>
       </w:r>
@@ -11208,12 +11468,14 @@
       <w:r>
         <w:rPr>
           <w:rStyle w:val="BuiltInTok"/>
+          <w:color w:val="C00000"/>
         </w:rPr>
         <w:t xml:space="preserve">cd</w:t>
       </w:r>
       <w:r>
         <w:rPr>
           <w:rStyle w:val="NormalTok"/>
+          <w:color w:val="C00000"/>
         </w:rPr>
         <w:t xml:space="preserve"> security</w:t>
       </w:r>
@@ -11227,12 +11489,14 @@
       <w:r>
         <w:rPr>
           <w:rStyle w:val="ExtensionTok"/>
+          <w:color w:val="C00000"/>
         </w:rPr>
         <w:t xml:space="preserve">npm</w:t>
       </w:r>
       <w:r>
         <w:rPr>
           <w:rStyle w:val="NormalTok"/>
+          <w:color w:val="C00000"/>
         </w:rPr>
         <w:t xml:space="preserve"> install</w:t>
       </w:r>
@@ -11246,12 +11510,14 @@
       <w:r>
         <w:rPr>
           <w:rStyle w:val="BuiltInTok"/>
+          <w:color w:val="C00000"/>
         </w:rPr>
         <w:t xml:space="preserve">cd</w:t>
       </w:r>
       <w:r>
         <w:rPr>
           <w:rStyle w:val="NormalTok"/>
+          <w:color w:val="C00000"/>
         </w:rPr>
         <w:t xml:space="preserve"> ..</w:t>
       </w:r>
@@ -11273,12 +11539,14 @@
       <w:r>
         <w:rPr>
           <w:rStyle w:val="ExtensionTok"/>
+          <w:color w:val="C00000"/>
         </w:rPr>
         <w:t xml:space="preserve">node</w:t>
       </w:r>
       <w:r>
         <w:rPr>
           <w:rStyle w:val="NormalTok"/>
+          <w:color w:val="C00000"/>
         </w:rPr>
         <w:t xml:space="preserve"> security/verify-credential.js</w:t>
       </w:r>
@@ -11689,12 +11957,14 @@
       <w:r>
         <w:rPr>
           <w:rStyle w:val="ExtensionTok"/>
+          <w:color w:val="C00000"/>
         </w:rPr>
         <w:t xml:space="preserve">curl</w:t>
       </w:r>
       <w:r>
         <w:rPr>
           <w:rStyle w:val="NormalTok"/>
+          <w:color w:val="C00000"/>
         </w:rPr>
         <w:t xml:space="preserve"> localhost:3000/documents/abc</w:t>
       </w:r>
@@ -11761,12 +12031,14 @@
       <w:r>
         <w:rPr>
           <w:rStyle w:val="ExtensionTok"/>
+          <w:color w:val="C00000"/>
         </w:rPr>
         <w:t xml:space="preserve">curl</w:t>
       </w:r>
       <w:r>
         <w:rPr>
           <w:rStyle w:val="NormalTok"/>
+          <w:color w:val="C00000"/>
         </w:rPr>
         <w:t xml:space="preserve"> localhost:3000/documents/search</w:t>
       </w:r>
@@ -12800,18 +13072,21 @@
       <w:r>
         <w:rPr>
           <w:rStyle w:val="ExtensionTok"/>
+          <w:color w:val="C00000"/>
         </w:rPr>
         <w:t xml:space="preserve">curl</w:t>
       </w:r>
       <w:r>
         <w:rPr>
           <w:rStyle w:val="NormalTok"/>
+          <w:color w:val="C00000"/>
         </w:rPr>
         <w:t xml:space="preserve"> </w:t>
       </w:r>
       <w:r>
         <w:rPr>
           <w:rStyle w:val="StringTok"/>
+          <w:color w:val="C00000"/>
         </w:rPr>
         <w:t xml:space="preserve">"localhost:3000/documents/search?q=quarterly"</w:t>
       </w:r>
@@ -12987,18 +13262,21 @@
       <w:r>
         <w:rPr>
           <w:rStyle w:val="ExtensionTok"/>
+          <w:color w:val="C00000"/>
         </w:rPr>
         <w:t xml:space="preserve">curl</w:t>
       </w:r>
       <w:r>
         <w:rPr>
           <w:rStyle w:val="NormalTok"/>
+          <w:color w:val="C00000"/>
         </w:rPr>
         <w:t xml:space="preserve"> </w:t>
       </w:r>
       <w:r>
         <w:rPr>
           <w:rStyle w:val="StringTok"/>
+          <w:color w:val="C00000"/>
         </w:rPr>
         <w:t xml:space="preserve">"localhost:3000/documents/search?q=quarterly%27%20OR%20%271%27%3D%271"</w:t>
       </w:r>
@@ -13148,12 +13426,14 @@
       <w:r>
         <w:rPr>
           <w:rStyle w:val="ExtensionTok"/>
+          <w:color w:val="C00000"/>
         </w:rPr>
         <w:t xml:space="preserve">curl</w:t>
       </w:r>
       <w:r>
         <w:rPr>
           <w:rStyle w:val="NormalTok"/>
+          <w:color w:val="C00000"/>
         </w:rPr>
         <w:t xml:space="preserve"> localhost:3000/documents/5/render</w:t>
       </w:r>
@@ -13462,54 +13742,63 @@
       <w:r>
         <w:rPr>
           <w:rStyle w:val="ExtensionTok"/>
+          <w:color w:val="C00000"/>
         </w:rPr>
         <w:t xml:space="preserve">semgrep</w:t>
       </w:r>
       <w:r>
         <w:rPr>
           <w:rStyle w:val="NormalTok"/>
+          <w:color w:val="C00000"/>
         </w:rPr>
         <w:t xml:space="preserve"> </w:t>
       </w:r>
       <w:r>
         <w:rPr>
           <w:rStyle w:val="AttributeTok"/>
+          <w:color w:val="C00000"/>
         </w:rPr>
         <w:t xml:space="preserve">--metrics</w:t>
       </w:r>
       <w:r>
         <w:rPr>
           <w:rStyle w:val="OperatorTok"/>
+          <w:color w:val="C00000"/>
         </w:rPr>
         <w:t xml:space="preserve">=</w:t>
       </w:r>
       <w:r>
         <w:rPr>
           <w:rStyle w:val="NormalTok"/>
+          <w:color w:val="C00000"/>
         </w:rPr>
         <w:t xml:space="preserve">off </w:t>
       </w:r>
       <w:r>
         <w:rPr>
           <w:rStyle w:val="AttributeTok"/>
+          <w:color w:val="C00000"/>
         </w:rPr>
         <w:t xml:space="preserve">--config</w:t>
       </w:r>
       <w:r>
         <w:rPr>
           <w:rStyle w:val="NormalTok"/>
+          <w:color w:val="C00000"/>
         </w:rPr>
         <w:t xml:space="preserve"> semgrep/rules/ </w:t>
       </w:r>
       <w:r>
         <w:rPr>
           <w:rStyle w:val="AttributeTok"/>
+          <w:color w:val="C00000"/>
         </w:rPr>
         <w:t xml:space="preserve">--error</w:t>
       </w:r>
       <w:r>
         <w:rPr>
           <w:rStyle w:val="NormalTok"/>
+          <w:color w:val="C00000"/>
         </w:rPr>
         <w:t xml:space="preserve"> src/</w:t>
       </w:r>

</xml_diff>

<commit_message>
docs: fix .env sourcing trap and format walkthrough explanations and tables
Step 2.4 now uses 'set -a && source .env.local && set +a' so Node
actually sees DATABASE_URL (plain source only sets a shell variable),
with a callout explaining the SCRAM 'client password must be a string'
symptom. Added explanations for commands that had none (semgrep
--version, cd docutrust, the security/ install detour, verify-
credential.js) and standardized all 9 tables with explicit alignment;
regenerated the Word version.
</commit_message>
<xml_diff>
--- a/docs/walkthrough.docx
+++ b/docs/walkthrough.docx
@@ -1113,7 +1113,7 @@
         <w:t xml:space="preserve"> </w:t>
       </w:r>
       <w:r>
-        <w:t xml:space="preserve">before it and (usually) the output you should see after it.</w:t>
+        <w:t xml:space="preserve">before or after it and (usually) the output you should see after it.</w:t>
       </w:r>
     </w:p>
     <w:p>
@@ -2459,6 +2459,26 @@
           <w:color w:val="C00000"/>
         </w:rPr>
         <w:t xml:space="preserve">--version</w:t>
+      </w:r>
+    </w:p>
+    <w:p>
+      <w:pPr>
+        <w:pStyle w:val="FirstParagraph"/>
+      </w:pPr>
+      <w:r>
+        <w:t xml:space="preserve">You should see something like</w:t>
+      </w:r>
+      <w:r>
+        <w:t xml:space="preserve"> </w:t>
+      </w:r>
+      <w:r>
+        <w:rPr>
+          <w:rStyle w:val="VerbatimChar"/>
+        </w:rPr>
+        <w:t xml:space="preserve">semgrep 1.173.0</w:t>
+      </w:r>
+      <w:r>
+        <w:t xml:space="preserve">.</w:t>
       </w:r>
     </w:p>
     <w:bookmarkEnd w:id="26"/>
@@ -4143,6 +4163,63 @@
     </w:p>
     <w:p>
       <w:pPr>
+        <w:pStyle w:val="FirstParagraph"/>
+      </w:pPr>
+      <w:r>
+        <w:rPr>
+          <w:bCs/>
+          <w:b/>
+        </w:rPr>
+        <w:t xml:space="preserve">What just happened:</w:t>
+      </w:r>
+      <w:r>
+        <w:t xml:space="preserve"> </w:t>
+      </w:r>
+      <w:r>
+        <w:rPr>
+          <w:rStyle w:val="VerbatimChar"/>
+        </w:rPr>
+        <w:t xml:space="preserve">cd</w:t>
+      </w:r>
+      <w:r>
+        <w:t xml:space="preserve"> </w:t>
+      </w:r>
+      <w:r>
+        <w:t xml:space="preserve">(</w:t>
+      </w:r>
+      <w:r>
+        <w:t xml:space="preserve">“</w:t>
+      </w:r>
+      <w:r>
+        <w:t xml:space="preserve">change directory</w:t>
+      </w:r>
+      <w:r>
+        <w:t xml:space="preserve">”</w:t>
+      </w:r>
+      <w:r>
+        <w:t xml:space="preserve">) moves your terminal into</w:t>
+      </w:r>
+      <w:r>
+        <w:t xml:space="preserve"> </w:t>
+      </w:r>
+      <w:r>
+        <w:t xml:space="preserve">the project folder. From here on, run every command from inside</w:t>
+      </w:r>
+      <w:r>
+        <w:t xml:space="preserve"> </w:t>
+      </w:r>
+      <w:r>
+        <w:rPr>
+          <w:rStyle w:val="VerbatimChar"/>
+        </w:rPr>
+        <w:t xml:space="preserve">docutrust</w:t>
+      </w:r>
+      <w:r>
+        <w:t xml:space="preserve">.</w:t>
+      </w:r>
+    </w:p>
+    <w:p>
+      <w:pPr>
         <w:pStyle w:val="SourceCode"/>
         <w:shd w:val="clear" w:color="auto" w:fill="F2F2F2"/>
         <w:spacing w:after="0" w:before="0"/>
@@ -4652,6 +4729,48 @@
           <w:rStyle w:val="BuiltInTok"/>
           <w:color w:val="C00000"/>
         </w:rPr>
+        <w:t xml:space="preserve">set</w:t>
+      </w:r>
+      <w:r>
+        <w:rPr>
+          <w:rStyle w:val="NormalTok"/>
+          <w:color w:val="C00000"/>
+        </w:rPr>
+        <w:t xml:space="preserve"> </w:t>
+      </w:r>
+      <w:r>
+        <w:rPr>
+          <w:rStyle w:val="AttributeTok"/>
+          <w:color w:val="C00000"/>
+        </w:rPr>
+        <w:t xml:space="preserve">-a</w:t>
+      </w:r>
+      <w:r>
+        <w:rPr>
+          <w:rStyle w:val="NormalTok"/>
+          <w:color w:val="C00000"/>
+        </w:rPr>
+        <w:t xml:space="preserve"> </w:t>
+      </w:r>
+      <w:r>
+        <w:rPr>
+          <w:rStyle w:val="KeywordTok"/>
+          <w:color w:val="C00000"/>
+        </w:rPr>
+        <w:t xml:space="preserve">&amp;&amp;</w:t>
+      </w:r>
+      <w:r>
+        <w:rPr>
+          <w:rStyle w:val="NormalTok"/>
+          <w:color w:val="C00000"/>
+        </w:rPr>
+        <w:t xml:space="preserve"> </w:t>
+      </w:r>
+      <w:r>
+        <w:rPr>
+          <w:rStyle w:val="BuiltInTok"/>
+          <w:color w:val="C00000"/>
+        </w:rPr>
         <w:t xml:space="preserve">source</w:t>
       </w:r>
       <w:r>
@@ -4659,7 +4778,35 @@
           <w:rStyle w:val="NormalTok"/>
           <w:color w:val="C00000"/>
         </w:rPr>
-        <w:t xml:space="preserve"> .env.local</w:t>
+        <w:t xml:space="preserve"> .env.local </w:t>
+      </w:r>
+      <w:r>
+        <w:rPr>
+          <w:rStyle w:val="KeywordTok"/>
+          <w:color w:val="C00000"/>
+        </w:rPr>
+        <w:t xml:space="preserve">&amp;&amp;</w:t>
+      </w:r>
+      <w:r>
+        <w:rPr>
+          <w:rStyle w:val="NormalTok"/>
+          <w:color w:val="C00000"/>
+        </w:rPr>
+        <w:t xml:space="preserve"> </w:t>
+      </w:r>
+      <w:r>
+        <w:rPr>
+          <w:rStyle w:val="BuiltInTok"/>
+          <w:color w:val="C00000"/>
+        </w:rPr>
+        <w:t xml:space="preserve">set</w:t>
+      </w:r>
+      <w:r>
+        <w:rPr>
+          <w:rStyle w:val="NormalTok"/>
+          <w:color w:val="C00000"/>
+        </w:rPr>
+        <w:t xml:space="preserve"> +a</w:t>
       </w:r>
     </w:p>
     <w:p>
@@ -4667,7 +4814,13 @@
         <w:pStyle w:val="FirstParagraph"/>
       </w:pPr>
       <w:r>
-        <w:t xml:space="preserve">This runs the file’s contents in your current terminal, which sets</w:t>
+        <w:t xml:space="preserve">This runs the file’s contents in your current terminal and exports them,</w:t>
+      </w:r>
+      <w:r>
+        <w:t xml:space="preserve"> </w:t>
+      </w:r>
+      <w:r>
+        <w:t xml:space="preserve">so</w:t>
       </w:r>
       <w:r>
         <w:t xml:space="preserve"> </w:t>
@@ -4682,13 +4835,205 @@
         <w:t xml:space="preserve"> </w:t>
       </w:r>
       <w:r>
-        <w:t xml:space="preserve">for this terminal session. (If you open a new terminal</w:t>
-      </w:r>
-      <w:r>
-        <w:t xml:space="preserve"> </w:t>
-      </w:r>
-      <w:r>
-        <w:t xml:space="preserve">later, run this again — that’s normal and expected.)</w:t>
+        <w:t xml:space="preserve">reaches every command you run afterwards — including</w:t>
+      </w:r>
+      <w:r>
+        <w:t xml:space="preserve"> </w:t>
+      </w:r>
+      <w:r>
+        <w:rPr>
+          <w:rStyle w:val="VerbatimChar"/>
+        </w:rPr>
+        <w:t xml:space="preserve">node</w:t>
+      </w:r>
+      <w:r>
+        <w:t xml:space="preserve">, which only sees</w:t>
+      </w:r>
+      <w:r>
+        <w:t xml:space="preserve"> </w:t>
+      </w:r>
+      <w:r>
+        <w:rPr>
+          <w:iCs/>
+          <w:i/>
+        </w:rPr>
+        <w:t xml:space="preserve">exported</w:t>
+      </w:r>
+      <w:r>
+        <w:t xml:space="preserve"> </w:t>
+      </w:r>
+      <w:r>
+        <w:t xml:space="preserve">variables.</w:t>
+      </w:r>
+    </w:p>
+    <w:p>
+      <w:pPr>
+        <w:pStyle w:val="BlockText"/>
+      </w:pPr>
+      <w:r>
+        <w:t xml:space="preserve">⚠️</w:t>
+      </w:r>
+      <w:r>
+        <w:t xml:space="preserve"> </w:t>
+      </w:r>
+      <w:r>
+        <w:rPr>
+          <w:bCs/>
+          <w:b/>
+        </w:rPr>
+        <w:t xml:space="preserve">Why</w:t>
+      </w:r>
+      <w:r>
+        <w:rPr>
+          <w:bCs/>
+          <w:b/>
+        </w:rPr>
+        <w:t xml:space="preserve"> </w:t>
+      </w:r>
+      <w:r>
+        <w:rPr>
+          <w:rStyle w:val="VerbatimChar"/>
+          <w:bCs/>
+          <w:b/>
+        </w:rPr>
+        <w:t xml:space="preserve">set -a</w:t>
+      </w:r>
+      <w:r>
+        <w:rPr>
+          <w:bCs/>
+          <w:b/>
+        </w:rPr>
+        <w:t xml:space="preserve">?</w:t>
+      </w:r>
+      <w:r>
+        <w:t xml:space="preserve"> </w:t>
+      </w:r>
+      <w:r>
+        <w:t xml:space="preserve">A plain</w:t>
+      </w:r>
+      <w:r>
+        <w:t xml:space="preserve"> </w:t>
+      </w:r>
+      <w:r>
+        <w:rPr>
+          <w:rStyle w:val="VerbatimChar"/>
+        </w:rPr>
+        <w:t xml:space="preserve">source .env.local</w:t>
+      </w:r>
+      <w:r>
+        <w:t xml:space="preserve"> </w:t>
+      </w:r>
+      <w:r>
+        <w:t xml:space="preserve">only sets a</w:t>
+      </w:r>
+      <w:r>
+        <w:t xml:space="preserve"> </w:t>
+      </w:r>
+      <w:r>
+        <w:rPr>
+          <w:iCs/>
+          <w:i/>
+        </w:rPr>
+        <w:t xml:space="preserve">shell</w:t>
+      </w:r>
+      <w:r>
+        <w:t xml:space="preserve"> </w:t>
+      </w:r>
+      <w:r>
+        <w:t xml:space="preserve">variable, and child programs like Node never see shell variables. The</w:t>
+      </w:r>
+      <w:r>
+        <w:t xml:space="preserve"> </w:t>
+      </w:r>
+      <w:r>
+        <w:t xml:space="preserve">symptom:</w:t>
+      </w:r>
+      <w:r>
+        <w:t xml:space="preserve"> </w:t>
+      </w:r>
+      <w:r>
+        <w:rPr>
+          <w:rStyle w:val="VerbatimChar"/>
+        </w:rPr>
+        <w:t xml:space="preserve">npm run migrate</w:t>
+      </w:r>
+      <w:r>
+        <w:t xml:space="preserve"> </w:t>
+      </w:r>
+      <w:r>
+        <w:t xml:space="preserve">or</w:t>
+      </w:r>
+      <w:r>
+        <w:t xml:space="preserve"> </w:t>
+      </w:r>
+      <w:r>
+        <w:rPr>
+          <w:rStyle w:val="VerbatimChar"/>
+        </w:rPr>
+        <w:t xml:space="preserve">npm start</w:t>
+      </w:r>
+      <w:r>
+        <w:t xml:space="preserve"> </w:t>
+      </w:r>
+      <w:r>
+        <w:t xml:space="preserve">fails with</w:t>
+      </w:r>
+      <w:r>
+        <w:t xml:space="preserve"> </w:t>
+      </w:r>
+      <w:r>
+        <w:rPr>
+          <w:rStyle w:val="VerbatimChar"/>
+        </w:rPr>
+        <w:t xml:space="preserve">SASL: SCRAM-SERVER-FIRST-MESSAGE: client password must be a string</w:t>
+      </w:r>
+      <w:r>
+        <w:t xml:space="preserve"> </w:t>
+      </w:r>
+      <w:r>
+        <w:t xml:space="preserve">(the app silently tries to connect as your OS user with no password).</w:t>
+      </w:r>
+      <w:r>
+        <w:t xml:space="preserve"> </w:t>
+      </w:r>
+      <w:r>
+        <w:rPr>
+          <w:rStyle w:val="VerbatimChar"/>
+        </w:rPr>
+        <w:t xml:space="preserve">set -a</w:t>
+      </w:r>
+      <w:r>
+        <w:t xml:space="preserve"> </w:t>
+      </w:r>
+      <w:r>
+        <w:t xml:space="preserve">turns on auto-export for the source, and</w:t>
+      </w:r>
+      <w:r>
+        <w:t xml:space="preserve"> </w:t>
+      </w:r>
+      <w:r>
+        <w:rPr>
+          <w:rStyle w:val="VerbatimChar"/>
+        </w:rPr>
+        <w:t xml:space="preserve">set +a</w:t>
+      </w:r>
+      <w:r>
+        <w:t xml:space="preserve"> </w:t>
+      </w:r>
+      <w:r>
+        <w:t xml:space="preserve">turns it off</w:t>
+      </w:r>
+      <w:r>
+        <w:t xml:space="preserve"> </w:t>
+      </w:r>
+      <w:r>
+        <w:t xml:space="preserve">again. If you open a new terminal later, run this same line again —</w:t>
+      </w:r>
+      <w:r>
+        <w:t xml:space="preserve"> </w:t>
+      </w:r>
+      <w:r>
+        <w:t xml:space="preserve">that’s normal and expected.</w:t>
       </w:r>
     </w:p>
     <w:bookmarkEnd w:id="34"/>
@@ -11527,6 +11872,48 @@
         <w:pStyle w:val="FirstParagraph"/>
       </w:pPr>
       <w:r>
+        <w:rPr>
+          <w:bCs/>
+          <w:b/>
+        </w:rPr>
+        <w:t xml:space="preserve">What just happened:</w:t>
+      </w:r>
+      <w:r>
+        <w:t xml:space="preserve"> </w:t>
+      </w:r>
+      <w:r>
+        <w:t xml:space="preserve">we stepped into</w:t>
+      </w:r>
+      <w:r>
+        <w:t xml:space="preserve"> </w:t>
+      </w:r>
+      <w:r>
+        <w:rPr>
+          <w:rStyle w:val="VerbatimChar"/>
+        </w:rPr>
+        <w:t xml:space="preserve">security/</w:t>
+      </w:r>
+      <w:r>
+        <w:t xml:space="preserve">, installed that</w:t>
+      </w:r>
+      <w:r>
+        <w:t xml:space="preserve"> </w:t>
+      </w:r>
+      <w:r>
+        <w:t xml:space="preserve">script’s own dependencies, and stepped back to the project root — the</w:t>
+      </w:r>
+      <w:r>
+        <w:t xml:space="preserve"> </w:t>
+      </w:r>
+      <w:r>
+        <w:t xml:space="preserve">next command runs from there.</w:t>
+      </w:r>
+    </w:p>
+    <w:p>
+      <w:pPr>
+        <w:pStyle w:val="BodyText"/>
+      </w:pPr>
+      <w:r>
         <w:t xml:space="preserve">Then run the check:</w:t>
       </w:r>
     </w:p>
@@ -11549,6 +11936,48 @@
           <w:color w:val="C00000"/>
         </w:rPr>
         <w:t xml:space="preserve"> security/verify-credential.js</w:t>
+      </w:r>
+    </w:p>
+    <w:p>
+      <w:pPr>
+        <w:pStyle w:val="FirstParagraph"/>
+      </w:pPr>
+      <w:r>
+        <w:rPr>
+          <w:bCs/>
+          <w:b/>
+        </w:rPr>
+        <w:t xml:space="preserve">What just happened:</w:t>
+      </w:r>
+      <w:r>
+        <w:t xml:space="preserve"> </w:t>
+      </w:r>
+      <w:r>
+        <w:t xml:space="preserve">Node runs the verification script — it reads the</w:t>
+      </w:r>
+      <w:r>
+        <w:t xml:space="preserve"> </w:t>
+      </w:r>
+      <w:r>
+        <w:t xml:space="preserve">found key straight from</w:t>
+      </w:r>
+      <w:r>
+        <w:t xml:space="preserve"> </w:t>
+      </w:r>
+      <w:r>
+        <w:rPr>
+          <w:rStyle w:val="VerbatimChar"/>
+        </w:rPr>
+        <w:t xml:space="preserve">src/config.js</w:t>
+      </w:r>
+      <w:r>
+        <w:t xml:space="preserve">, makes the call to AWS, and</w:t>
+      </w:r>
+      <w:r>
+        <w:t xml:space="preserve"> </w:t>
+      </w:r>
+      <w:r>
+        <w:t xml:space="preserve">prints the verdict.</w:t>
       </w:r>
     </w:p>
     <w:bookmarkEnd w:id="69"/>

</xml_diff>

<commit_message>
docs: editing pass on Word walkthrough - cover dedupe, working TOC, single captions
Fixed the cover page's doubled runs (DocuTrustDocuTrust, August 2026August
2026), populated the empty TOC field with 60 cached entries (title + stage
+ step headings, dot leaders, hyperlinks, page numbers matching the
layout), merged the duplicate figure captions into one per figure, and
applied the rubric items: explicit Bash/macOS/Linux/WSL2 assumption, time
estimate near the stage map, a consolidated troubleshooting table, and
first-use glosses for API/Express, JSON, XSS, AWS SDK, force-push, and PR.
All edits made directly in word/document.xml; walkthrough.md kept in sync
for future regeneration.
</commit_message>
<xml_diff>
--- a/docs/walkthrough.docx
+++ b/docs/walkthrough.docx
@@ -21,8 +21,3792 @@
         <w:p>
           <w:r>
             <w:fldChar w:fldCharType="begin" w:dirty="true"/>
-            <w:instrText xml:space="preserve">TOC \o "1-2" \h \z \u</w:instrText>
+            <w:instrText xml:space="preserve">TOC \o "1-3" \h \z \u</w:instrText>
             <w:fldChar w:fldCharType="separate"/>
+          </w:r>
+        </w:p>
+        <w:p>
+          <w:pPr>
+            <w:pStyle w:val="TOC1"/>
+            <w:tabs>
+              <w:tab w:val="right" w:leader="dot" w:pos="9360"/>
+            </w:tabs>
+            <w:rPr>
+              <w:color w:val="0563C1"/>
+              <w:u w:val="single"/>
+            </w:rPr>
+          </w:pPr>
+          <w:hyperlink w:anchor="Xee5ab2b315e0a51b995ef048254650fded623cb" w:history="1">
+            <w:r>
+              <w:rPr>
+                <w:color w:val="0563C1"/>
+                <w:u w:val="single"/>
+              </w:rPr>
+              <w:t xml:space="preserve">DocuTrust Walkthrough — SAST, Secrets Scanning, and Live Secret Verification</w:t>
+            </w:r>
+          </w:hyperlink>
+          <w:r>
+            <w:rPr>
+              <w:color w:val="0563C1"/>
+              <w:u w:val="single"/>
+            </w:rPr>
+            <w:tab/>
+          </w:r>
+          <w:r>
+            <w:rPr>
+              <w:color w:val="0563C1"/>
+              <w:u w:val="single"/>
+            </w:rPr>
+            <w:fldChar w:fldCharType="begin"/>
+          </w:r>
+          <w:r>
+            <w:rPr>
+              <w:color w:val="0563C1"/>
+              <w:u w:val="single"/>
+            </w:rPr>
+            <w:instrText xml:space="preserve"> PAGE </w:instrText>
+          </w:r>
+          <w:r>
+            <w:rPr>
+              <w:color w:val="0563C1"/>
+              <w:u w:val="single"/>
+            </w:rPr>
+            <w:fldChar w:fldCharType="separate"/>
+          </w:r>
+          <w:r>
+            <w:rPr>
+              <w:color w:val="0563C1"/>
+              <w:u w:val="single"/>
+            </w:rPr>
+            <w:t xml:space="preserve">4</w:t>
+          </w:r>
+          <w:r>
+            <w:rPr>
+              <w:color w:val="0563C1"/>
+              <w:u w:val="single"/>
+            </w:rPr>
+            <w:fldChar w:fldCharType="end"/>
+          </w:r>
+        </w:p>
+        <w:p>
+          <w:pPr>
+            <w:pStyle w:val="TOC2"/>
+            <w:tabs>
+              <w:tab w:val="right" w:leader="dot" w:pos="9360"/>
+            </w:tabs>
+            <w:rPr>
+              <w:color w:val="0563C1"/>
+              <w:u w:val="single"/>
+            </w:rPr>
+          </w:pPr>
+          <w:hyperlink w:anchor="Xcaa8e861e929fca8f35a4a1b6a89d781dff432e" w:history="1">
+            <w:r>
+              <w:rPr>
+                <w:color w:val="0563C1"/>
+                <w:u w:val="single"/>
+              </w:rPr>
+              <w:t xml:space="preserve">The project in one paragraph (read this first)</w:t>
+            </w:r>
+          </w:hyperlink>
+          <w:r>
+            <w:rPr>
+              <w:color w:val="0563C1"/>
+              <w:u w:val="single"/>
+            </w:rPr>
+            <w:tab/>
+          </w:r>
+          <w:r>
+            <w:rPr>
+              <w:color w:val="0563C1"/>
+              <w:u w:val="single"/>
+            </w:rPr>
+            <w:fldChar w:fldCharType="begin"/>
+          </w:r>
+          <w:r>
+            <w:rPr>
+              <w:color w:val="0563C1"/>
+              <w:u w:val="single"/>
+            </w:rPr>
+            <w:instrText xml:space="preserve"> PAGE </w:instrText>
+          </w:r>
+          <w:r>
+            <w:rPr>
+              <w:color w:val="0563C1"/>
+              <w:u w:val="single"/>
+            </w:rPr>
+            <w:fldChar w:fldCharType="separate"/>
+          </w:r>
+          <w:r>
+            <w:rPr>
+              <w:color w:val="0563C1"/>
+              <w:u w:val="single"/>
+            </w:rPr>
+            <w:t xml:space="preserve">4</w:t>
+          </w:r>
+          <w:r>
+            <w:rPr>
+              <w:color w:val="0563C1"/>
+              <w:u w:val="single"/>
+            </w:rPr>
+            <w:fldChar w:fldCharType="end"/>
+          </w:r>
+        </w:p>
+        <w:p>
+          <w:pPr>
+            <w:pStyle w:val="TOC2"/>
+            <w:tabs>
+              <w:tab w:val="right" w:leader="dot" w:pos="9360"/>
+            </w:tabs>
+            <w:rPr>
+              <w:color w:val="0563C1"/>
+              <w:u w:val="single"/>
+            </w:rPr>
+          </w:pPr>
+          <w:hyperlink w:anchor="stage-1-install-the-tools-you-need" w:history="1">
+            <w:r>
+              <w:rPr>
+                <w:color w:val="0563C1"/>
+                <w:u w:val="single"/>
+              </w:rPr>
+              <w:t xml:space="preserve">Stage 1 — Install the tools you need</w:t>
+            </w:r>
+          </w:hyperlink>
+          <w:r>
+            <w:rPr>
+              <w:color w:val="0563C1"/>
+              <w:u w:val="single"/>
+            </w:rPr>
+            <w:tab/>
+          </w:r>
+          <w:r>
+            <w:rPr>
+              <w:color w:val="0563C1"/>
+              <w:u w:val="single"/>
+            </w:rPr>
+            <w:fldChar w:fldCharType="begin"/>
+          </w:r>
+          <w:r>
+            <w:rPr>
+              <w:color w:val="0563C1"/>
+              <w:u w:val="single"/>
+            </w:rPr>
+            <w:instrText xml:space="preserve"> PAGE </w:instrText>
+          </w:r>
+          <w:r>
+            <w:rPr>
+              <w:color w:val="0563C1"/>
+              <w:u w:val="single"/>
+            </w:rPr>
+            <w:fldChar w:fldCharType="separate"/>
+          </w:r>
+          <w:r>
+            <w:rPr>
+              <w:color w:val="0563C1"/>
+              <w:u w:val="single"/>
+            </w:rPr>
+            <w:t xml:space="preserve">5</w:t>
+          </w:r>
+          <w:r>
+            <w:rPr>
+              <w:color w:val="0563C1"/>
+              <w:u w:val="single"/>
+            </w:rPr>
+            <w:fldChar w:fldCharType="end"/>
+          </w:r>
+        </w:p>
+        <w:p>
+          <w:pPr>
+            <w:pStyle w:val="TOC3"/>
+            <w:tabs>
+              <w:tab w:val="right" w:leader="dot" w:pos="9360"/>
+            </w:tabs>
+            <w:rPr>
+              <w:color w:val="0563C1"/>
+              <w:u w:val="single"/>
+            </w:rPr>
+          </w:pPr>
+          <w:hyperlink w:anchor="a-note-about-commands-in-this-guide" w:history="1">
+            <w:r>
+              <w:rPr>
+                <w:color w:val="0563C1"/>
+                <w:u w:val="single"/>
+              </w:rPr>
+              <w:t xml:space="preserve">A note about commands in this guide</w:t>
+            </w:r>
+          </w:hyperlink>
+          <w:r>
+            <w:rPr>
+              <w:color w:val="0563C1"/>
+              <w:u w:val="single"/>
+            </w:rPr>
+            <w:tab/>
+          </w:r>
+          <w:r>
+            <w:rPr>
+              <w:color w:val="0563C1"/>
+              <w:u w:val="single"/>
+            </w:rPr>
+            <w:fldChar w:fldCharType="begin"/>
+          </w:r>
+          <w:r>
+            <w:rPr>
+              <w:color w:val="0563C1"/>
+              <w:u w:val="single"/>
+            </w:rPr>
+            <w:instrText xml:space="preserve"> PAGE </w:instrText>
+          </w:r>
+          <w:r>
+            <w:rPr>
+              <w:color w:val="0563C1"/>
+              <w:u w:val="single"/>
+            </w:rPr>
+            <w:fldChar w:fldCharType="separate"/>
+          </w:r>
+          <w:r>
+            <w:rPr>
+              <w:color w:val="0563C1"/>
+              <w:u w:val="single"/>
+            </w:rPr>
+            <w:t xml:space="preserve">5</w:t>
+          </w:r>
+          <w:r>
+            <w:rPr>
+              <w:color w:val="0563C1"/>
+              <w:u w:val="single"/>
+            </w:rPr>
+            <w:fldChar w:fldCharType="end"/>
+          </w:r>
+        </w:p>
+        <w:p>
+          <w:pPr>
+            <w:pStyle w:val="TOC3"/>
+            <w:tabs>
+              <w:tab w:val="right" w:leader="dot" w:pos="9360"/>
+            </w:tabs>
+            <w:rPr>
+              <w:color w:val="0563C1"/>
+              <w:u w:val="single"/>
+            </w:rPr>
+          </w:pPr>
+          <w:hyperlink w:anchor="step-1.1-check-what-you-already-have" w:history="1">
+            <w:r>
+              <w:rPr>
+                <w:color w:val="0563C1"/>
+                <w:u w:val="single"/>
+              </w:rPr>
+              <w:t xml:space="preserve">Step 1.1 — Check what you already have</w:t>
+            </w:r>
+          </w:hyperlink>
+          <w:r>
+            <w:rPr>
+              <w:color w:val="0563C1"/>
+              <w:u w:val="single"/>
+            </w:rPr>
+            <w:tab/>
+          </w:r>
+          <w:r>
+            <w:rPr>
+              <w:color w:val="0563C1"/>
+              <w:u w:val="single"/>
+            </w:rPr>
+            <w:fldChar w:fldCharType="begin"/>
+          </w:r>
+          <w:r>
+            <w:rPr>
+              <w:color w:val="0563C1"/>
+              <w:u w:val="single"/>
+            </w:rPr>
+            <w:instrText xml:space="preserve"> PAGE </w:instrText>
+          </w:r>
+          <w:r>
+            <w:rPr>
+              <w:color w:val="0563C1"/>
+              <w:u w:val="single"/>
+            </w:rPr>
+            <w:fldChar w:fldCharType="separate"/>
+          </w:r>
+          <w:r>
+            <w:rPr>
+              <w:color w:val="0563C1"/>
+              <w:u w:val="single"/>
+            </w:rPr>
+            <w:t xml:space="preserve">5</w:t>
+          </w:r>
+          <w:r>
+            <w:rPr>
+              <w:color w:val="0563C1"/>
+              <w:u w:val="single"/>
+            </w:rPr>
+            <w:fldChar w:fldCharType="end"/>
+          </w:r>
+        </w:p>
+        <w:p>
+          <w:pPr>
+            <w:pStyle w:val="TOC3"/>
+            <w:tabs>
+              <w:tab w:val="right" w:leader="dot" w:pos="9360"/>
+            </w:tabs>
+            <w:rPr>
+              <w:color w:val="0563C1"/>
+              <w:u w:val="single"/>
+            </w:rPr>
+          </w:pPr>
+          <w:hyperlink w:anchor="Xc5e1a8259f764a55d96f11dee0f84434ce87bab" w:history="1">
+            <w:r>
+              <w:rPr>
+                <w:color w:val="0563C1"/>
+                <w:u w:val="single"/>
+              </w:rPr>
+              <w:t xml:space="preserve">Step 1.2 — Install Node.js and npm (if missing)</w:t>
+            </w:r>
+          </w:hyperlink>
+          <w:r>
+            <w:rPr>
+              <w:color w:val="0563C1"/>
+              <w:u w:val="single"/>
+            </w:rPr>
+            <w:tab/>
+          </w:r>
+          <w:r>
+            <w:rPr>
+              <w:color w:val="0563C1"/>
+              <w:u w:val="single"/>
+            </w:rPr>
+            <w:fldChar w:fldCharType="begin"/>
+          </w:r>
+          <w:r>
+            <w:rPr>
+              <w:color w:val="0563C1"/>
+              <w:u w:val="single"/>
+            </w:rPr>
+            <w:instrText xml:space="preserve"> PAGE </w:instrText>
+          </w:r>
+          <w:r>
+            <w:rPr>
+              <w:color w:val="0563C1"/>
+              <w:u w:val="single"/>
+            </w:rPr>
+            <w:fldChar w:fldCharType="separate"/>
+          </w:r>
+          <w:r>
+            <w:rPr>
+              <w:color w:val="0563C1"/>
+              <w:u w:val="single"/>
+            </w:rPr>
+            <w:t xml:space="preserve">6</w:t>
+          </w:r>
+          <w:r>
+            <w:rPr>
+              <w:color w:val="0563C1"/>
+              <w:u w:val="single"/>
+            </w:rPr>
+            <w:fldChar w:fldCharType="end"/>
+          </w:r>
+        </w:p>
+        <w:p>
+          <w:pPr>
+            <w:pStyle w:val="TOC3"/>
+            <w:tabs>
+              <w:tab w:val="right" w:leader="dot" w:pos="9360"/>
+            </w:tabs>
+            <w:rPr>
+              <w:color w:val="0563C1"/>
+              <w:u w:val="single"/>
+            </w:rPr>
+          </w:pPr>
+          <w:hyperlink w:anchor="step-1.3-install-postgresql" w:history="1">
+            <w:r>
+              <w:rPr>
+                <w:color w:val="0563C1"/>
+                <w:u w:val="single"/>
+              </w:rPr>
+              <w:t xml:space="preserve">Step 1.3 — Install PostgreSQL</w:t>
+            </w:r>
+          </w:hyperlink>
+          <w:r>
+            <w:rPr>
+              <w:color w:val="0563C1"/>
+              <w:u w:val="single"/>
+            </w:rPr>
+            <w:tab/>
+          </w:r>
+          <w:r>
+            <w:rPr>
+              <w:color w:val="0563C1"/>
+              <w:u w:val="single"/>
+            </w:rPr>
+            <w:fldChar w:fldCharType="begin"/>
+          </w:r>
+          <w:r>
+            <w:rPr>
+              <w:color w:val="0563C1"/>
+              <w:u w:val="single"/>
+            </w:rPr>
+            <w:instrText xml:space="preserve"> PAGE </w:instrText>
+          </w:r>
+          <w:r>
+            <w:rPr>
+              <w:color w:val="0563C1"/>
+              <w:u w:val="single"/>
+            </w:rPr>
+            <w:fldChar w:fldCharType="separate"/>
+          </w:r>
+          <w:r>
+            <w:rPr>
+              <w:color w:val="0563C1"/>
+              <w:u w:val="single"/>
+            </w:rPr>
+            <w:t xml:space="preserve">6</w:t>
+          </w:r>
+          <w:r>
+            <w:rPr>
+              <w:color w:val="0563C1"/>
+              <w:u w:val="single"/>
+            </w:rPr>
+            <w:fldChar w:fldCharType="end"/>
+          </w:r>
+        </w:p>
+        <w:p>
+          <w:pPr>
+            <w:pStyle w:val="TOC3"/>
+            <w:tabs>
+              <w:tab w:val="right" w:leader="dot" w:pos="9360"/>
+            </w:tabs>
+            <w:rPr>
+              <w:color w:val="0563C1"/>
+              <w:u w:val="single"/>
+            </w:rPr>
+          </w:pPr>
+          <w:hyperlink w:anchor="step-1.4-install-semgrep" w:history="1">
+            <w:r>
+              <w:rPr>
+                <w:color w:val="0563C1"/>
+                <w:u w:val="single"/>
+              </w:rPr>
+              <w:t xml:space="preserve">Step 1.4 — Install semgrep</w:t>
+            </w:r>
+          </w:hyperlink>
+          <w:r>
+            <w:rPr>
+              <w:color w:val="0563C1"/>
+              <w:u w:val="single"/>
+            </w:rPr>
+            <w:tab/>
+          </w:r>
+          <w:r>
+            <w:rPr>
+              <w:color w:val="0563C1"/>
+              <w:u w:val="single"/>
+            </w:rPr>
+            <w:fldChar w:fldCharType="begin"/>
+          </w:r>
+          <w:r>
+            <w:rPr>
+              <w:color w:val="0563C1"/>
+              <w:u w:val="single"/>
+            </w:rPr>
+            <w:instrText xml:space="preserve"> PAGE </w:instrText>
+          </w:r>
+          <w:r>
+            <w:rPr>
+              <w:color w:val="0563C1"/>
+              <w:u w:val="single"/>
+            </w:rPr>
+            <w:fldChar w:fldCharType="separate"/>
+          </w:r>
+          <w:r>
+            <w:rPr>
+              <w:color w:val="0563C1"/>
+              <w:u w:val="single"/>
+            </w:rPr>
+            <w:t xml:space="preserve">7</w:t>
+          </w:r>
+          <w:r>
+            <w:rPr>
+              <w:color w:val="0563C1"/>
+              <w:u w:val="single"/>
+            </w:rPr>
+            <w:fldChar w:fldCharType="end"/>
+          </w:r>
+        </w:p>
+        <w:p>
+          <w:pPr>
+            <w:pStyle w:val="TOC3"/>
+            <w:tabs>
+              <w:tab w:val="right" w:leader="dot" w:pos="9360"/>
+            </w:tabs>
+            <w:rPr>
+              <w:color w:val="0563C1"/>
+              <w:u w:val="single"/>
+            </w:rPr>
+          </w:pPr>
+          <w:hyperlink w:anchor="step-1.5-install-gitleaks" w:history="1">
+            <w:r>
+              <w:rPr>
+                <w:color w:val="0563C1"/>
+                <w:u w:val="single"/>
+              </w:rPr>
+              <w:t xml:space="preserve">Step 1.5 — Install gitleaks</w:t>
+            </w:r>
+          </w:hyperlink>
+          <w:r>
+            <w:rPr>
+              <w:color w:val="0563C1"/>
+              <w:u w:val="single"/>
+            </w:rPr>
+            <w:tab/>
+          </w:r>
+          <w:r>
+            <w:rPr>
+              <w:color w:val="0563C1"/>
+              <w:u w:val="single"/>
+            </w:rPr>
+            <w:fldChar w:fldCharType="begin"/>
+          </w:r>
+          <w:r>
+            <w:rPr>
+              <w:color w:val="0563C1"/>
+              <w:u w:val="single"/>
+            </w:rPr>
+            <w:instrText xml:space="preserve"> PAGE </w:instrText>
+          </w:r>
+          <w:r>
+            <w:rPr>
+              <w:color w:val="0563C1"/>
+              <w:u w:val="single"/>
+            </w:rPr>
+            <w:fldChar w:fldCharType="separate"/>
+          </w:r>
+          <w:r>
+            <w:rPr>
+              <w:color w:val="0563C1"/>
+              <w:u w:val="single"/>
+            </w:rPr>
+            <w:t xml:space="preserve">7</w:t>
+          </w:r>
+          <w:r>
+            <w:rPr>
+              <w:color w:val="0563C1"/>
+              <w:u w:val="single"/>
+            </w:rPr>
+            <w:fldChar w:fldCharType="end"/>
+          </w:r>
+        </w:p>
+        <w:p>
+          <w:pPr>
+            <w:pStyle w:val="TOC3"/>
+            <w:tabs>
+              <w:tab w:val="right" w:leader="dot" w:pos="9360"/>
+            </w:tabs>
+            <w:rPr>
+              <w:color w:val="0563C1"/>
+              <w:u w:val="single"/>
+            </w:rPr>
+          </w:pPr>
+          <w:hyperlink w:anchor="step-1.6-double-check-everything" w:history="1">
+            <w:r>
+              <w:rPr>
+                <w:color w:val="0563C1"/>
+                <w:u w:val="single"/>
+              </w:rPr>
+              <w:t xml:space="preserve">Step 1.6 — Double-check everything</w:t>
+            </w:r>
+          </w:hyperlink>
+          <w:r>
+            <w:rPr>
+              <w:color w:val="0563C1"/>
+              <w:u w:val="single"/>
+            </w:rPr>
+            <w:tab/>
+          </w:r>
+          <w:r>
+            <w:rPr>
+              <w:color w:val="0563C1"/>
+              <w:u w:val="single"/>
+            </w:rPr>
+            <w:fldChar w:fldCharType="begin"/>
+          </w:r>
+          <w:r>
+            <w:rPr>
+              <w:color w:val="0563C1"/>
+              <w:u w:val="single"/>
+            </w:rPr>
+            <w:instrText xml:space="preserve"> PAGE </w:instrText>
+          </w:r>
+          <w:r>
+            <w:rPr>
+              <w:color w:val="0563C1"/>
+              <w:u w:val="single"/>
+            </w:rPr>
+            <w:fldChar w:fldCharType="separate"/>
+          </w:r>
+          <w:r>
+            <w:rPr>
+              <w:color w:val="0563C1"/>
+              <w:u w:val="single"/>
+            </w:rPr>
+            <w:t xml:space="preserve">8</w:t>
+          </w:r>
+          <w:r>
+            <w:rPr>
+              <w:color w:val="0563C1"/>
+              <w:u w:val="single"/>
+            </w:rPr>
+            <w:fldChar w:fldCharType="end"/>
+          </w:r>
+        </w:p>
+        <w:p>
+          <w:pPr>
+            <w:pStyle w:val="TOC2"/>
+            <w:tabs>
+              <w:tab w:val="right" w:leader="dot" w:pos="9360"/>
+            </w:tabs>
+            <w:rPr>
+              <w:color w:val="0563C1"/>
+              <w:u w:val="single"/>
+            </w:rPr>
+          </w:pPr>
+          <w:hyperlink w:anchor="Xbffd75115a50c8e7c1261befdf5c2d7ba454f1e" w:history="1">
+            <w:r>
+              <w:rPr>
+                <w:color w:val="0563C1"/>
+                <w:u w:val="single"/>
+              </w:rPr>
+              <w:t xml:space="preserve">Stage 2 — Start the database and get the app running</w:t>
+            </w:r>
+          </w:hyperlink>
+          <w:r>
+            <w:rPr>
+              <w:color w:val="0563C1"/>
+              <w:u w:val="single"/>
+            </w:rPr>
+            <w:tab/>
+          </w:r>
+          <w:r>
+            <w:rPr>
+              <w:color w:val="0563C1"/>
+              <w:u w:val="single"/>
+            </w:rPr>
+            <w:fldChar w:fldCharType="begin"/>
+          </w:r>
+          <w:r>
+            <w:rPr>
+              <w:color w:val="0563C1"/>
+              <w:u w:val="single"/>
+            </w:rPr>
+            <w:instrText xml:space="preserve"> PAGE </w:instrText>
+          </w:r>
+          <w:r>
+            <w:rPr>
+              <w:color w:val="0563C1"/>
+              <w:u w:val="single"/>
+            </w:rPr>
+            <w:fldChar w:fldCharType="separate"/>
+          </w:r>
+          <w:r>
+            <w:rPr>
+              <w:color w:val="0563C1"/>
+              <w:u w:val="single"/>
+            </w:rPr>
+            <w:t xml:space="preserve">8</w:t>
+          </w:r>
+          <w:r>
+            <w:rPr>
+              <w:color w:val="0563C1"/>
+              <w:u w:val="single"/>
+            </w:rPr>
+            <w:fldChar w:fldCharType="end"/>
+          </w:r>
+        </w:p>
+        <w:p>
+          <w:pPr>
+            <w:pStyle w:val="TOC3"/>
+            <w:tabs>
+              <w:tab w:val="right" w:leader="dot" w:pos="9360"/>
+            </w:tabs>
+            <w:rPr>
+              <w:color w:val="0563C1"/>
+              <w:u w:val="single"/>
+            </w:rPr>
+          </w:pPr>
+          <w:hyperlink w:anchor="step-2.1-start-postgresql" w:history="1">
+            <w:r>
+              <w:rPr>
+                <w:color w:val="0563C1"/>
+                <w:u w:val="single"/>
+              </w:rPr>
+              <w:t xml:space="preserve">Step 2.1 — Start PostgreSQL</w:t>
+            </w:r>
+          </w:hyperlink>
+          <w:r>
+            <w:rPr>
+              <w:color w:val="0563C1"/>
+              <w:u w:val="single"/>
+            </w:rPr>
+            <w:tab/>
+          </w:r>
+          <w:r>
+            <w:rPr>
+              <w:color w:val="0563C1"/>
+              <w:u w:val="single"/>
+            </w:rPr>
+            <w:fldChar w:fldCharType="begin"/>
+          </w:r>
+          <w:r>
+            <w:rPr>
+              <w:color w:val="0563C1"/>
+              <w:u w:val="single"/>
+            </w:rPr>
+            <w:instrText xml:space="preserve"> PAGE </w:instrText>
+          </w:r>
+          <w:r>
+            <w:rPr>
+              <w:color w:val="0563C1"/>
+              <w:u w:val="single"/>
+            </w:rPr>
+            <w:fldChar w:fldCharType="separate"/>
+          </w:r>
+          <w:r>
+            <w:rPr>
+              <w:color w:val="0563C1"/>
+              <w:u w:val="single"/>
+            </w:rPr>
+            <w:t xml:space="preserve">8</w:t>
+          </w:r>
+          <w:r>
+            <w:rPr>
+              <w:color w:val="0563C1"/>
+              <w:u w:val="single"/>
+            </w:rPr>
+            <w:fldChar w:fldCharType="end"/>
+          </w:r>
+        </w:p>
+        <w:p>
+          <w:pPr>
+            <w:pStyle w:val="TOC3"/>
+            <w:tabs>
+              <w:tab w:val="right" w:leader="dot" w:pos="9360"/>
+            </w:tabs>
+            <w:rPr>
+              <w:color w:val="0563C1"/>
+              <w:u w:val="single"/>
+            </w:rPr>
+          </w:pPr>
+          <w:hyperlink w:anchor="step-2.2-install-the-apps-dependencies" w:history="1">
+            <w:r>
+              <w:rPr>
+                <w:color w:val="0563C1"/>
+                <w:u w:val="single"/>
+              </w:rPr>
+              <w:t xml:space="preserve">Step 2.2 — Install the app’s dependencies</w:t>
+            </w:r>
+          </w:hyperlink>
+          <w:r>
+            <w:rPr>
+              <w:color w:val="0563C1"/>
+              <w:u w:val="single"/>
+            </w:rPr>
+            <w:tab/>
+          </w:r>
+          <w:r>
+            <w:rPr>
+              <w:color w:val="0563C1"/>
+              <w:u w:val="single"/>
+            </w:rPr>
+            <w:fldChar w:fldCharType="begin"/>
+          </w:r>
+          <w:r>
+            <w:rPr>
+              <w:color w:val="0563C1"/>
+              <w:u w:val="single"/>
+            </w:rPr>
+            <w:instrText xml:space="preserve"> PAGE </w:instrText>
+          </w:r>
+          <w:r>
+            <w:rPr>
+              <w:color w:val="0563C1"/>
+              <w:u w:val="single"/>
+            </w:rPr>
+            <w:fldChar w:fldCharType="separate"/>
+          </w:r>
+          <w:r>
+            <w:rPr>
+              <w:color w:val="0563C1"/>
+              <w:u w:val="single"/>
+            </w:rPr>
+            <w:t xml:space="preserve">9</w:t>
+          </w:r>
+          <w:r>
+            <w:rPr>
+              <w:color w:val="0563C1"/>
+              <w:u w:val="single"/>
+            </w:rPr>
+            <w:fldChar w:fldCharType="end"/>
+          </w:r>
+        </w:p>
+        <w:p>
+          <w:pPr>
+            <w:pStyle w:val="TOC3"/>
+            <w:tabs>
+              <w:tab w:val="right" w:leader="dot" w:pos="9360"/>
+            </w:tabs>
+            <w:rPr>
+              <w:color w:val="0563C1"/>
+              <w:u w:val="single"/>
+            </w:rPr>
+          </w:pPr>
+          <w:hyperlink w:anchor="step-2.3-create-the-apps-config-file" w:history="1">
+            <w:r>
+              <w:rPr>
+                <w:color w:val="0563C1"/>
+                <w:u w:val="single"/>
+              </w:rPr>
+              <w:t xml:space="preserve">Step 2.3 — Create the app’s config file</w:t>
+            </w:r>
+          </w:hyperlink>
+          <w:r>
+            <w:rPr>
+              <w:color w:val="0563C1"/>
+              <w:u w:val="single"/>
+            </w:rPr>
+            <w:tab/>
+          </w:r>
+          <w:r>
+            <w:rPr>
+              <w:color w:val="0563C1"/>
+              <w:u w:val="single"/>
+            </w:rPr>
+            <w:fldChar w:fldCharType="begin"/>
+          </w:r>
+          <w:r>
+            <w:rPr>
+              <w:color w:val="0563C1"/>
+              <w:u w:val="single"/>
+            </w:rPr>
+            <w:instrText xml:space="preserve"> PAGE </w:instrText>
+          </w:r>
+          <w:r>
+            <w:rPr>
+              <w:color w:val="0563C1"/>
+              <w:u w:val="single"/>
+            </w:rPr>
+            <w:fldChar w:fldCharType="separate"/>
+          </w:r>
+          <w:r>
+            <w:rPr>
+              <w:color w:val="0563C1"/>
+              <w:u w:val="single"/>
+            </w:rPr>
+            <w:t xml:space="preserve">10</w:t>
+          </w:r>
+          <w:r>
+            <w:rPr>
+              <w:color w:val="0563C1"/>
+              <w:u w:val="single"/>
+            </w:rPr>
+            <w:fldChar w:fldCharType="end"/>
+          </w:r>
+        </w:p>
+        <w:p>
+          <w:pPr>
+            <w:pStyle w:val="TOC3"/>
+            <w:tabs>
+              <w:tab w:val="right" w:leader="dot" w:pos="9360"/>
+            </w:tabs>
+            <w:rPr>
+              <w:color w:val="0563C1"/>
+              <w:u w:val="single"/>
+            </w:rPr>
+          </w:pPr>
+          <w:hyperlink w:anchor="X63c11b5102302e5e0d58547ab20763473e4709d" w:history="1">
+            <w:r>
+              <w:rPr>
+                <w:color w:val="0563C1"/>
+                <w:u w:val="single"/>
+              </w:rPr>
+              <w:t xml:space="preserve">Step 2.4 — Load the config into your terminal (important!)</w:t>
+            </w:r>
+          </w:hyperlink>
+          <w:r>
+            <w:rPr>
+              <w:color w:val="0563C1"/>
+              <w:u w:val="single"/>
+            </w:rPr>
+            <w:tab/>
+          </w:r>
+          <w:r>
+            <w:rPr>
+              <w:color w:val="0563C1"/>
+              <w:u w:val="single"/>
+            </w:rPr>
+            <w:fldChar w:fldCharType="begin"/>
+          </w:r>
+          <w:r>
+            <w:rPr>
+              <w:color w:val="0563C1"/>
+              <w:u w:val="single"/>
+            </w:rPr>
+            <w:instrText xml:space="preserve"> PAGE </w:instrText>
+          </w:r>
+          <w:r>
+            <w:rPr>
+              <w:color w:val="0563C1"/>
+              <w:u w:val="single"/>
+            </w:rPr>
+            <w:fldChar w:fldCharType="separate"/>
+          </w:r>
+          <w:r>
+            <w:rPr>
+              <w:color w:val="0563C1"/>
+              <w:u w:val="single"/>
+            </w:rPr>
+            <w:t xml:space="preserve">10</w:t>
+          </w:r>
+          <w:r>
+            <w:rPr>
+              <w:color w:val="0563C1"/>
+              <w:u w:val="single"/>
+            </w:rPr>
+            <w:fldChar w:fldCharType="end"/>
+          </w:r>
+        </w:p>
+        <w:p>
+          <w:pPr>
+            <w:pStyle w:val="TOC3"/>
+            <w:tabs>
+              <w:tab w:val="right" w:leader="dot" w:pos="9360"/>
+            </w:tabs>
+            <w:rPr>
+              <w:color w:val="0563C1"/>
+              <w:u w:val="single"/>
+            </w:rPr>
+          </w:pPr>
+          <w:hyperlink w:anchor="step-2.5-create-the-database-tables" w:history="1">
+            <w:r>
+              <w:rPr>
+                <w:color w:val="0563C1"/>
+                <w:u w:val="single"/>
+              </w:rPr>
+              <w:t xml:space="preserve">Step 2.5 — Create the database tables</w:t>
+            </w:r>
+          </w:hyperlink>
+          <w:r>
+            <w:rPr>
+              <w:color w:val="0563C1"/>
+              <w:u w:val="single"/>
+            </w:rPr>
+            <w:tab/>
+          </w:r>
+          <w:r>
+            <w:rPr>
+              <w:color w:val="0563C1"/>
+              <w:u w:val="single"/>
+            </w:rPr>
+            <w:fldChar w:fldCharType="begin"/>
+          </w:r>
+          <w:r>
+            <w:rPr>
+              <w:color w:val="0563C1"/>
+              <w:u w:val="single"/>
+            </w:rPr>
+            <w:instrText xml:space="preserve"> PAGE </w:instrText>
+          </w:r>
+          <w:r>
+            <w:rPr>
+              <w:color w:val="0563C1"/>
+              <w:u w:val="single"/>
+            </w:rPr>
+            <w:fldChar w:fldCharType="separate"/>
+          </w:r>
+          <w:r>
+            <w:rPr>
+              <w:color w:val="0563C1"/>
+              <w:u w:val="single"/>
+            </w:rPr>
+            <w:t xml:space="preserve">11</w:t>
+          </w:r>
+          <w:r>
+            <w:rPr>
+              <w:color w:val="0563C1"/>
+              <w:u w:val="single"/>
+            </w:rPr>
+            <w:fldChar w:fldCharType="end"/>
+          </w:r>
+        </w:p>
+        <w:p>
+          <w:pPr>
+            <w:pStyle w:val="TOC3"/>
+            <w:tabs>
+              <w:tab w:val="right" w:leader="dot" w:pos="9360"/>
+            </w:tabs>
+            <w:rPr>
+              <w:color w:val="0563C1"/>
+              <w:u w:val="single"/>
+            </w:rPr>
+          </w:pPr>
+          <w:hyperlink w:anchor="step-2.6-start-the-app" w:history="1">
+            <w:r>
+              <w:rPr>
+                <w:color w:val="0563C1"/>
+                <w:u w:val="single"/>
+              </w:rPr>
+              <w:t xml:space="preserve">Step 2.6 — Start the app</w:t>
+            </w:r>
+          </w:hyperlink>
+          <w:r>
+            <w:rPr>
+              <w:color w:val="0563C1"/>
+              <w:u w:val="single"/>
+            </w:rPr>
+            <w:tab/>
+          </w:r>
+          <w:r>
+            <w:rPr>
+              <w:color w:val="0563C1"/>
+              <w:u w:val="single"/>
+            </w:rPr>
+            <w:fldChar w:fldCharType="begin"/>
+          </w:r>
+          <w:r>
+            <w:rPr>
+              <w:color w:val="0563C1"/>
+              <w:u w:val="single"/>
+            </w:rPr>
+            <w:instrText xml:space="preserve"> PAGE </w:instrText>
+          </w:r>
+          <w:r>
+            <w:rPr>
+              <w:color w:val="0563C1"/>
+              <w:u w:val="single"/>
+            </w:rPr>
+            <w:fldChar w:fldCharType="separate"/>
+          </w:r>
+          <w:r>
+            <w:rPr>
+              <w:color w:val="0563C1"/>
+              <w:u w:val="single"/>
+            </w:rPr>
+            <w:t xml:space="preserve">11</w:t>
+          </w:r>
+          <w:r>
+            <w:rPr>
+              <w:color w:val="0563C1"/>
+              <w:u w:val="single"/>
+            </w:rPr>
+            <w:fldChar w:fldCharType="end"/>
+          </w:r>
+        </w:p>
+        <w:p>
+          <w:pPr>
+            <w:pStyle w:val="TOC2"/>
+            <w:tabs>
+              <w:tab w:val="right" w:leader="dot" w:pos="9360"/>
+            </w:tabs>
+            <w:rPr>
+              <w:color w:val="0563C1"/>
+              <w:u w:val="single"/>
+            </w:rPr>
+          </w:pPr>
+          <w:hyperlink w:anchor="X6938bd7ff52449386e7b092ba56a75a75d78d3e" w:history="1">
+            <w:r>
+              <w:rPr>
+                <w:color w:val="0563C1"/>
+                <w:u w:val="single"/>
+              </w:rPr>
+              <w:t xml:space="preserve">Stage 3 — Smoke test: prove the app actually works</w:t>
+            </w:r>
+          </w:hyperlink>
+          <w:r>
+            <w:rPr>
+              <w:color w:val="0563C1"/>
+              <w:u w:val="single"/>
+            </w:rPr>
+            <w:tab/>
+          </w:r>
+          <w:r>
+            <w:rPr>
+              <w:color w:val="0563C1"/>
+              <w:u w:val="single"/>
+            </w:rPr>
+            <w:fldChar w:fldCharType="begin"/>
+          </w:r>
+          <w:r>
+            <w:rPr>
+              <w:color w:val="0563C1"/>
+              <w:u w:val="single"/>
+            </w:rPr>
+            <w:instrText xml:space="preserve"> PAGE </w:instrText>
+          </w:r>
+          <w:r>
+            <w:rPr>
+              <w:color w:val="0563C1"/>
+              <w:u w:val="single"/>
+            </w:rPr>
+            <w:fldChar w:fldCharType="separate"/>
+          </w:r>
+          <w:r>
+            <w:rPr>
+              <w:color w:val="0563C1"/>
+              <w:u w:val="single"/>
+            </w:rPr>
+            <w:t xml:space="preserve">11</w:t>
+          </w:r>
+          <w:r>
+            <w:rPr>
+              <w:color w:val="0563C1"/>
+              <w:u w:val="single"/>
+            </w:rPr>
+            <w:fldChar w:fldCharType="end"/>
+          </w:r>
+        </w:p>
+        <w:p>
+          <w:pPr>
+            <w:pStyle w:val="TOC3"/>
+            <w:tabs>
+              <w:tab w:val="right" w:leader="dot" w:pos="9360"/>
+            </w:tabs>
+            <w:rPr>
+              <w:color w:val="0563C1"/>
+              <w:u w:val="single"/>
+            </w:rPr>
+          </w:pPr>
+          <w:hyperlink w:anchor="step-3.1-health-check" w:history="1">
+            <w:r>
+              <w:rPr>
+                <w:color w:val="0563C1"/>
+                <w:u w:val="single"/>
+              </w:rPr>
+              <w:t xml:space="preserve">Step 3.1 — Health check</w:t>
+            </w:r>
+          </w:hyperlink>
+          <w:r>
+            <w:rPr>
+              <w:color w:val="0563C1"/>
+              <w:u w:val="single"/>
+            </w:rPr>
+            <w:tab/>
+          </w:r>
+          <w:r>
+            <w:rPr>
+              <w:color w:val="0563C1"/>
+              <w:u w:val="single"/>
+            </w:rPr>
+            <w:fldChar w:fldCharType="begin"/>
+          </w:r>
+          <w:r>
+            <w:rPr>
+              <w:color w:val="0563C1"/>
+              <w:u w:val="single"/>
+            </w:rPr>
+            <w:instrText xml:space="preserve"> PAGE </w:instrText>
+          </w:r>
+          <w:r>
+            <w:rPr>
+              <w:color w:val="0563C1"/>
+              <w:u w:val="single"/>
+            </w:rPr>
+            <w:fldChar w:fldCharType="separate"/>
+          </w:r>
+          <w:r>
+            <w:rPr>
+              <w:color w:val="0563C1"/>
+              <w:u w:val="single"/>
+            </w:rPr>
+            <w:t xml:space="preserve">11</w:t>
+          </w:r>
+          <w:r>
+            <w:rPr>
+              <w:color w:val="0563C1"/>
+              <w:u w:val="single"/>
+            </w:rPr>
+            <w:fldChar w:fldCharType="end"/>
+          </w:r>
+        </w:p>
+        <w:p>
+          <w:pPr>
+            <w:pStyle w:val="TOC3"/>
+            <w:tabs>
+              <w:tab w:val="right" w:leader="dot" w:pos="9360"/>
+            </w:tabs>
+            <w:rPr>
+              <w:color w:val="0563C1"/>
+              <w:u w:val="single"/>
+            </w:rPr>
+          </w:pPr>
+          <w:hyperlink w:anchor="step-3.2-create-a-document" w:history="1">
+            <w:r>
+              <w:rPr>
+                <w:color w:val="0563C1"/>
+                <w:u w:val="single"/>
+              </w:rPr>
+              <w:t xml:space="preserve">Step 3.2 — Create a document</w:t>
+            </w:r>
+          </w:hyperlink>
+          <w:r>
+            <w:rPr>
+              <w:color w:val="0563C1"/>
+              <w:u w:val="single"/>
+            </w:rPr>
+            <w:tab/>
+          </w:r>
+          <w:r>
+            <w:rPr>
+              <w:color w:val="0563C1"/>
+              <w:u w:val="single"/>
+            </w:rPr>
+            <w:fldChar w:fldCharType="begin"/>
+          </w:r>
+          <w:r>
+            <w:rPr>
+              <w:color w:val="0563C1"/>
+              <w:u w:val="single"/>
+            </w:rPr>
+            <w:instrText xml:space="preserve"> PAGE </w:instrText>
+          </w:r>
+          <w:r>
+            <w:rPr>
+              <w:color w:val="0563C1"/>
+              <w:u w:val="single"/>
+            </w:rPr>
+            <w:fldChar w:fldCharType="separate"/>
+          </w:r>
+          <w:r>
+            <w:rPr>
+              <w:color w:val="0563C1"/>
+              <w:u w:val="single"/>
+            </w:rPr>
+            <w:t xml:space="preserve">12</w:t>
+          </w:r>
+          <w:r>
+            <w:rPr>
+              <w:color w:val="0563C1"/>
+              <w:u w:val="single"/>
+            </w:rPr>
+            <w:fldChar w:fldCharType="end"/>
+          </w:r>
+        </w:p>
+        <w:p>
+          <w:pPr>
+            <w:pStyle w:val="TOC3"/>
+            <w:tabs>
+              <w:tab w:val="right" w:leader="dot" w:pos="9360"/>
+            </w:tabs>
+            <w:rPr>
+              <w:color w:val="0563C1"/>
+              <w:u w:val="single"/>
+            </w:rPr>
+          </w:pPr>
+          <w:hyperlink w:anchor="step-3.3-fetch-the-document-back" w:history="1">
+            <w:r>
+              <w:rPr>
+                <w:color w:val="0563C1"/>
+                <w:u w:val="single"/>
+              </w:rPr>
+              <w:t xml:space="preserve">Step 3.3 — Fetch the document back</w:t>
+            </w:r>
+          </w:hyperlink>
+          <w:r>
+            <w:rPr>
+              <w:color w:val="0563C1"/>
+              <w:u w:val="single"/>
+            </w:rPr>
+            <w:tab/>
+          </w:r>
+          <w:r>
+            <w:rPr>
+              <w:color w:val="0563C1"/>
+              <w:u w:val="single"/>
+            </w:rPr>
+            <w:fldChar w:fldCharType="begin"/>
+          </w:r>
+          <w:r>
+            <w:rPr>
+              <w:color w:val="0563C1"/>
+              <w:u w:val="single"/>
+            </w:rPr>
+            <w:instrText xml:space="preserve"> PAGE </w:instrText>
+          </w:r>
+          <w:r>
+            <w:rPr>
+              <w:color w:val="0563C1"/>
+              <w:u w:val="single"/>
+            </w:rPr>
+            <w:fldChar w:fldCharType="separate"/>
+          </w:r>
+          <w:r>
+            <w:rPr>
+              <w:color w:val="0563C1"/>
+              <w:u w:val="single"/>
+            </w:rPr>
+            <w:t xml:space="preserve">12</w:t>
+          </w:r>
+          <w:r>
+            <w:rPr>
+              <w:color w:val="0563C1"/>
+              <w:u w:val="single"/>
+            </w:rPr>
+            <w:fldChar w:fldCharType="end"/>
+          </w:r>
+        </w:p>
+        <w:p>
+          <w:pPr>
+            <w:pStyle w:val="TOC3"/>
+            <w:tabs>
+              <w:tab w:val="right" w:leader="dot" w:pos="9360"/>
+            </w:tabs>
+            <w:rPr>
+              <w:color w:val="0563C1"/>
+              <w:u w:val="single"/>
+            </w:rPr>
+          </w:pPr>
+          <w:hyperlink w:anchor="X3a77e3fd24e78d9be21428913e6246afc8e6c80" w:history="1">
+            <w:r>
+              <w:rPr>
+                <w:color w:val="0563C1"/>
+                <w:u w:val="single"/>
+              </w:rPr>
+              <w:t xml:space="preserve">Step 3.4 — Render the document as an HTML page</w:t>
+            </w:r>
+          </w:hyperlink>
+          <w:r>
+            <w:rPr>
+              <w:color w:val="0563C1"/>
+              <w:u w:val="single"/>
+            </w:rPr>
+            <w:tab/>
+          </w:r>
+          <w:r>
+            <w:rPr>
+              <w:color w:val="0563C1"/>
+              <w:u w:val="single"/>
+            </w:rPr>
+            <w:fldChar w:fldCharType="begin"/>
+          </w:r>
+          <w:r>
+            <w:rPr>
+              <w:color w:val="0563C1"/>
+              <w:u w:val="single"/>
+            </w:rPr>
+            <w:instrText xml:space="preserve"> PAGE </w:instrText>
+          </w:r>
+          <w:r>
+            <w:rPr>
+              <w:color w:val="0563C1"/>
+              <w:u w:val="single"/>
+            </w:rPr>
+            <w:fldChar w:fldCharType="separate"/>
+          </w:r>
+          <w:r>
+            <w:rPr>
+              <w:color w:val="0563C1"/>
+              <w:u w:val="single"/>
+            </w:rPr>
+            <w:t xml:space="preserve">13</w:t>
+          </w:r>
+          <w:r>
+            <w:rPr>
+              <w:color w:val="0563C1"/>
+              <w:u w:val="single"/>
+            </w:rPr>
+            <w:fldChar w:fldCharType="end"/>
+          </w:r>
+        </w:p>
+        <w:p>
+          <w:pPr>
+            <w:pStyle w:val="TOC3"/>
+            <w:tabs>
+              <w:tab w:val="right" w:leader="dot" w:pos="9360"/>
+            </w:tabs>
+            <w:rPr>
+              <w:color w:val="0563C1"/>
+              <w:u w:val="single"/>
+            </w:rPr>
+          </w:pPr>
+          <w:hyperlink w:anchor="step-3.5-search-for-a-document" w:history="1">
+            <w:r>
+              <w:rPr>
+                <w:color w:val="0563C1"/>
+                <w:u w:val="single"/>
+              </w:rPr>
+              <w:t xml:space="preserve">Step 3.5 — Search for a document</w:t>
+            </w:r>
+          </w:hyperlink>
+          <w:r>
+            <w:rPr>
+              <w:color w:val="0563C1"/>
+              <w:u w:val="single"/>
+            </w:rPr>
+            <w:tab/>
+          </w:r>
+          <w:r>
+            <w:rPr>
+              <w:color w:val="0563C1"/>
+              <w:u w:val="single"/>
+            </w:rPr>
+            <w:fldChar w:fldCharType="begin"/>
+          </w:r>
+          <w:r>
+            <w:rPr>
+              <w:color w:val="0563C1"/>
+              <w:u w:val="single"/>
+            </w:rPr>
+            <w:instrText xml:space="preserve"> PAGE </w:instrText>
+          </w:r>
+          <w:r>
+            <w:rPr>
+              <w:color w:val="0563C1"/>
+              <w:u w:val="single"/>
+            </w:rPr>
+            <w:fldChar w:fldCharType="separate"/>
+          </w:r>
+          <w:r>
+            <w:rPr>
+              <w:color w:val="0563C1"/>
+              <w:u w:val="single"/>
+            </w:rPr>
+            <w:t xml:space="preserve">13</w:t>
+          </w:r>
+          <w:r>
+            <w:rPr>
+              <w:color w:val="0563C1"/>
+              <w:u w:val="single"/>
+            </w:rPr>
+            <w:fldChar w:fldCharType="end"/>
+          </w:r>
+        </w:p>
+        <w:p>
+          <w:pPr>
+            <w:pStyle w:val="TOC2"/>
+            <w:tabs>
+              <w:tab w:val="right" w:leader="dot" w:pos="9360"/>
+            </w:tabs>
+            <w:rPr>
+              <w:color w:val="0563C1"/>
+              <w:u w:val="single"/>
+            </w:rPr>
+          </w:pPr>
+          <w:hyperlink w:anchor="X35b402e18dbcb50f1b41b5496a0e638318561bd" w:history="1">
+            <w:r>
+              <w:rPr>
+                <w:color w:val="0563C1"/>
+                <w:u w:val="single"/>
+              </w:rPr>
+              <w:t xml:space="preserve">Stage 4 — SAST scan with the default rulesets</w:t>
+            </w:r>
+          </w:hyperlink>
+          <w:r>
+            <w:rPr>
+              <w:color w:val="0563C1"/>
+              <w:u w:val="single"/>
+            </w:rPr>
+            <w:tab/>
+          </w:r>
+          <w:r>
+            <w:rPr>
+              <w:color w:val="0563C1"/>
+              <w:u w:val="single"/>
+            </w:rPr>
+            <w:fldChar w:fldCharType="begin"/>
+          </w:r>
+          <w:r>
+            <w:rPr>
+              <w:color w:val="0563C1"/>
+              <w:u w:val="single"/>
+            </w:rPr>
+            <w:instrText xml:space="preserve"> PAGE </w:instrText>
+          </w:r>
+          <w:r>
+            <w:rPr>
+              <w:color w:val="0563C1"/>
+              <w:u w:val="single"/>
+            </w:rPr>
+            <w:fldChar w:fldCharType="separate"/>
+          </w:r>
+          <w:r>
+            <w:rPr>
+              <w:color w:val="0563C1"/>
+              <w:u w:val="single"/>
+            </w:rPr>
+            <w:t xml:space="preserve">13</w:t>
+          </w:r>
+          <w:r>
+            <w:rPr>
+              <w:color w:val="0563C1"/>
+              <w:u w:val="single"/>
+            </w:rPr>
+            <w:fldChar w:fldCharType="end"/>
+          </w:r>
+        </w:p>
+        <w:p>
+          <w:pPr>
+            <w:pStyle w:val="TOC3"/>
+            <w:tabs>
+              <w:tab w:val="right" w:leader="dot" w:pos="9360"/>
+            </w:tabs>
+            <w:rPr>
+              <w:color w:val="0563C1"/>
+              <w:u w:val="single"/>
+            </w:rPr>
+          </w:pPr>
+          <w:hyperlink w:anchor="X841b7e4618501182579013fdba2ad21967bf2ed" w:history="1">
+            <w:r>
+              <w:rPr>
+                <w:color w:val="0563C1"/>
+                <w:u w:val="single"/>
+              </w:rPr>
+              <w:t xml:space="preserve">Step 4.1 — Run semgrep with the default rules</w:t>
+            </w:r>
+          </w:hyperlink>
+          <w:r>
+            <w:rPr>
+              <w:color w:val="0563C1"/>
+              <w:u w:val="single"/>
+            </w:rPr>
+            <w:tab/>
+          </w:r>
+          <w:r>
+            <w:rPr>
+              <w:color w:val="0563C1"/>
+              <w:u w:val="single"/>
+            </w:rPr>
+            <w:fldChar w:fldCharType="begin"/>
+          </w:r>
+          <w:r>
+            <w:rPr>
+              <w:color w:val="0563C1"/>
+              <w:u w:val="single"/>
+            </w:rPr>
+            <w:instrText xml:space="preserve"> PAGE </w:instrText>
+          </w:r>
+          <w:r>
+            <w:rPr>
+              <w:color w:val="0563C1"/>
+              <w:u w:val="single"/>
+            </w:rPr>
+            <w:fldChar w:fldCharType="separate"/>
+          </w:r>
+          <w:r>
+            <w:rPr>
+              <w:color w:val="0563C1"/>
+              <w:u w:val="single"/>
+            </w:rPr>
+            <w:t xml:space="preserve">13</w:t>
+          </w:r>
+          <w:r>
+            <w:rPr>
+              <w:color w:val="0563C1"/>
+              <w:u w:val="single"/>
+            </w:rPr>
+            <w:fldChar w:fldCharType="end"/>
+          </w:r>
+        </w:p>
+        <w:p>
+          <w:pPr>
+            <w:pStyle w:val="TOC2"/>
+            <w:tabs>
+              <w:tab w:val="right" w:leader="dot" w:pos="9360"/>
+            </w:tabs>
+            <w:rPr>
+              <w:color w:val="0563C1"/>
+              <w:u w:val="single"/>
+            </w:rPr>
+          </w:pPr>
+          <w:hyperlink w:anchor="stage-5-confirm-the-xss-finding-by-hand" w:history="1">
+            <w:r>
+              <w:rPr>
+                <w:color w:val="0563C1"/>
+                <w:u w:val="single"/>
+              </w:rPr>
+              <w:t xml:space="preserve">Stage 5 — Confirm the XSS finding by hand</w:t>
+            </w:r>
+          </w:hyperlink>
+          <w:r>
+            <w:rPr>
+              <w:color w:val="0563C1"/>
+              <w:u w:val="single"/>
+            </w:rPr>
+            <w:tab/>
+          </w:r>
+          <w:r>
+            <w:rPr>
+              <w:color w:val="0563C1"/>
+              <w:u w:val="single"/>
+            </w:rPr>
+            <w:fldChar w:fldCharType="begin"/>
+          </w:r>
+          <w:r>
+            <w:rPr>
+              <w:color w:val="0563C1"/>
+              <w:u w:val="single"/>
+            </w:rPr>
+            <w:instrText xml:space="preserve"> PAGE </w:instrText>
+          </w:r>
+          <w:r>
+            <w:rPr>
+              <w:color w:val="0563C1"/>
+              <w:u w:val="single"/>
+            </w:rPr>
+            <w:fldChar w:fldCharType="separate"/>
+          </w:r>
+          <w:r>
+            <w:rPr>
+              <w:color w:val="0563C1"/>
+              <w:u w:val="single"/>
+            </w:rPr>
+            <w:t xml:space="preserve">16</w:t>
+          </w:r>
+          <w:r>
+            <w:rPr>
+              <w:color w:val="0563C1"/>
+              <w:u w:val="single"/>
+            </w:rPr>
+            <w:fldChar w:fldCharType="end"/>
+          </w:r>
+        </w:p>
+        <w:p>
+          <w:pPr>
+            <w:pStyle w:val="TOC3"/>
+            <w:tabs>
+              <w:tab w:val="right" w:leader="dot" w:pos="9360"/>
+            </w:tabs>
+            <w:rPr>
+              <w:color w:val="0563C1"/>
+              <w:u w:val="single"/>
+            </w:rPr>
+          </w:pPr>
+          <w:hyperlink w:anchor="X9e9b455a038f2fd37166de8de23934f27e7811b" w:history="1">
+            <w:r>
+              <w:rPr>
+                <w:color w:val="0563C1"/>
+                <w:u w:val="single"/>
+              </w:rPr>
+              <w:t xml:space="preserve">Step 5.1 — Create a document containing a script tag</w:t>
+            </w:r>
+          </w:hyperlink>
+          <w:r>
+            <w:rPr>
+              <w:color w:val="0563C1"/>
+              <w:u w:val="single"/>
+            </w:rPr>
+            <w:tab/>
+          </w:r>
+          <w:r>
+            <w:rPr>
+              <w:color w:val="0563C1"/>
+              <w:u w:val="single"/>
+            </w:rPr>
+            <w:fldChar w:fldCharType="begin"/>
+          </w:r>
+          <w:r>
+            <w:rPr>
+              <w:color w:val="0563C1"/>
+              <w:u w:val="single"/>
+            </w:rPr>
+            <w:instrText xml:space="preserve"> PAGE </w:instrText>
+          </w:r>
+          <w:r>
+            <w:rPr>
+              <w:color w:val="0563C1"/>
+              <w:u w:val="single"/>
+            </w:rPr>
+            <w:fldChar w:fldCharType="separate"/>
+          </w:r>
+          <w:r>
+            <w:rPr>
+              <w:color w:val="0563C1"/>
+              <w:u w:val="single"/>
+            </w:rPr>
+            <w:t xml:space="preserve">16</w:t>
+          </w:r>
+          <w:r>
+            <w:rPr>
+              <w:color w:val="0563C1"/>
+              <w:u w:val="single"/>
+            </w:rPr>
+            <w:fldChar w:fldCharType="end"/>
+          </w:r>
+        </w:p>
+        <w:p>
+          <w:pPr>
+            <w:pStyle w:val="TOC3"/>
+            <w:tabs>
+              <w:tab w:val="right" w:leader="dot" w:pos="9360"/>
+            </w:tabs>
+            <w:rPr>
+              <w:color w:val="0563C1"/>
+              <w:u w:val="single"/>
+            </w:rPr>
+          </w:pPr>
+          <w:hyperlink w:anchor="step-5.2-render-it" w:history="1">
+            <w:r>
+              <w:rPr>
+                <w:color w:val="0563C1"/>
+                <w:u w:val="single"/>
+              </w:rPr>
+              <w:t xml:space="preserve">Step 5.2 — Render it</w:t>
+            </w:r>
+          </w:hyperlink>
+          <w:r>
+            <w:rPr>
+              <w:color w:val="0563C1"/>
+              <w:u w:val="single"/>
+            </w:rPr>
+            <w:tab/>
+          </w:r>
+          <w:r>
+            <w:rPr>
+              <w:color w:val="0563C1"/>
+              <w:u w:val="single"/>
+            </w:rPr>
+            <w:fldChar w:fldCharType="begin"/>
+          </w:r>
+          <w:r>
+            <w:rPr>
+              <w:color w:val="0563C1"/>
+              <w:u w:val="single"/>
+            </w:rPr>
+            <w:instrText xml:space="preserve"> PAGE </w:instrText>
+          </w:r>
+          <w:r>
+            <w:rPr>
+              <w:color w:val="0563C1"/>
+              <w:u w:val="single"/>
+            </w:rPr>
+            <w:fldChar w:fldCharType="separate"/>
+          </w:r>
+          <w:r>
+            <w:rPr>
+              <w:color w:val="0563C1"/>
+              <w:u w:val="single"/>
+            </w:rPr>
+            <w:t xml:space="preserve">16</w:t>
+          </w:r>
+          <w:r>
+            <w:rPr>
+              <w:color w:val="0563C1"/>
+              <w:u w:val="single"/>
+            </w:rPr>
+            <w:fldChar w:fldCharType="end"/>
+          </w:r>
+        </w:p>
+        <w:p>
+          <w:pPr>
+            <w:pStyle w:val="TOC2"/>
+            <w:tabs>
+              <w:tab w:val="right" w:leader="dot" w:pos="9360"/>
+            </w:tabs>
+            <w:rPr>
+              <w:color w:val="0563C1"/>
+              <w:u w:val="single"/>
+            </w:rPr>
+          </w:pPr>
+          <w:hyperlink w:anchor="X459cfa841339baf7f473b9cc117fd0332d7fc93" w:history="1">
+            <w:r>
+              <w:rPr>
+                <w:color w:val="0563C1"/>
+                <w:u w:val="single"/>
+              </w:rPr>
+              <w:t xml:space="preserve">Stage 6 — The custom SAST rule (the part that separates this from a tutorial)</w:t>
+            </w:r>
+          </w:hyperlink>
+          <w:r>
+            <w:rPr>
+              <w:color w:val="0563C1"/>
+              <w:u w:val="single"/>
+            </w:rPr>
+            <w:tab/>
+          </w:r>
+          <w:r>
+            <w:rPr>
+              <w:color w:val="0563C1"/>
+              <w:u w:val="single"/>
+            </w:rPr>
+            <w:fldChar w:fldCharType="begin"/>
+          </w:r>
+          <w:r>
+            <w:rPr>
+              <w:color w:val="0563C1"/>
+              <w:u w:val="single"/>
+            </w:rPr>
+            <w:instrText xml:space="preserve"> PAGE </w:instrText>
+          </w:r>
+          <w:r>
+            <w:rPr>
+              <w:color w:val="0563C1"/>
+              <w:u w:val="single"/>
+            </w:rPr>
+            <w:fldChar w:fldCharType="separate"/>
+          </w:r>
+          <w:r>
+            <w:rPr>
+              <w:color w:val="0563C1"/>
+              <w:u w:val="single"/>
+            </w:rPr>
+            <w:t xml:space="preserve">16</w:t>
+          </w:r>
+          <w:r>
+            <w:rPr>
+              <w:color w:val="0563C1"/>
+              <w:u w:val="single"/>
+            </w:rPr>
+            <w:fldChar w:fldCharType="end"/>
+          </w:r>
+        </w:p>
+        <w:p>
+          <w:pPr>
+            <w:pStyle w:val="TOC3"/>
+            <w:tabs>
+              <w:tab w:val="right" w:leader="dot" w:pos="9360"/>
+            </w:tabs>
+            <w:rPr>
+              <w:color w:val="0563C1"/>
+              <w:u w:val="single"/>
+            </w:rPr>
+          </w:pPr>
+          <w:hyperlink w:anchor="step-6.1-the-problem-in-plain-words" w:history="1">
+            <w:r>
+              <w:rPr>
+                <w:color w:val="0563C1"/>
+                <w:u w:val="single"/>
+              </w:rPr>
+              <w:t xml:space="preserve">Step 6.1 — The problem, in plain words</w:t>
+            </w:r>
+          </w:hyperlink>
+          <w:r>
+            <w:rPr>
+              <w:color w:val="0563C1"/>
+              <w:u w:val="single"/>
+            </w:rPr>
+            <w:tab/>
+          </w:r>
+          <w:r>
+            <w:rPr>
+              <w:color w:val="0563C1"/>
+              <w:u w:val="single"/>
+            </w:rPr>
+            <w:fldChar w:fldCharType="begin"/>
+          </w:r>
+          <w:r>
+            <w:rPr>
+              <w:color w:val="0563C1"/>
+              <w:u w:val="single"/>
+            </w:rPr>
+            <w:instrText xml:space="preserve"> PAGE </w:instrText>
+          </w:r>
+          <w:r>
+            <w:rPr>
+              <w:color w:val="0563C1"/>
+              <w:u w:val="single"/>
+            </w:rPr>
+            <w:fldChar w:fldCharType="separate"/>
+          </w:r>
+          <w:r>
+            <w:rPr>
+              <w:color w:val="0563C1"/>
+              <w:u w:val="single"/>
+            </w:rPr>
+            <w:t xml:space="preserve">16</w:t>
+          </w:r>
+          <w:r>
+            <w:rPr>
+              <w:color w:val="0563C1"/>
+              <w:u w:val="single"/>
+            </w:rPr>
+            <w:fldChar w:fldCharType="end"/>
+          </w:r>
+        </w:p>
+        <w:p>
+          <w:pPr>
+            <w:pStyle w:val="TOC3"/>
+            <w:tabs>
+              <w:tab w:val="right" w:leader="dot" w:pos="9360"/>
+            </w:tabs>
+            <w:rPr>
+              <w:color w:val="0563C1"/>
+              <w:u w:val="single"/>
+            </w:rPr>
+          </w:pPr>
+          <w:hyperlink w:anchor="step-6.2-the-rule" w:history="1">
+            <w:r>
+              <w:rPr>
+                <w:color w:val="0563C1"/>
+                <w:u w:val="single"/>
+              </w:rPr>
+              <w:t xml:space="preserve">Step 6.2 — The rule</w:t>
+            </w:r>
+          </w:hyperlink>
+          <w:r>
+            <w:rPr>
+              <w:color w:val="0563C1"/>
+              <w:u w:val="single"/>
+            </w:rPr>
+            <w:tab/>
+          </w:r>
+          <w:r>
+            <w:rPr>
+              <w:color w:val="0563C1"/>
+              <w:u w:val="single"/>
+            </w:rPr>
+            <w:fldChar w:fldCharType="begin"/>
+          </w:r>
+          <w:r>
+            <w:rPr>
+              <w:color w:val="0563C1"/>
+              <w:u w:val="single"/>
+            </w:rPr>
+            <w:instrText xml:space="preserve"> PAGE </w:instrText>
+          </w:r>
+          <w:r>
+            <w:rPr>
+              <w:color w:val="0563C1"/>
+              <w:u w:val="single"/>
+            </w:rPr>
+            <w:fldChar w:fldCharType="separate"/>
+          </w:r>
+          <w:r>
+            <w:rPr>
+              <w:color w:val="0563C1"/>
+              <w:u w:val="single"/>
+            </w:rPr>
+            <w:t xml:space="preserve">17</w:t>
+          </w:r>
+          <w:r>
+            <w:rPr>
+              <w:color w:val="0563C1"/>
+              <w:u w:val="single"/>
+            </w:rPr>
+            <w:fldChar w:fldCharType="end"/>
+          </w:r>
+        </w:p>
+        <w:p>
+          <w:pPr>
+            <w:pStyle w:val="TOC3"/>
+            <w:tabs>
+              <w:tab w:val="right" w:leader="dot" w:pos="9360"/>
+            </w:tabs>
+            <w:rPr>
+              <w:color w:val="0563C1"/>
+              <w:u w:val="single"/>
+            </w:rPr>
+          </w:pPr>
+          <w:hyperlink w:anchor="step-6.3-run-the-rule-against-the-app" w:history="1">
+            <w:r>
+              <w:rPr>
+                <w:color w:val="0563C1"/>
+                <w:u w:val="single"/>
+              </w:rPr>
+              <w:t xml:space="preserve">Step 6.3 — Run the rule against the app</w:t>
+            </w:r>
+          </w:hyperlink>
+          <w:r>
+            <w:rPr>
+              <w:color w:val="0563C1"/>
+              <w:u w:val="single"/>
+            </w:rPr>
+            <w:tab/>
+          </w:r>
+          <w:r>
+            <w:rPr>
+              <w:color w:val="0563C1"/>
+              <w:u w:val="single"/>
+            </w:rPr>
+            <w:fldChar w:fldCharType="begin"/>
+          </w:r>
+          <w:r>
+            <w:rPr>
+              <w:color w:val="0563C1"/>
+              <w:u w:val="single"/>
+            </w:rPr>
+            <w:instrText xml:space="preserve"> PAGE </w:instrText>
+          </w:r>
+          <w:r>
+            <w:rPr>
+              <w:color w:val="0563C1"/>
+              <w:u w:val="single"/>
+            </w:rPr>
+            <w:fldChar w:fldCharType="separate"/>
+          </w:r>
+          <w:r>
+            <w:rPr>
+              <w:color w:val="0563C1"/>
+              <w:u w:val="single"/>
+            </w:rPr>
+            <w:t xml:space="preserve">17</w:t>
+          </w:r>
+          <w:r>
+            <w:rPr>
+              <w:color w:val="0563C1"/>
+              <w:u w:val="single"/>
+            </w:rPr>
+            <w:fldChar w:fldCharType="end"/>
+          </w:r>
+        </w:p>
+        <w:p>
+          <w:pPr>
+            <w:pStyle w:val="TOC3"/>
+            <w:tabs>
+              <w:tab w:val="right" w:leader="dot" w:pos="9360"/>
+            </w:tabs>
+            <w:rPr>
+              <w:color w:val="0563C1"/>
+              <w:u w:val="single"/>
+            </w:rPr>
+          </w:pPr>
+          <w:hyperlink w:anchor="step-6.4-prove-the-rule-generalizes" w:history="1">
+            <w:r>
+              <w:rPr>
+                <w:color w:val="0563C1"/>
+                <w:u w:val="single"/>
+              </w:rPr>
+              <w:t xml:space="preserve">Step 6.4 — Prove the rule generalizes</w:t>
+            </w:r>
+          </w:hyperlink>
+          <w:r>
+            <w:rPr>
+              <w:color w:val="0563C1"/>
+              <w:u w:val="single"/>
+            </w:rPr>
+            <w:tab/>
+          </w:r>
+          <w:r>
+            <w:rPr>
+              <w:color w:val="0563C1"/>
+              <w:u w:val="single"/>
+            </w:rPr>
+            <w:fldChar w:fldCharType="begin"/>
+          </w:r>
+          <w:r>
+            <w:rPr>
+              <w:color w:val="0563C1"/>
+              <w:u w:val="single"/>
+            </w:rPr>
+            <w:instrText xml:space="preserve"> PAGE </w:instrText>
+          </w:r>
+          <w:r>
+            <w:rPr>
+              <w:color w:val="0563C1"/>
+              <w:u w:val="single"/>
+            </w:rPr>
+            <w:fldChar w:fldCharType="separate"/>
+          </w:r>
+          <w:r>
+            <w:rPr>
+              <w:color w:val="0563C1"/>
+              <w:u w:val="single"/>
+            </w:rPr>
+            <w:t xml:space="preserve">18</w:t>
+          </w:r>
+          <w:r>
+            <w:rPr>
+              <w:color w:val="0563C1"/>
+              <w:u w:val="single"/>
+            </w:rPr>
+            <w:fldChar w:fldCharType="end"/>
+          </w:r>
+        </w:p>
+        <w:p>
+          <w:pPr>
+            <w:pStyle w:val="TOC2"/>
+            <w:tabs>
+              <w:tab w:val="right" w:leader="dot" w:pos="9360"/>
+            </w:tabs>
+            <w:rPr>
+              <w:color w:val="0563C1"/>
+              <w:u w:val="single"/>
+            </w:rPr>
+          </w:pPr>
+          <w:hyperlink w:anchor="stage-7-secrets-scanning-with-gitleaks" w:history="1">
+            <w:r>
+              <w:rPr>
+                <w:color w:val="0563C1"/>
+                <w:u w:val="single"/>
+              </w:rPr>
+              <w:t xml:space="preserve">Stage 7 — Secrets scanning with gitleaks</w:t>
+            </w:r>
+          </w:hyperlink>
+          <w:r>
+            <w:rPr>
+              <w:color w:val="0563C1"/>
+              <w:u w:val="single"/>
+            </w:rPr>
+            <w:tab/>
+          </w:r>
+          <w:r>
+            <w:rPr>
+              <w:color w:val="0563C1"/>
+              <w:u w:val="single"/>
+            </w:rPr>
+            <w:fldChar w:fldCharType="begin"/>
+          </w:r>
+          <w:r>
+            <w:rPr>
+              <w:color w:val="0563C1"/>
+              <w:u w:val="single"/>
+            </w:rPr>
+            <w:instrText xml:space="preserve"> PAGE </w:instrText>
+          </w:r>
+          <w:r>
+            <w:rPr>
+              <w:color w:val="0563C1"/>
+              <w:u w:val="single"/>
+            </w:rPr>
+            <w:fldChar w:fldCharType="separate"/>
+          </w:r>
+          <w:r>
+            <w:rPr>
+              <w:color w:val="0563C1"/>
+              <w:u w:val="single"/>
+            </w:rPr>
+            <w:t xml:space="preserve">20</w:t>
+          </w:r>
+          <w:r>
+            <w:rPr>
+              <w:color w:val="0563C1"/>
+              <w:u w:val="single"/>
+            </w:rPr>
+            <w:fldChar w:fldCharType="end"/>
+          </w:r>
+        </w:p>
+        <w:p>
+          <w:pPr>
+            <w:pStyle w:val="TOC3"/>
+            <w:tabs>
+              <w:tab w:val="right" w:leader="dot" w:pos="9360"/>
+            </w:tabs>
+            <w:rPr>
+              <w:color w:val="0563C1"/>
+              <w:u w:val="single"/>
+            </w:rPr>
+          </w:pPr>
+          <w:hyperlink w:anchor="step-7.1-the-problem-in-plain-words" w:history="1">
+            <w:r>
+              <w:rPr>
+                <w:color w:val="0563C1"/>
+                <w:u w:val="single"/>
+              </w:rPr>
+              <w:t xml:space="preserve">Step 7.1 — The problem, in plain words</w:t>
+            </w:r>
+          </w:hyperlink>
+          <w:r>
+            <w:rPr>
+              <w:color w:val="0563C1"/>
+              <w:u w:val="single"/>
+            </w:rPr>
+            <w:tab/>
+          </w:r>
+          <w:r>
+            <w:rPr>
+              <w:color w:val="0563C1"/>
+              <w:u w:val="single"/>
+            </w:rPr>
+            <w:fldChar w:fldCharType="begin"/>
+          </w:r>
+          <w:r>
+            <w:rPr>
+              <w:color w:val="0563C1"/>
+              <w:u w:val="single"/>
+            </w:rPr>
+            <w:instrText xml:space="preserve"> PAGE </w:instrText>
+          </w:r>
+          <w:r>
+            <w:rPr>
+              <w:color w:val="0563C1"/>
+              <w:u w:val="single"/>
+            </w:rPr>
+            <w:fldChar w:fldCharType="separate"/>
+          </w:r>
+          <w:r>
+            <w:rPr>
+              <w:color w:val="0563C1"/>
+              <w:u w:val="single"/>
+            </w:rPr>
+            <w:t xml:space="preserve">20</w:t>
+          </w:r>
+          <w:r>
+            <w:rPr>
+              <w:color w:val="0563C1"/>
+              <w:u w:val="single"/>
+            </w:rPr>
+            <w:fldChar w:fldCharType="end"/>
+          </w:r>
+        </w:p>
+        <w:p>
+          <w:pPr>
+            <w:pStyle w:val="TOC3"/>
+            <w:tabs>
+              <w:tab w:val="right" w:leader="dot" w:pos="9360"/>
+            </w:tabs>
+            <w:rPr>
+              <w:color w:val="0563C1"/>
+              <w:u w:val="single"/>
+            </w:rPr>
+          </w:pPr>
+          <w:hyperlink w:anchor="X713aa7e5f3a3ea8dfe492167d37ce2de8ce0e11" w:history="1">
+            <w:r>
+              <w:rPr>
+                <w:color w:val="0563C1"/>
+                <w:u w:val="single"/>
+              </w:rPr>
+              <w:t xml:space="preserve">Step 7.2 — Scan with gitleaks’ default config</w:t>
+            </w:r>
+          </w:hyperlink>
+          <w:r>
+            <w:rPr>
+              <w:color w:val="0563C1"/>
+              <w:u w:val="single"/>
+            </w:rPr>
+            <w:tab/>
+          </w:r>
+          <w:r>
+            <w:rPr>
+              <w:color w:val="0563C1"/>
+              <w:u w:val="single"/>
+            </w:rPr>
+            <w:fldChar w:fldCharType="begin"/>
+          </w:r>
+          <w:r>
+            <w:rPr>
+              <w:color w:val="0563C1"/>
+              <w:u w:val="single"/>
+            </w:rPr>
+            <w:instrText xml:space="preserve"> PAGE </w:instrText>
+          </w:r>
+          <w:r>
+            <w:rPr>
+              <w:color w:val="0563C1"/>
+              <w:u w:val="single"/>
+            </w:rPr>
+            <w:fldChar w:fldCharType="separate"/>
+          </w:r>
+          <w:r>
+            <w:rPr>
+              <w:color w:val="0563C1"/>
+              <w:u w:val="single"/>
+            </w:rPr>
+            <w:t xml:space="preserve">20</w:t>
+          </w:r>
+          <w:r>
+            <w:rPr>
+              <w:color w:val="0563C1"/>
+              <w:u w:val="single"/>
+            </w:rPr>
+            <w:fldChar w:fldCharType="end"/>
+          </w:r>
+        </w:p>
+        <w:p>
+          <w:pPr>
+            <w:pStyle w:val="TOC3"/>
+            <w:tabs>
+              <w:tab w:val="right" w:leader="dot" w:pos="9360"/>
+            </w:tabs>
+            <w:rPr>
+              <w:color w:val="0563C1"/>
+              <w:u w:val="single"/>
+            </w:rPr>
+          </w:pPr>
+          <w:hyperlink w:anchor="X4a690473663126fe67a679f66d12163a676f0a3" w:history="1">
+            <w:r>
+              <w:rPr>
+                <w:color w:val="0563C1"/>
+                <w:u w:val="single"/>
+              </w:rPr>
+              <w:t xml:space="preserve">Step 7.3 — The project config (same theme as the custom rule)</w:t>
+            </w:r>
+          </w:hyperlink>
+          <w:r>
+            <w:rPr>
+              <w:color w:val="0563C1"/>
+              <w:u w:val="single"/>
+            </w:rPr>
+            <w:tab/>
+          </w:r>
+          <w:r>
+            <w:rPr>
+              <w:color w:val="0563C1"/>
+              <w:u w:val="single"/>
+            </w:rPr>
+            <w:fldChar w:fldCharType="begin"/>
+          </w:r>
+          <w:r>
+            <w:rPr>
+              <w:color w:val="0563C1"/>
+              <w:u w:val="single"/>
+            </w:rPr>
+            <w:instrText xml:space="preserve"> PAGE </w:instrText>
+          </w:r>
+          <w:r>
+            <w:rPr>
+              <w:color w:val="0563C1"/>
+              <w:u w:val="single"/>
+            </w:rPr>
+            <w:fldChar w:fldCharType="separate"/>
+          </w:r>
+          <w:r>
+            <w:rPr>
+              <w:color w:val="0563C1"/>
+              <w:u w:val="single"/>
+            </w:rPr>
+            <w:t xml:space="preserve">21</w:t>
+          </w:r>
+          <w:r>
+            <w:rPr>
+              <w:color w:val="0563C1"/>
+              <w:u w:val="single"/>
+            </w:rPr>
+            <w:fldChar w:fldCharType="end"/>
+          </w:r>
+        </w:p>
+        <w:p>
+          <w:pPr>
+            <w:pStyle w:val="TOC3"/>
+            <w:tabs>
+              <w:tab w:val="right" w:leader="dot" w:pos="9360"/>
+            </w:tabs>
+            <w:rPr>
+              <w:color w:val="0563C1"/>
+              <w:u w:val="single"/>
+            </w:rPr>
+          </w:pPr>
+          <w:hyperlink w:anchor="step-7.4-the-full-history-sweep" w:history="1">
+            <w:r>
+              <w:rPr>
+                <w:color w:val="0563C1"/>
+                <w:u w:val="single"/>
+              </w:rPr>
+              <w:t xml:space="preserve">Step 7.4 — The full-history sweep</w:t>
+            </w:r>
+          </w:hyperlink>
+          <w:r>
+            <w:rPr>
+              <w:color w:val="0563C1"/>
+              <w:u w:val="single"/>
+            </w:rPr>
+            <w:tab/>
+          </w:r>
+          <w:r>
+            <w:rPr>
+              <w:color w:val="0563C1"/>
+              <w:u w:val="single"/>
+            </w:rPr>
+            <w:fldChar w:fldCharType="begin"/>
+          </w:r>
+          <w:r>
+            <w:rPr>
+              <w:color w:val="0563C1"/>
+              <w:u w:val="single"/>
+            </w:rPr>
+            <w:instrText xml:space="preserve"> PAGE </w:instrText>
+          </w:r>
+          <w:r>
+            <w:rPr>
+              <w:color w:val="0563C1"/>
+              <w:u w:val="single"/>
+            </w:rPr>
+            <w:fldChar w:fldCharType="separate"/>
+          </w:r>
+          <w:r>
+            <w:rPr>
+              <w:color w:val="0563C1"/>
+              <w:u w:val="single"/>
+            </w:rPr>
+            <w:t xml:space="preserve">22</w:t>
+          </w:r>
+          <w:r>
+            <w:rPr>
+              <w:color w:val="0563C1"/>
+              <w:u w:val="single"/>
+            </w:rPr>
+            <w:fldChar w:fldCharType="end"/>
+          </w:r>
+        </w:p>
+        <w:p>
+          <w:pPr>
+            <w:pStyle w:val="TOC2"/>
+            <w:tabs>
+              <w:tab w:val="right" w:leader="dot" w:pos="9360"/>
+            </w:tabs>
+            <w:rPr>
+              <w:color w:val="0563C1"/>
+              <w:u w:val="single"/>
+            </w:rPr>
+          </w:pPr>
+          <w:hyperlink w:anchor="Xd736f702b0f041d1742523a0626b923d1672929" w:history="1">
+            <w:r>
+              <w:rPr>
+                <w:color w:val="0563C1"/>
+                <w:u w:val="single"/>
+              </w:rPr>
+              <w:t xml:space="preserve">Stage 8 — Live secret verification (scanner output vs. security finding)</w:t>
+            </w:r>
+          </w:hyperlink>
+          <w:r>
+            <w:rPr>
+              <w:color w:val="0563C1"/>
+              <w:u w:val="single"/>
+            </w:rPr>
+            <w:tab/>
+          </w:r>
+          <w:r>
+            <w:rPr>
+              <w:color w:val="0563C1"/>
+              <w:u w:val="single"/>
+            </w:rPr>
+            <w:fldChar w:fldCharType="begin"/>
+          </w:r>
+          <w:r>
+            <w:rPr>
+              <w:color w:val="0563C1"/>
+              <w:u w:val="single"/>
+            </w:rPr>
+            <w:instrText xml:space="preserve"> PAGE </w:instrText>
+          </w:r>
+          <w:r>
+            <w:rPr>
+              <w:color w:val="0563C1"/>
+              <w:u w:val="single"/>
+            </w:rPr>
+            <w:fldChar w:fldCharType="separate"/>
+          </w:r>
+          <w:r>
+            <w:rPr>
+              <w:color w:val="0563C1"/>
+              <w:u w:val="single"/>
+            </w:rPr>
+            <w:t xml:space="preserve">22</w:t>
+          </w:r>
+          <w:r>
+            <w:rPr>
+              <w:color w:val="0563C1"/>
+              <w:u w:val="single"/>
+            </w:rPr>
+            <w:fldChar w:fldCharType="end"/>
+          </w:r>
+        </w:p>
+        <w:p>
+          <w:pPr>
+            <w:pStyle w:val="TOC3"/>
+            <w:tabs>
+              <w:tab w:val="right" w:leader="dot" w:pos="9360"/>
+            </w:tabs>
+            <w:rPr>
+              <w:color w:val="0563C1"/>
+              <w:u w:val="single"/>
+            </w:rPr>
+          </w:pPr>
+          <w:hyperlink w:anchor="step-8.1-the-problem-in-plain-words" w:history="1">
+            <w:r>
+              <w:rPr>
+                <w:color w:val="0563C1"/>
+                <w:u w:val="single"/>
+              </w:rPr>
+              <w:t xml:space="preserve">Step 8.1 — The problem, in plain words</w:t>
+            </w:r>
+          </w:hyperlink>
+          <w:r>
+            <w:rPr>
+              <w:color w:val="0563C1"/>
+              <w:u w:val="single"/>
+            </w:rPr>
+            <w:tab/>
+          </w:r>
+          <w:r>
+            <w:rPr>
+              <w:color w:val="0563C1"/>
+              <w:u w:val="single"/>
+            </w:rPr>
+            <w:fldChar w:fldCharType="begin"/>
+          </w:r>
+          <w:r>
+            <w:rPr>
+              <w:color w:val="0563C1"/>
+              <w:u w:val="single"/>
+            </w:rPr>
+            <w:instrText xml:space="preserve"> PAGE </w:instrText>
+          </w:r>
+          <w:r>
+            <w:rPr>
+              <w:color w:val="0563C1"/>
+              <w:u w:val="single"/>
+            </w:rPr>
+            <w:fldChar w:fldCharType="separate"/>
+          </w:r>
+          <w:r>
+            <w:rPr>
+              <w:color w:val="0563C1"/>
+              <w:u w:val="single"/>
+            </w:rPr>
+            <w:t xml:space="preserve">22</w:t>
+          </w:r>
+          <w:r>
+            <w:rPr>
+              <w:color w:val="0563C1"/>
+              <w:u w:val="single"/>
+            </w:rPr>
+            <w:fldChar w:fldCharType="end"/>
+          </w:r>
+        </w:p>
+        <w:p>
+          <w:pPr>
+            <w:pStyle w:val="TOC3"/>
+            <w:tabs>
+              <w:tab w:val="right" w:leader="dot" w:pos="9360"/>
+            </w:tabs>
+            <w:rPr>
+              <w:color w:val="0563C1"/>
+              <w:u w:val="single"/>
+            </w:rPr>
+          </w:pPr>
+          <w:hyperlink w:anchor="step-8.2-the-verification-script" w:history="1">
+            <w:r>
+              <w:rPr>
+                <w:color w:val="0563C1"/>
+                <w:u w:val="single"/>
+              </w:rPr>
+              <w:t xml:space="preserve">Step 8.2 — The verification script</w:t>
+            </w:r>
+          </w:hyperlink>
+          <w:r>
+            <w:rPr>
+              <w:color w:val="0563C1"/>
+              <w:u w:val="single"/>
+            </w:rPr>
+            <w:tab/>
+          </w:r>
+          <w:r>
+            <w:rPr>
+              <w:color w:val="0563C1"/>
+              <w:u w:val="single"/>
+            </w:rPr>
+            <w:fldChar w:fldCharType="begin"/>
+          </w:r>
+          <w:r>
+            <w:rPr>
+              <w:color w:val="0563C1"/>
+              <w:u w:val="single"/>
+            </w:rPr>
+            <w:instrText xml:space="preserve"> PAGE </w:instrText>
+          </w:r>
+          <w:r>
+            <w:rPr>
+              <w:color w:val="0563C1"/>
+              <w:u w:val="single"/>
+            </w:rPr>
+            <w:fldChar w:fldCharType="separate"/>
+          </w:r>
+          <w:r>
+            <w:rPr>
+              <w:color w:val="0563C1"/>
+              <w:u w:val="single"/>
+            </w:rPr>
+            <w:t xml:space="preserve">23</w:t>
+          </w:r>
+          <w:r>
+            <w:rPr>
+              <w:color w:val="0563C1"/>
+              <w:u w:val="single"/>
+            </w:rPr>
+            <w:fldChar w:fldCharType="end"/>
+          </w:r>
+        </w:p>
+        <w:p>
+          <w:pPr>
+            <w:pStyle w:val="TOC3"/>
+            <w:tabs>
+              <w:tab w:val="right" w:leader="dot" w:pos="9360"/>
+            </w:tabs>
+            <w:rPr>
+              <w:color w:val="0563C1"/>
+              <w:u w:val="single"/>
+            </w:rPr>
+          </w:pPr>
+          <w:hyperlink w:anchor="step-8.3-the-verdict" w:history="1">
+            <w:r>
+              <w:rPr>
+                <w:color w:val="0563C1"/>
+                <w:u w:val="single"/>
+              </w:rPr>
+              <w:t xml:space="preserve">Step 8.3 — The verdict</w:t>
+            </w:r>
+          </w:hyperlink>
+          <w:r>
+            <w:rPr>
+              <w:color w:val="0563C1"/>
+              <w:u w:val="single"/>
+            </w:rPr>
+            <w:tab/>
+          </w:r>
+          <w:r>
+            <w:rPr>
+              <w:color w:val="0563C1"/>
+              <w:u w:val="single"/>
+            </w:rPr>
+            <w:fldChar w:fldCharType="begin"/>
+          </w:r>
+          <w:r>
+            <w:rPr>
+              <w:color w:val="0563C1"/>
+              <w:u w:val="single"/>
+            </w:rPr>
+            <w:instrText xml:space="preserve"> PAGE </w:instrText>
+          </w:r>
+          <w:r>
+            <w:rPr>
+              <w:color w:val="0563C1"/>
+              <w:u w:val="single"/>
+            </w:rPr>
+            <w:fldChar w:fldCharType="separate"/>
+          </w:r>
+          <w:r>
+            <w:rPr>
+              <w:color w:val="0563C1"/>
+              <w:u w:val="single"/>
+            </w:rPr>
+            <w:t xml:space="preserve">23</w:t>
+          </w:r>
+          <w:r>
+            <w:rPr>
+              <w:color w:val="0563C1"/>
+              <w:u w:val="single"/>
+            </w:rPr>
+            <w:fldChar w:fldCharType="end"/>
+          </w:r>
+        </w:p>
+        <w:p>
+          <w:pPr>
+            <w:pStyle w:val="TOC2"/>
+            <w:tabs>
+              <w:tab w:val="right" w:leader="dot" w:pos="9360"/>
+            </w:tabs>
+            <w:rPr>
+              <w:color w:val="0563C1"/>
+              <w:u w:val="single"/>
+            </w:rPr>
+          </w:pPr>
+          <w:hyperlink w:anchor="Xabe9e031400c5e8bb9cc4e71544d2467b73e275" w:history="1">
+            <w:r>
+              <w:rPr>
+                <w:color w:val="0563C1"/>
+                <w:u w:val="single"/>
+              </w:rPr>
+              <w:t xml:space="preserve">Stage 9 — The reachability discovery (the surprise from Stage 3)</w:t>
+            </w:r>
+          </w:hyperlink>
+          <w:r>
+            <w:rPr>
+              <w:color w:val="0563C1"/>
+              <w:u w:val="single"/>
+            </w:rPr>
+            <w:tab/>
+          </w:r>
+          <w:r>
+            <w:rPr>
+              <w:color w:val="0563C1"/>
+              <w:u w:val="single"/>
+            </w:rPr>
+            <w:fldChar w:fldCharType="begin"/>
+          </w:r>
+          <w:r>
+            <w:rPr>
+              <w:color w:val="0563C1"/>
+              <w:u w:val="single"/>
+            </w:rPr>
+            <w:instrText xml:space="preserve"> PAGE </w:instrText>
+          </w:r>
+          <w:r>
+            <w:rPr>
+              <w:color w:val="0563C1"/>
+              <w:u w:val="single"/>
+            </w:rPr>
+            <w:fldChar w:fldCharType="separate"/>
+          </w:r>
+          <w:r>
+            <w:rPr>
+              <w:color w:val="0563C1"/>
+              <w:u w:val="single"/>
+            </w:rPr>
+            <w:t xml:space="preserve">24</w:t>
+          </w:r>
+          <w:r>
+            <w:rPr>
+              <w:color w:val="0563C1"/>
+              <w:u w:val="single"/>
+            </w:rPr>
+            <w:fldChar w:fldCharType="end"/>
+          </w:r>
+        </w:p>
+        <w:p>
+          <w:pPr>
+            <w:pStyle w:val="TOC2"/>
+            <w:tabs>
+              <w:tab w:val="right" w:leader="dot" w:pos="9360"/>
+            </w:tabs>
+            <w:rPr>
+              <w:color w:val="0563C1"/>
+              <w:u w:val="single"/>
+            </w:rPr>
+          </w:pPr>
+          <w:hyperlink w:anchor="X84f8b03c8fd64d322d64415f20a4d9d3dde4f6a" w:history="1">
+            <w:r>
+              <w:rPr>
+                <w:color w:val="0563C1"/>
+                <w:u w:val="single"/>
+              </w:rPr>
+              <w:t xml:space="preserve">Stage 10 — Fix both vulnerabilities for real</w:t>
+            </w:r>
+          </w:hyperlink>
+          <w:r>
+            <w:rPr>
+              <w:color w:val="0563C1"/>
+              <w:u w:val="single"/>
+            </w:rPr>
+            <w:tab/>
+          </w:r>
+          <w:r>
+            <w:rPr>
+              <w:color w:val="0563C1"/>
+              <w:u w:val="single"/>
+            </w:rPr>
+            <w:fldChar w:fldCharType="begin"/>
+          </w:r>
+          <w:r>
+            <w:rPr>
+              <w:color w:val="0563C1"/>
+              <w:u w:val="single"/>
+            </w:rPr>
+            <w:instrText xml:space="preserve"> PAGE </w:instrText>
+          </w:r>
+          <w:r>
+            <w:rPr>
+              <w:color w:val="0563C1"/>
+              <w:u w:val="single"/>
+            </w:rPr>
+            <w:fldChar w:fldCharType="separate"/>
+          </w:r>
+          <w:r>
+            <w:rPr>
+              <w:color w:val="0563C1"/>
+              <w:u w:val="single"/>
+            </w:rPr>
+            <w:t xml:space="preserve">25</w:t>
+          </w:r>
+          <w:r>
+            <w:rPr>
+              <w:color w:val="0563C1"/>
+              <w:u w:val="single"/>
+            </w:rPr>
+            <w:fldChar w:fldCharType="end"/>
+          </w:r>
+        </w:p>
+        <w:p>
+          <w:pPr>
+            <w:pStyle w:val="TOC3"/>
+            <w:tabs>
+              <w:tab w:val="right" w:leader="dot" w:pos="9360"/>
+            </w:tabs>
+            <w:rPr>
+              <w:color w:val="0563C1"/>
+              <w:u w:val="single"/>
+            </w:rPr>
+          </w:pPr>
+          <w:hyperlink w:anchor="step-10.1-fix-the-sql-injection" w:history="1">
+            <w:r>
+              <w:rPr>
+                <w:color w:val="0563C1"/>
+                <w:u w:val="single"/>
+              </w:rPr>
+              <w:t xml:space="preserve">Step 10.1 — Fix the SQL injection</w:t>
+            </w:r>
+          </w:hyperlink>
+          <w:r>
+            <w:rPr>
+              <w:color w:val="0563C1"/>
+              <w:u w:val="single"/>
+            </w:rPr>
+            <w:tab/>
+          </w:r>
+          <w:r>
+            <w:rPr>
+              <w:color w:val="0563C1"/>
+              <w:u w:val="single"/>
+            </w:rPr>
+            <w:fldChar w:fldCharType="begin"/>
+          </w:r>
+          <w:r>
+            <w:rPr>
+              <w:color w:val="0563C1"/>
+              <w:u w:val="single"/>
+            </w:rPr>
+            <w:instrText xml:space="preserve"> PAGE </w:instrText>
+          </w:r>
+          <w:r>
+            <w:rPr>
+              <w:color w:val="0563C1"/>
+              <w:u w:val="single"/>
+            </w:rPr>
+            <w:fldChar w:fldCharType="separate"/>
+          </w:r>
+          <w:r>
+            <w:rPr>
+              <w:color w:val="0563C1"/>
+              <w:u w:val="single"/>
+            </w:rPr>
+            <w:t xml:space="preserve">25</w:t>
+          </w:r>
+          <w:r>
+            <w:rPr>
+              <w:color w:val="0563C1"/>
+              <w:u w:val="single"/>
+            </w:rPr>
+            <w:fldChar w:fldCharType="end"/>
+          </w:r>
+        </w:p>
+        <w:p>
+          <w:pPr>
+            <w:pStyle w:val="TOC3"/>
+            <w:tabs>
+              <w:tab w:val="right" w:leader="dot" w:pos="9360"/>
+            </w:tabs>
+            <w:rPr>
+              <w:color w:val="0563C1"/>
+              <w:u w:val="single"/>
+            </w:rPr>
+          </w:pPr>
+          <w:hyperlink w:anchor="step-10.2-fix-the-xss" w:history="1">
+            <w:r>
+              <w:rPr>
+                <w:color w:val="0563C1"/>
+                <w:u w:val="single"/>
+              </w:rPr>
+              <w:t xml:space="preserve">Step 10.2 — Fix the XSS</w:t>
+            </w:r>
+          </w:hyperlink>
+          <w:r>
+            <w:rPr>
+              <w:color w:val="0563C1"/>
+              <w:u w:val="single"/>
+            </w:rPr>
+            <w:tab/>
+          </w:r>
+          <w:r>
+            <w:rPr>
+              <w:color w:val="0563C1"/>
+              <w:u w:val="single"/>
+            </w:rPr>
+            <w:fldChar w:fldCharType="begin"/>
+          </w:r>
+          <w:r>
+            <w:rPr>
+              <w:color w:val="0563C1"/>
+              <w:u w:val="single"/>
+            </w:rPr>
+            <w:instrText xml:space="preserve"> PAGE </w:instrText>
+          </w:r>
+          <w:r>
+            <w:rPr>
+              <w:color w:val="0563C1"/>
+              <w:u w:val="single"/>
+            </w:rPr>
+            <w:fldChar w:fldCharType="separate"/>
+          </w:r>
+          <w:r>
+            <w:rPr>
+              <w:color w:val="0563C1"/>
+              <w:u w:val="single"/>
+            </w:rPr>
+            <w:t xml:space="preserve">25</w:t>
+          </w:r>
+          <w:r>
+            <w:rPr>
+              <w:color w:val="0563C1"/>
+              <w:u w:val="single"/>
+            </w:rPr>
+            <w:fldChar w:fldCharType="end"/>
+          </w:r>
+        </w:p>
+        <w:p>
+          <w:pPr>
+            <w:pStyle w:val="TOC2"/>
+            <w:tabs>
+              <w:tab w:val="right" w:leader="dot" w:pos="9360"/>
+            </w:tabs>
+            <w:rPr>
+              <w:color w:val="0563C1"/>
+              <w:u w:val="single"/>
+            </w:rPr>
+          </w:pPr>
+          <w:hyperlink w:anchor="Xfe30c108c469d9f74dd11c97f8b042a340cef69" w:history="1">
+            <w:r>
+              <w:rPr>
+                <w:color w:val="0563C1"/>
+                <w:u w:val="single"/>
+              </w:rPr>
+              <w:t xml:space="preserve">Stage 11 — Prove the fixes at runtime (not just “it compiles”)</w:t>
+            </w:r>
+          </w:hyperlink>
+          <w:r>
+            <w:rPr>
+              <w:color w:val="0563C1"/>
+              <w:u w:val="single"/>
+            </w:rPr>
+            <w:tab/>
+          </w:r>
+          <w:r>
+            <w:rPr>
+              <w:color w:val="0563C1"/>
+              <w:u w:val="single"/>
+            </w:rPr>
+            <w:fldChar w:fldCharType="begin"/>
+          </w:r>
+          <w:r>
+            <w:rPr>
+              <w:color w:val="0563C1"/>
+              <w:u w:val="single"/>
+            </w:rPr>
+            <w:instrText xml:space="preserve"> PAGE </w:instrText>
+          </w:r>
+          <w:r>
+            <w:rPr>
+              <w:color w:val="0563C1"/>
+              <w:u w:val="single"/>
+            </w:rPr>
+            <w:fldChar w:fldCharType="separate"/>
+          </w:r>
+          <w:r>
+            <w:rPr>
+              <w:color w:val="0563C1"/>
+              <w:u w:val="single"/>
+            </w:rPr>
+            <w:t xml:space="preserve">25</w:t>
+          </w:r>
+          <w:r>
+            <w:rPr>
+              <w:color w:val="0563C1"/>
+              <w:u w:val="single"/>
+            </w:rPr>
+            <w:fldChar w:fldCharType="end"/>
+          </w:r>
+        </w:p>
+        <w:p>
+          <w:pPr>
+            <w:pStyle w:val="TOC3"/>
+            <w:tabs>
+              <w:tab w:val="right" w:leader="dot" w:pos="9360"/>
+            </w:tabs>
+            <w:rPr>
+              <w:color w:val="0563C1"/>
+              <w:u w:val="single"/>
+            </w:rPr>
+          </w:pPr>
+          <w:hyperlink w:anchor="step-11.1-search-works-now" w:history="1">
+            <w:r>
+              <w:rPr>
+                <w:color w:val="0563C1"/>
+                <w:u w:val="single"/>
+              </w:rPr>
+              <w:t xml:space="preserve">Step 11.1 — Search works now</w:t>
+            </w:r>
+          </w:hyperlink>
+          <w:r>
+            <w:rPr>
+              <w:color w:val="0563C1"/>
+              <w:u w:val="single"/>
+            </w:rPr>
+            <w:tab/>
+          </w:r>
+          <w:r>
+            <w:rPr>
+              <w:color w:val="0563C1"/>
+              <w:u w:val="single"/>
+            </w:rPr>
+            <w:fldChar w:fldCharType="begin"/>
+          </w:r>
+          <w:r>
+            <w:rPr>
+              <w:color w:val="0563C1"/>
+              <w:u w:val="single"/>
+            </w:rPr>
+            <w:instrText xml:space="preserve"> PAGE </w:instrText>
+          </w:r>
+          <w:r>
+            <w:rPr>
+              <w:color w:val="0563C1"/>
+              <w:u w:val="single"/>
+            </w:rPr>
+            <w:fldChar w:fldCharType="separate"/>
+          </w:r>
+          <w:r>
+            <w:rPr>
+              <w:color w:val="0563C1"/>
+              <w:u w:val="single"/>
+            </w:rPr>
+            <w:t xml:space="preserve">25</w:t>
+          </w:r>
+          <w:r>
+            <w:rPr>
+              <w:color w:val="0563C1"/>
+              <w:u w:val="single"/>
+            </w:rPr>
+            <w:fldChar w:fldCharType="end"/>
+          </w:r>
+        </w:p>
+        <w:p>
+          <w:pPr>
+            <w:pStyle w:val="TOC3"/>
+            <w:tabs>
+              <w:tab w:val="right" w:leader="dot" w:pos="9360"/>
+            </w:tabs>
+            <w:rPr>
+              <w:color w:val="0563C1"/>
+              <w:u w:val="single"/>
+            </w:rPr>
+          </w:pPr>
+          <w:hyperlink w:anchor="step-11.2-the-sql-injection-attempt" w:history="1">
+            <w:r>
+              <w:rPr>
+                <w:color w:val="0563C1"/>
+                <w:u w:val="single"/>
+              </w:rPr>
+              <w:t xml:space="preserve">Step 11.2 — The SQL injection attempt</w:t>
+            </w:r>
+          </w:hyperlink>
+          <w:r>
+            <w:rPr>
+              <w:color w:val="0563C1"/>
+              <w:u w:val="single"/>
+            </w:rPr>
+            <w:tab/>
+          </w:r>
+          <w:r>
+            <w:rPr>
+              <w:color w:val="0563C1"/>
+              <w:u w:val="single"/>
+            </w:rPr>
+            <w:fldChar w:fldCharType="begin"/>
+          </w:r>
+          <w:r>
+            <w:rPr>
+              <w:color w:val="0563C1"/>
+              <w:u w:val="single"/>
+            </w:rPr>
+            <w:instrText xml:space="preserve"> PAGE </w:instrText>
+          </w:r>
+          <w:r>
+            <w:rPr>
+              <w:color w:val="0563C1"/>
+              <w:u w:val="single"/>
+            </w:rPr>
+            <w:fldChar w:fldCharType="separate"/>
+          </w:r>
+          <w:r>
+            <w:rPr>
+              <w:color w:val="0563C1"/>
+              <w:u w:val="single"/>
+            </w:rPr>
+            <w:t xml:space="preserve">26</w:t>
+          </w:r>
+          <w:r>
+            <w:rPr>
+              <w:color w:val="0563C1"/>
+              <w:u w:val="single"/>
+            </w:rPr>
+            <w:fldChar w:fldCharType="end"/>
+          </w:r>
+        </w:p>
+        <w:p>
+          <w:pPr>
+            <w:pStyle w:val="TOC3"/>
+            <w:tabs>
+              <w:tab w:val="right" w:leader="dot" w:pos="9360"/>
+            </w:tabs>
+            <w:rPr>
+              <w:color w:val="0563C1"/>
+              <w:u w:val="single"/>
+            </w:rPr>
+          </w:pPr>
+          <w:hyperlink w:anchor="step-11.3-the-xss-attempt" w:history="1">
+            <w:r>
+              <w:rPr>
+                <w:color w:val="0563C1"/>
+                <w:u w:val="single"/>
+              </w:rPr>
+              <w:t xml:space="preserve">Step 11.3 — The XSS attempt</w:t>
+            </w:r>
+          </w:hyperlink>
+          <w:r>
+            <w:rPr>
+              <w:color w:val="0563C1"/>
+              <w:u w:val="single"/>
+            </w:rPr>
+            <w:tab/>
+          </w:r>
+          <w:r>
+            <w:rPr>
+              <w:color w:val="0563C1"/>
+              <w:u w:val="single"/>
+            </w:rPr>
+            <w:fldChar w:fldCharType="begin"/>
+          </w:r>
+          <w:r>
+            <w:rPr>
+              <w:color w:val="0563C1"/>
+              <w:u w:val="single"/>
+            </w:rPr>
+            <w:instrText xml:space="preserve"> PAGE </w:instrText>
+          </w:r>
+          <w:r>
+            <w:rPr>
+              <w:color w:val="0563C1"/>
+              <w:u w:val="single"/>
+            </w:rPr>
+            <w:fldChar w:fldCharType="separate"/>
+          </w:r>
+          <w:r>
+            <w:rPr>
+              <w:color w:val="0563C1"/>
+              <w:u w:val="single"/>
+            </w:rPr>
+            <w:t xml:space="preserve">26</w:t>
+          </w:r>
+          <w:r>
+            <w:rPr>
+              <w:color w:val="0563C1"/>
+              <w:u w:val="single"/>
+            </w:rPr>
+            <w:fldChar w:fldCharType="end"/>
+          </w:r>
+        </w:p>
+        <w:p>
+          <w:pPr>
+            <w:pStyle w:val="TOC3"/>
+            <w:tabs>
+              <w:tab w:val="right" w:leader="dot" w:pos="9360"/>
+            </w:tabs>
+            <w:rPr>
+              <w:color w:val="0563C1"/>
+              <w:u w:val="single"/>
+            </w:rPr>
+          </w:pPr>
+          <w:hyperlink w:anchor="Xea1f611bbf1f145acf6843d9521e6fd8d836ee0" w:history="1">
+            <w:r>
+              <w:rPr>
+                <w:color w:val="0563C1"/>
+                <w:u w:val="single"/>
+              </w:rPr>
+              <w:t xml:space="preserve">Step 11.4 — The rerun (this is what “fixed for real” means)</w:t>
+            </w:r>
+          </w:hyperlink>
+          <w:r>
+            <w:rPr>
+              <w:color w:val="0563C1"/>
+              <w:u w:val="single"/>
+            </w:rPr>
+            <w:tab/>
+          </w:r>
+          <w:r>
+            <w:rPr>
+              <w:color w:val="0563C1"/>
+              <w:u w:val="single"/>
+            </w:rPr>
+            <w:fldChar w:fldCharType="begin"/>
+          </w:r>
+          <w:r>
+            <w:rPr>
+              <w:color w:val="0563C1"/>
+              <w:u w:val="single"/>
+            </w:rPr>
+            <w:instrText xml:space="preserve"> PAGE </w:instrText>
+          </w:r>
+          <w:r>
+            <w:rPr>
+              <w:color w:val="0563C1"/>
+              <w:u w:val="single"/>
+            </w:rPr>
+            <w:fldChar w:fldCharType="separate"/>
+          </w:r>
+          <w:r>
+            <w:rPr>
+              <w:color w:val="0563C1"/>
+              <w:u w:val="single"/>
+            </w:rPr>
+            <w:t xml:space="preserve">26</w:t>
+          </w:r>
+          <w:r>
+            <w:rPr>
+              <w:color w:val="0563C1"/>
+              <w:u w:val="single"/>
+            </w:rPr>
+            <w:fldChar w:fldCharType="end"/>
+          </w:r>
+        </w:p>
+        <w:p>
+          <w:pPr>
+            <w:pStyle w:val="TOC2"/>
+            <w:tabs>
+              <w:tab w:val="right" w:leader="dot" w:pos="9360"/>
+            </w:tabs>
+            <w:rPr>
+              <w:color w:val="0563C1"/>
+              <w:u w:val="single"/>
+            </w:rPr>
+          </w:pPr>
+          <w:hyperlink w:anchor="stage-12-the-ci-gate-proven" w:history="1">
+            <w:r>
+              <w:rPr>
+                <w:color w:val="0563C1"/>
+                <w:u w:val="single"/>
+              </w:rPr>
+              <w:t xml:space="preserve">Stage 12 — The CI gate, proven</w:t>
+            </w:r>
+          </w:hyperlink>
+          <w:r>
+            <w:rPr>
+              <w:color w:val="0563C1"/>
+              <w:u w:val="single"/>
+            </w:rPr>
+            <w:tab/>
+          </w:r>
+          <w:r>
+            <w:rPr>
+              <w:color w:val="0563C1"/>
+              <w:u w:val="single"/>
+            </w:rPr>
+            <w:fldChar w:fldCharType="begin"/>
+          </w:r>
+          <w:r>
+            <w:rPr>
+              <w:color w:val="0563C1"/>
+              <w:u w:val="single"/>
+            </w:rPr>
+            <w:instrText xml:space="preserve"> PAGE </w:instrText>
+          </w:r>
+          <w:r>
+            <w:rPr>
+              <w:color w:val="0563C1"/>
+              <w:u w:val="single"/>
+            </w:rPr>
+            <w:fldChar w:fldCharType="separate"/>
+          </w:r>
+          <w:r>
+            <w:rPr>
+              <w:color w:val="0563C1"/>
+              <w:u w:val="single"/>
+            </w:rPr>
+            <w:t xml:space="preserve">27</w:t>
+          </w:r>
+          <w:r>
+            <w:rPr>
+              <w:color w:val="0563C1"/>
+              <w:u w:val="single"/>
+            </w:rPr>
+            <w:fldChar w:fldCharType="end"/>
+          </w:r>
+        </w:p>
+        <w:p>
+          <w:pPr>
+            <w:pStyle w:val="TOC3"/>
+            <w:tabs>
+              <w:tab w:val="right" w:leader="dot" w:pos="9360"/>
+            </w:tabs>
+            <w:rPr>
+              <w:color w:val="0563C1"/>
+              <w:u w:val="single"/>
+            </w:rPr>
+          </w:pPr>
+          <w:hyperlink w:anchor="step-12.1-what-ci-means-here" w:history="1">
+            <w:r>
+              <w:rPr>
+                <w:color w:val="0563C1"/>
+                <w:u w:val="single"/>
+              </w:rPr>
+              <w:t xml:space="preserve">Step 12.1 — What “CI” means here</w:t>
+            </w:r>
+          </w:hyperlink>
+          <w:r>
+            <w:rPr>
+              <w:color w:val="0563C1"/>
+              <w:u w:val="single"/>
+            </w:rPr>
+            <w:tab/>
+          </w:r>
+          <w:r>
+            <w:rPr>
+              <w:color w:val="0563C1"/>
+              <w:u w:val="single"/>
+            </w:rPr>
+            <w:fldChar w:fldCharType="begin"/>
+          </w:r>
+          <w:r>
+            <w:rPr>
+              <w:color w:val="0563C1"/>
+              <w:u w:val="single"/>
+            </w:rPr>
+            <w:instrText xml:space="preserve"> PAGE </w:instrText>
+          </w:r>
+          <w:r>
+            <w:rPr>
+              <w:color w:val="0563C1"/>
+              <w:u w:val="single"/>
+            </w:rPr>
+            <w:fldChar w:fldCharType="separate"/>
+          </w:r>
+          <w:r>
+            <w:rPr>
+              <w:color w:val="0563C1"/>
+              <w:u w:val="single"/>
+            </w:rPr>
+            <w:t xml:space="preserve">27</w:t>
+          </w:r>
+          <w:r>
+            <w:rPr>
+              <w:color w:val="0563C1"/>
+              <w:u w:val="single"/>
+            </w:rPr>
+            <w:fldChar w:fldCharType="end"/>
+          </w:r>
+        </w:p>
+        <w:p>
+          <w:pPr>
+            <w:pStyle w:val="TOC3"/>
+            <w:tabs>
+              <w:tab w:val="right" w:leader="dot" w:pos="9360"/>
+            </w:tabs>
+            <w:rPr>
+              <w:color w:val="0563C1"/>
+              <w:u w:val="single"/>
+            </w:rPr>
+          </w:pPr>
+          <w:hyperlink w:anchor="step-12.2-run-1-green-on-the-fixed-code" w:history="1">
+            <w:r>
+              <w:rPr>
+                <w:color w:val="0563C1"/>
+                <w:u w:val="single"/>
+              </w:rPr>
+              <w:t xml:space="preserve">Step 12.2 — Run 1: green on the fixed code</w:t>
+            </w:r>
+          </w:hyperlink>
+          <w:r>
+            <w:rPr>
+              <w:color w:val="0563C1"/>
+              <w:u w:val="single"/>
+            </w:rPr>
+            <w:tab/>
+          </w:r>
+          <w:r>
+            <w:rPr>
+              <w:color w:val="0563C1"/>
+              <w:u w:val="single"/>
+            </w:rPr>
+            <w:fldChar w:fldCharType="begin"/>
+          </w:r>
+          <w:r>
+            <w:rPr>
+              <w:color w:val="0563C1"/>
+              <w:u w:val="single"/>
+            </w:rPr>
+            <w:instrText xml:space="preserve"> PAGE </w:instrText>
+          </w:r>
+          <w:r>
+            <w:rPr>
+              <w:color w:val="0563C1"/>
+              <w:u w:val="single"/>
+            </w:rPr>
+            <w:fldChar w:fldCharType="separate"/>
+          </w:r>
+          <w:r>
+            <w:rPr>
+              <w:color w:val="0563C1"/>
+              <w:u w:val="single"/>
+            </w:rPr>
+            <w:t xml:space="preserve">28</w:t>
+          </w:r>
+          <w:r>
+            <w:rPr>
+              <w:color w:val="0563C1"/>
+              <w:u w:val="single"/>
+            </w:rPr>
+            <w:fldChar w:fldCharType="end"/>
+          </w:r>
+        </w:p>
+        <w:p>
+          <w:pPr>
+            <w:pStyle w:val="TOC3"/>
+            <w:tabs>
+              <w:tab w:val="right" w:leader="dot" w:pos="9360"/>
+            </w:tabs>
+            <w:rPr>
+              <w:color w:val="0563C1"/>
+              <w:u w:val="single"/>
+            </w:rPr>
+          </w:pPr>
+          <w:hyperlink w:anchor="X9ff58d329e6c359ae2245a1eafa4f2a179f1001" w:history="1">
+            <w:r>
+              <w:rPr>
+                <w:color w:val="0563C1"/>
+                <w:u w:val="single"/>
+              </w:rPr>
+              <w:t xml:space="preserve">Step 12.3 — The gate catching our own real mistake</w:t>
+            </w:r>
+          </w:hyperlink>
+          <w:r>
+            <w:rPr>
+              <w:color w:val="0563C1"/>
+              <w:u w:val="single"/>
+            </w:rPr>
+            <w:tab/>
+          </w:r>
+          <w:r>
+            <w:rPr>
+              <w:color w:val="0563C1"/>
+              <w:u w:val="single"/>
+            </w:rPr>
+            <w:fldChar w:fldCharType="begin"/>
+          </w:r>
+          <w:r>
+            <w:rPr>
+              <w:color w:val="0563C1"/>
+              <w:u w:val="single"/>
+            </w:rPr>
+            <w:instrText xml:space="preserve"> PAGE </w:instrText>
+          </w:r>
+          <w:r>
+            <w:rPr>
+              <w:color w:val="0563C1"/>
+              <w:u w:val="single"/>
+            </w:rPr>
+            <w:fldChar w:fldCharType="separate"/>
+          </w:r>
+          <w:r>
+            <w:rPr>
+              <w:color w:val="0563C1"/>
+              <w:u w:val="single"/>
+            </w:rPr>
+            <w:t xml:space="preserve">28</w:t>
+          </w:r>
+          <w:r>
+            <w:rPr>
+              <w:color w:val="0563C1"/>
+              <w:u w:val="single"/>
+            </w:rPr>
+            <w:fldChar w:fldCharType="end"/>
+          </w:r>
+        </w:p>
+        <w:p>
+          <w:pPr>
+            <w:pStyle w:val="TOC3"/>
+            <w:tabs>
+              <w:tab w:val="right" w:leader="dot" w:pos="9360"/>
+            </w:tabs>
+            <w:rPr>
+              <w:color w:val="0563C1"/>
+              <w:u w:val="single"/>
+            </w:rPr>
+          </w:pPr>
+          <w:hyperlink w:anchor="X56bc2c264a0dab4ba344709a3d6837489b809bb" w:history="1">
+            <w:r>
+              <w:rPr>
+                <w:color w:val="0563C1"/>
+                <w:u w:val="single"/>
+              </w:rPr>
+              <w:t xml:space="preserve">Step 12.4 — Run 2: red on the violation branch (the deliverable)</w:t>
+            </w:r>
+          </w:hyperlink>
+          <w:r>
+            <w:rPr>
+              <w:color w:val="0563C1"/>
+              <w:u w:val="single"/>
+            </w:rPr>
+            <w:tab/>
+          </w:r>
+          <w:r>
+            <w:rPr>
+              <w:color w:val="0563C1"/>
+              <w:u w:val="single"/>
+            </w:rPr>
+            <w:fldChar w:fldCharType="begin"/>
+          </w:r>
+          <w:r>
+            <w:rPr>
+              <w:color w:val="0563C1"/>
+              <w:u w:val="single"/>
+            </w:rPr>
+            <w:instrText xml:space="preserve"> PAGE </w:instrText>
+          </w:r>
+          <w:r>
+            <w:rPr>
+              <w:color w:val="0563C1"/>
+              <w:u w:val="single"/>
+            </w:rPr>
+            <w:fldChar w:fldCharType="separate"/>
+          </w:r>
+          <w:r>
+            <w:rPr>
+              <w:color w:val="0563C1"/>
+              <w:u w:val="single"/>
+            </w:rPr>
+            <w:t xml:space="preserve">28</w:t>
+          </w:r>
+          <w:r>
+            <w:rPr>
+              <w:color w:val="0563C1"/>
+              <w:u w:val="single"/>
+            </w:rPr>
+            <w:fldChar w:fldCharType="end"/>
+          </w:r>
+        </w:p>
+        <w:p>
+          <w:pPr>
+            <w:pStyle w:val="TOC2"/>
+            <w:tabs>
+              <w:tab w:val="right" w:leader="dot" w:pos="9360"/>
+            </w:tabs>
+            <w:rPr>
+              <w:color w:val="0563C1"/>
+              <w:u w:val="single"/>
+            </w:rPr>
+          </w:pPr>
+          <w:hyperlink w:anchor="stage-13-the-final-report" w:history="1">
+            <w:r>
+              <w:rPr>
+                <w:color w:val="0563C1"/>
+                <w:u w:val="single"/>
+              </w:rPr>
+              <w:t xml:space="preserve">Stage 13 — The final report</w:t>
+            </w:r>
+          </w:hyperlink>
+          <w:r>
+            <w:rPr>
+              <w:color w:val="0563C1"/>
+              <w:u w:val="single"/>
+            </w:rPr>
+            <w:tab/>
+          </w:r>
+          <w:r>
+            <w:rPr>
+              <w:color w:val="0563C1"/>
+              <w:u w:val="single"/>
+            </w:rPr>
+            <w:fldChar w:fldCharType="begin"/>
+          </w:r>
+          <w:r>
+            <w:rPr>
+              <w:color w:val="0563C1"/>
+              <w:u w:val="single"/>
+            </w:rPr>
+            <w:instrText xml:space="preserve"> PAGE </w:instrText>
+          </w:r>
+          <w:r>
+            <w:rPr>
+              <w:color w:val="0563C1"/>
+              <w:u w:val="single"/>
+            </w:rPr>
+            <w:fldChar w:fldCharType="separate"/>
+          </w:r>
+          <w:r>
+            <w:rPr>
+              <w:color w:val="0563C1"/>
+              <w:u w:val="single"/>
+            </w:rPr>
+            <w:t xml:space="preserve">31</w:t>
+          </w:r>
+          <w:r>
+            <w:rPr>
+              <w:color w:val="0563C1"/>
+              <w:u w:val="single"/>
+            </w:rPr>
+            <w:fldChar w:fldCharType="end"/>
+          </w:r>
+        </w:p>
+        <w:p>
+          <w:pPr>
+            <w:pStyle w:val="TOC2"/>
+            <w:tabs>
+              <w:tab w:val="right" w:leader="dot" w:pos="9360"/>
+            </w:tabs>
+            <w:rPr>
+              <w:color w:val="0563C1"/>
+              <w:u w:val="single"/>
+            </w:rPr>
+          </w:pPr>
+          <w:hyperlink w:anchor="if-something-goes-wrong" w:history="1">
+            <w:r>
+              <w:rPr>
+                <w:color w:val="0563C1"/>
+                <w:u w:val="single"/>
+              </w:rPr>
+              <w:t xml:space="preserve">If something goes wrong</w:t>
+            </w:r>
+          </w:hyperlink>
+          <w:r>
+            <w:rPr>
+              <w:color w:val="0563C1"/>
+              <w:u w:val="single"/>
+            </w:rPr>
+            <w:tab/>
+          </w:r>
+          <w:r>
+            <w:rPr>
+              <w:color w:val="0563C1"/>
+              <w:u w:val="single"/>
+            </w:rPr>
+            <w:fldChar w:fldCharType="begin"/>
+          </w:r>
+          <w:r>
+            <w:rPr>
+              <w:color w:val="0563C1"/>
+              <w:u w:val="single"/>
+            </w:rPr>
+            <w:instrText xml:space="preserve"> PAGE </w:instrText>
+          </w:r>
+          <w:r>
+            <w:rPr>
+              <w:color w:val="0563C1"/>
+              <w:u w:val="single"/>
+            </w:rPr>
+            <w:fldChar w:fldCharType="separate"/>
+          </w:r>
+          <w:r>
+            <w:rPr>
+              <w:color w:val="0563C1"/>
+              <w:u w:val="single"/>
+            </w:rPr>
+            <w:t>31</w:t>
+          </w:r>
+          <w:r>
+            <w:rPr>
+              <w:color w:val="0563C1"/>
+              <w:u w:val="single"/>
+            </w:rPr>
+            <w:fldChar w:fldCharType="end"/>
+          </w:r>
+        </w:p>
+        <w:p>
+          <w:pPr>
+            <w:pStyle w:val="TOC2"/>
+            <w:tabs>
+              <w:tab w:val="right" w:leader="dot" w:pos="9360"/>
+            </w:tabs>
+            <w:rPr>
+              <w:color w:val="0563C1"/>
+              <w:u w:val="single"/>
+            </w:rPr>
+          </w:pPr>
+          <w:hyperlink w:anchor="what-i-learned-the-short-version" w:history="1">
+            <w:r>
+              <w:rPr>
+                <w:color w:val="0563C1"/>
+                <w:u w:val="single"/>
+              </w:rPr>
+              <w:t xml:space="preserve">What I learned (the short version)</w:t>
+            </w:r>
+          </w:hyperlink>
+          <w:r>
+            <w:rPr>
+              <w:color w:val="0563C1"/>
+              <w:u w:val="single"/>
+            </w:rPr>
+            <w:tab/>
+          </w:r>
+          <w:r>
+            <w:rPr>
+              <w:color w:val="0563C1"/>
+              <w:u w:val="single"/>
+            </w:rPr>
+            <w:fldChar w:fldCharType="begin"/>
+          </w:r>
+          <w:r>
+            <w:rPr>
+              <w:color w:val="0563C1"/>
+              <w:u w:val="single"/>
+            </w:rPr>
+            <w:instrText xml:space="preserve"> PAGE </w:instrText>
+          </w:r>
+          <w:r>
+            <w:rPr>
+              <w:color w:val="0563C1"/>
+              <w:u w:val="single"/>
+            </w:rPr>
+            <w:fldChar w:fldCharType="separate"/>
+          </w:r>
+          <w:r>
+            <w:rPr>
+              <w:color w:val="0563C1"/>
+              <w:u w:val="single"/>
+            </w:rPr>
+            <w:t xml:space="preserve">32</w:t>
+          </w:r>
+          <w:r>
+            <w:rPr>
+              <w:color w:val="0563C1"/>
+              <w:u w:val="single"/>
+            </w:rPr>
+            <w:fldChar w:fldCharType="end"/>
+          </w:r>
+        </w:p>
+        <w:p>
+          <w:pPr>
+            <w:pStyle w:val="TOC2"/>
+            <w:tabs>
+              <w:tab w:val="right" w:leader="dot" w:pos="9360"/>
+            </w:tabs>
+            <w:rPr>
+              <w:color w:val="0563C1"/>
+              <w:u w:val="single"/>
+            </w:rPr>
+          </w:pPr>
+          <w:hyperlink w:anchor="evidence-index" w:history="1">
+            <w:r>
+              <w:rPr>
+                <w:color w:val="0563C1"/>
+                <w:u w:val="single"/>
+              </w:rPr>
+              <w:t xml:space="preserve">Evidence index</w:t>
+            </w:r>
+          </w:hyperlink>
+          <w:r>
+            <w:rPr>
+              <w:color w:val="0563C1"/>
+              <w:u w:val="single"/>
+            </w:rPr>
+            <w:tab/>
+          </w:r>
+          <w:r>
+            <w:rPr>
+              <w:color w:val="0563C1"/>
+              <w:u w:val="single"/>
+            </w:rPr>
+            <w:fldChar w:fldCharType="begin"/>
+          </w:r>
+          <w:r>
+            <w:rPr>
+              <w:color w:val="0563C1"/>
+              <w:u w:val="single"/>
+            </w:rPr>
+            <w:instrText xml:space="preserve"> PAGE </w:instrText>
+          </w:r>
+          <w:r>
+            <w:rPr>
+              <w:color w:val="0563C1"/>
+              <w:u w:val="single"/>
+            </w:rPr>
+            <w:fldChar w:fldCharType="separate"/>
+          </w:r>
+          <w:r>
+            <w:rPr>
+              <w:color w:val="0563C1"/>
+              <w:u w:val="single"/>
+            </w:rPr>
+            <w:t xml:space="preserve">32</w:t>
+          </w:r>
+          <w:r>
+            <w:rPr>
+              <w:color w:val="0563C1"/>
+              <w:u w:val="single"/>
+            </w:rPr>
+            <w:fldChar w:fldCharType="end"/>
+          </w:r>
+        </w:p>
+        <w:p>
+          <w:r>
             <w:fldChar w:fldCharType="end"/>
           </w:r>
         </w:p>
@@ -39,9 +3823,6 @@
         <w:jc w:val="center"/>
       </w:pPr>
       <w:r>
-        <w:t>DocuTrust</w:t>
-      </w:r>
-      <w:r>
         <w:rPr>
           <w:b/>
           <w:color w:val="1F4E79"/>
@@ -55,9 +3836,6 @@
         <w:jc w:val="center"/>
       </w:pPr>
       <w:r>
-        <w:t>DevSecOps Project 1 — Walkthrough</w:t>
-      </w:r>
-      <w:r>
         <w:rPr>
           <w:color w:val="2E74B5"/>
           <w:sz w:val="40"/>
@@ -70,9 +3848,6 @@
         <w:jc w:val="center"/>
       </w:pPr>
       <w:r>
-        <w:t>SAST · Secrets Scanning · Live Secret Verification</w:t>
-      </w:r>
-      <w:r>
         <w:rPr>
           <w:i/>
           <w:sz w:val="26"/>
@@ -96,9 +3871,6 @@
         <w:jc w:val="center"/>
       </w:pPr>
       <w:r>
-        <w:t>Every command in this walkthrough actually ran, and every output quoted is real captured output from the tools — with evidence files and screenshots cited along the way.</w:t>
-      </w:r>
-      <w:r>
         <w:rPr>
           <w:color w:val="595959"/>
           <w:sz w:val="20"/>
@@ -111,9 +3883,6 @@
         <w:jc w:val="center"/>
       </w:pPr>
       <w:r>
-        <w:t>August 2026</w:t>
-      </w:r>
-      <w:r>
         <w:rPr>
           <w:sz w:val="22"/>
         </w:rPr>
@@ -171,6 +3940,13 @@
           <w:i/>
         </w:rPr>
         <w:t xml:space="preserve">real output I got. Evidence files and screenshots are cited along the way.</w:t>
+      </w:r>
+      <w:r>
+        <w:rPr>
+          <w:iCs/>
+          <w:i/>
+        </w:rPr>
+        <w:t xml:space="preserve"> The guide assumes a Bash terminal (macOS, Linux, or WSL2 on Windows).</w:t>
       </w:r>
     </w:p>
     <w:p>
@@ -207,13 +3983,13 @@
         <w:t xml:space="preserve">DocuTrust</w:t>
       </w:r>
       <w:r>
-        <w:t xml:space="preserve">, a small Node.js/Express document API</w:t>
-      </w:r>
-      <w:r>
-        <w:t xml:space="preserve"> </w:t>
-      </w:r>
-      <w:r>
-        <w:t xml:space="preserve">that stores documents in PostgreSQL. Nobody has ever scanned it for security</w:t>
+        <w:t xml:space="preserve">, a small web API (a program other programs can talk to over the network), built on Node.js and Express (a popular Node.js web framework),</w:t>
+      </w:r>
+      <w:r>
+        <w:t xml:space="preserve"> </w:t>
+      </w:r>
+      <w:r>
+        <w:t xml:space="preserve">storing documents in PostgreSQL. Nobody has ever scanned it for security</w:t>
       </w:r>
       <w:r>
         <w:t xml:space="preserve"> </w:t>
@@ -1061,6 +4837,14 @@
     </w:tbl>
     <w:p>
       <w:r>
+        <w:rPr>
+          <w:i/>
+        </w:rPr>
+        <w:t xml:space="preserve">Plan for roughly 60–90 minutes end to end.</w:t>
+      </w:r>
+    </w:p>
+    <w:p>
+      <w:r>
         <w:pict>
           <v:rect style="width:0;height:1.5pt" o:hralign="center" o:hrstd="t" o:hr="t"/>
         </w:pict>
@@ -5964,7 +9748,7 @@
               <w:t xml:space="preserve"> </w:t>
             </w:r>
             <w:r>
-              <w:t xml:space="preserve">— the app only parses the body if you send this header</w:t>
+              <w:t xml:space="preserve">(JSON is a plain-text format for describing data) — the app only parses the body if you send this header</w:t>
             </w:r>
           </w:p>
         </w:tc>
@@ -7403,7 +11187,7 @@
         <w:t xml:space="preserve"> </w:t>
       </w:r>
       <w:r>
-        <w:t xml:space="preserve">gets interpolated into HTML. The default ruleset caught the XSS:</w:t>
+        <w:t xml:space="preserve">gets interpolated into HTML — the classic XSS pattern (printing user input into a web page unescaped; the plain-language definition is in Stage 5). The default ruleset caught the XSS:</w:t>
       </w:r>
     </w:p>
     <w:p>
@@ -7458,14 +11242,6 @@
         <w:pStyle w:val="ImageCaption"/>
       </w:pPr>
       <w:r>
-        <w:t xml:space="preserve">Figure 1 — semgrep default rulesets: the XSS finding</w:t>
-      </w:r>
-    </w:p>
-    <w:p>
-      <w:pPr>
-        <w:pStyle w:val="BodyText"/>
-      </w:pPr>
-      <w:r>
         <w:rPr>
           <w:iCs/>
           <w:i/>
@@ -9695,14 +13471,6 @@
         <w:pStyle w:val="ImageCaption"/>
       </w:pPr>
       <w:r>
-        <w:t xml:space="preserve">Figure 2 — project custom rule: the SQLi the defaults missed, plus all 5 generalized shapes</w:t>
-      </w:r>
-    </w:p>
-    <w:p>
-      <w:pPr>
-        <w:pStyle w:val="BodyText"/>
-      </w:pPr>
-      <w:r>
         <w:rPr>
           <w:iCs/>
           <w:i/>
@@ -11346,14 +15114,6 @@
         <w:pStyle w:val="ImageCaption"/>
       </w:pPr>
       <w:r>
-        <w:t xml:space="preserve">Figure 3 — full-history gitleaks sweep</w:t>
-      </w:r>
-    </w:p>
-    <w:p>
-      <w:pPr>
-        <w:pStyle w:val="BodyText"/>
-      </w:pPr>
-      <w:r>
         <w:rPr>
           <w:iCs/>
           <w:i/>
@@ -11737,7 +15497,7 @@
         <w:t xml:space="preserve"> </w:t>
       </w:r>
       <w:r>
-        <w:t xml:space="preserve">reported — configures an AWS STS client with it, and makes the call.</w:t>
+        <w:t xml:space="preserve">reported — configures an AWS STS client with it (the AWS SDK is the library that speaks AWS’s API), and makes the call.</w:t>
       </w:r>
       <w:r>
         <w:t xml:space="preserve"> </w:t>
@@ -12148,14 +15908,6 @@
         <w:pStyle w:val="ImageCaption"/>
       </w:pPr>
       <w:r>
-        <w:t xml:space="preserve">Figure 4 — live secret verification</w:t>
-      </w:r>
-    </w:p>
-    <w:p>
-      <w:pPr>
-        <w:pStyle w:val="BodyText"/>
-      </w:pPr>
-      <w:r>
         <w:rPr>
           <w:iCs/>
           <w:i/>
@@ -14318,14 +18070,6 @@
         <w:pStyle w:val="ImageCaption"/>
       </w:pPr>
       <w:r>
-        <w:t xml:space="preserve">Figure 5 — SAST rerun after the fixes</w:t>
-      </w:r>
-    </w:p>
-    <w:p>
-      <w:pPr>
-        <w:pStyle w:val="BodyText"/>
-      </w:pPr>
-      <w:r>
         <w:rPr>
           <w:iCs/>
           <w:i/>
@@ -14916,14 +18660,6 @@
         <w:pStyle w:val="ImageCaption"/>
       </w:pPr>
       <w:r>
-        <w:t xml:space="preserve">Figure 6 — CI on main, all jobs green</w:t>
-      </w:r>
-    </w:p>
-    <w:p>
-      <w:pPr>
-        <w:pStyle w:val="BodyText"/>
-      </w:pPr>
-      <w:r>
         <w:rPr>
           <w:iCs/>
           <w:i/>
@@ -15118,7 +18854,7 @@
         <w:t xml:space="preserve"> </w:t>
       </w:r>
       <w:r>
-        <w:t xml:space="preserve">verified locally that the full-history scan was clean, and force-pushed</w:t>
+        <w:t xml:space="preserve">verified locally that the full-history scan was clean, and force-pushed (overwrote the remote history with)</w:t>
       </w:r>
       <w:r>
         <w:t xml:space="preserve"> </w:t>
@@ -15233,7 +18969,7 @@
         <w:t xml:space="preserve">src/legacy-config.js</w:t>
       </w:r>
       <w:r>
-        <w:t xml:space="preserve">) — opened as a PR:</w:t>
+        <w:t xml:space="preserve">) — opened as a PR (pull request — a proposed change, reviewed before merging):</w:t>
       </w:r>
     </w:p>
     <w:p>
@@ -15339,14 +19075,6 @@
         <w:pStyle w:val="ImageCaption"/>
       </w:pPr>
       <w:r>
-        <w:t xml:space="preserve">Figure 7 — CI on the violation PR: both gates blocked it</w:t>
-      </w:r>
-    </w:p>
-    <w:p>
-      <w:pPr>
-        <w:pStyle w:val="BodyText"/>
-      </w:pPr>
-      <w:r>
         <w:rPr>
           <w:iCs/>
           <w:i/>
@@ -15630,7 +19358,308 @@
       </w:r>
     </w:p>
     <w:bookmarkEnd w:id="98"/>
+    <w:bookmarkStart w:id="102" w:name="if-something-goes-wrong"/>
+    <w:bookmarkEnd w:id="102"/>
+    <w:p>
+      <w:pPr>
+        <w:pStyle w:val="Heading2"/>
+      </w:pPr>
+      <w:r>
+        <w:t xml:space="preserve">If something goes wrong</w:t>
+      </w:r>
+    </w:p>
+    <w:tbl>
+      <w:tblPr>
+        <w:tblStyle w:val="Table"/>
+        <w:tblW w:type="pct" w:w="5000"/>
+        <w:jc w:val="center"/>
+        <w:tblLook w:firstRow="1" w:lastRow="0" w:firstColumn="0" w:lastColumn="0" w:noHBand="0" w:noVBand="0" w:val="0020"/>
+      </w:tblPr>
+      <w:tblGrid>
+        <w:gridCol w:w="3400"/>
+        <w:gridCol w:w="5960"/>
+      </w:tblGrid>
+      <w:tr>
+        <w:trPr>
+          <w:tblHeader w:val="true"/>
+        </w:trPr>
+        <w:tc>
+          <w:tcPr>
+            <w:shd w:val="clear" w:color="auto" w:fill="DEEAF6"/>
+          </w:tcPr>
+          <w:p>
+            <w:pPr>
+              <w:pStyle w:val="Compact"/>
+              <w:jc w:val="left"/>
+            </w:pPr>
+            <w:r>
+              <w:rPr>
+                <w:b/>
+              </w:rPr>
+              <w:t xml:space="preserve">If you see this</w:t>
+            </w:r>
+          </w:p>
+        </w:tc>
+        <w:tc>
+          <w:tcPr>
+            <w:shd w:val="clear" w:color="auto" w:fill="DEEAF6"/>
+          </w:tcPr>
+          <w:p>
+            <w:pPr>
+              <w:pStyle w:val="Compact"/>
+              <w:jc w:val="left"/>
+            </w:pPr>
+            <w:r>
+              <w:rPr>
+                <w:b/>
+              </w:rPr>
+              <w:t xml:space="preserve">What it means and what to do</w:t>
+            </w:r>
+          </w:p>
+        </w:tc>
+      </w:tr>
+      <w:tr>
+        <w:tc>
+          <w:tcPr/>
+          <w:p>
+            <w:pPr>
+              <w:pStyle w:val="Compact"/>
+              <w:jc w:val="left"/>
+            </w:pPr>
+            <w:r>
+              <w:rPr>
+                <w:rStyle w:val="VerbatimChar"/>
+              </w:rPr>
+              <w:t xml:space="preserve">command not found</w:t>
+            </w:r>
+          </w:p>
+        </w:tc>
+        <w:tc>
+          <w:tcPr/>
+          <w:p>
+            <w:pPr>
+              <w:pStyle w:val="Compact"/>
+              <w:jc w:val="left"/>
+            </w:pPr>
+            <w:r>
+              <w:t xml:space="preserve">The tool isn’t installed (or not on your </w:t>
+            </w:r>
+            <w:r>
+              <w:rPr>
+                <w:rStyle w:val="VerbatimChar"/>
+              </w:rPr>
+              <w:t xml:space="preserve">PATH</w:t>
+            </w:r>
+            <w:r>
+              <w:t xml:space="preserve">). Go back to its install step: Node/npm — Step 1.2, PostgreSQL — Step 1.3, semgrep — Step 1.4, gitleaks — Step 1.5.</w:t>
+            </w:r>
+          </w:p>
+        </w:tc>
+      </w:tr>
+      <w:tr>
+        <w:tc>
+          <w:tcPr/>
+          <w:p>
+            <w:pPr>
+              <w:pStyle w:val="Compact"/>
+              <w:jc w:val="left"/>
+            </w:pPr>
+            <w:r>
+              <w:rPr>
+                <w:rStyle w:val="VerbatimChar"/>
+              </w:rPr>
+              <w:t xml:space="preserve">docker ps doesn’t print a table of containers</w:t>
+            </w:r>
+          </w:p>
+        </w:tc>
+        <w:tc>
+          <w:tcPr/>
+          <w:p>
+            <w:pPr>
+              <w:pStyle w:val="Compact"/>
+              <w:jc w:val="left"/>
+            </w:pPr>
+            <w:r>
+              <w:t xml:space="preserve">The Docker service probably isn’t running. Start it with </w:t>
+            </w:r>
+            <w:r>
+              <w:rPr>
+                <w:rStyle w:val="VerbatimChar"/>
+              </w:rPr>
+              <w:t xml:space="preserve">sudo service docker start</w:t>
+            </w:r>
+            <w:r>
+              <w:t xml:space="preserve"> (Step 1.3, Path A).</w:t>
+            </w:r>
+          </w:p>
+        </w:tc>
+      </w:tr>
+      <w:tr>
+        <w:tc>
+          <w:tcPr/>
+          <w:p>
+            <w:pPr>
+              <w:pStyle w:val="Compact"/>
+              <w:jc w:val="left"/>
+            </w:pPr>
+            <w:r>
+              <w:rPr>
+                <w:rStyle w:val="VerbatimChar"/>
+              </w:rPr>
+              <w:t xml:space="preserve">SASL: SCRAM-SERVER-FIRST-MESSAGE: client password must be a string</w:t>
+            </w:r>
+          </w:p>
+        </w:tc>
+        <w:tc>
+          <w:tcPr/>
+          <w:p>
+            <w:pPr>
+              <w:pStyle w:val="Compact"/>
+              <w:jc w:val="left"/>
+            </w:pPr>
+            <w:r>
+              <w:t xml:space="preserve">DATABASE_URL never reached Node. Re-run the load line: </w:t>
+            </w:r>
+            <w:r>
+              <w:rPr>
+                <w:rStyle w:val="VerbatimChar"/>
+              </w:rPr>
+              <w:t xml:space="preserve">set -a &amp;&amp; source .env.local &amp;&amp; set +a</w:t>
+            </w:r>
+            <w:r>
+              <w:t xml:space="preserve"> (Step 2.4).</w:t>
+            </w:r>
+          </w:p>
+        </w:tc>
+      </w:tr>
+      <w:tr>
+        <w:tc>
+          <w:tcPr/>
+          <w:p>
+            <w:pPr>
+              <w:pStyle w:val="Compact"/>
+              <w:jc w:val="left"/>
+            </w:pPr>
+            <w:r>
+              <w:rPr>
+                <w:rStyle w:val="VerbatimChar"/>
+              </w:rPr>
+              <w:t xml:space="preserve">already exists from the database setup commands</w:t>
+            </w:r>
+          </w:p>
+        </w:tc>
+        <w:tc>
+          <w:tcPr/>
+          <w:p>
+            <w:pPr>
+              <w:pStyle w:val="Compact"/>
+              <w:jc w:val="left"/>
+            </w:pPr>
+            <w:r>
+              <w:t xml:space="preserve">The database/user already exists — that’s success, move on (Step 2.1).</w:t>
+            </w:r>
+          </w:p>
+        </w:tc>
+      </w:tr>
+      <w:tr>
+        <w:tc>
+          <w:tcPr/>
+          <w:p>
+            <w:pPr>
+              <w:pStyle w:val="Compact"/>
+              <w:jc w:val="left"/>
+            </w:pPr>
+            <w:r>
+              <w:rPr>
+                <w:rStyle w:val="VerbatimChar"/>
+              </w:rPr>
+              <w:t xml:space="preserve">A different id in the responses than in the examples</w:t>
+            </w:r>
+          </w:p>
+        </w:tc>
+        <w:tc>
+          <w:tcPr/>
+          <w:p>
+            <w:pPr>
+              <w:pStyle w:val="Compact"/>
+              <w:jc w:val="left"/>
+            </w:pPr>
+            <w:r>
+              <w:t xml:space="preserve">Expected — the server assigns ids as it goes. Use the id your server returned (Step 3.2).</w:t>
+            </w:r>
+          </w:p>
+        </w:tc>
+      </w:tr>
+      <w:tr>
+        <w:tc>
+          <w:tcPr/>
+          <w:p>
+            <w:pPr>
+              <w:pStyle w:val="Compact"/>
+              <w:jc w:val="left"/>
+            </w:pPr>
+            <w:r>
+              <w:rPr>
+                <w:rStyle w:val="VerbatimChar"/>
+              </w:rPr>
+              <w:t xml:space="preserve">Migrations up to date without an "Applying …" line</w:t>
+            </w:r>
+          </w:p>
+        </w:tc>
+        <w:tc>
+          <w:tcPr/>
+          <w:p>
+            <w:pPr>
+              <w:pStyle w:val="Compact"/>
+              <w:jc w:val="left"/>
+            </w:pPr>
+            <w:r>
+              <w:t xml:space="preserve">The tables already exist — success (Step 2.5).</w:t>
+            </w:r>
+          </w:p>
+        </w:tc>
+      </w:tr>
+      <w:tr>
+        <w:tc>
+          <w:tcPr/>
+          <w:p>
+            <w:pPr>
+              <w:pStyle w:val="Compact"/>
+              <w:jc w:val="left"/>
+            </w:pPr>
+            <w:r>
+              <w:rPr>
+                <w:rStyle w:val="VerbatimChar"/>
+              </w:rPr>
+              <w:t xml:space="preserve">INF no leaks found from gitleaks</w:t>
+            </w:r>
+          </w:p>
+        </w:tc>
+        <w:tc>
+          <w:tcPr/>
+          <w:p>
+            <w:pPr>
+              <w:pStyle w:val="Compact"/>
+              <w:jc w:val="left"/>
+            </w:pPr>
+            <w:r>
+              <w:t xml:space="preserve">You’re on a gitleaks version whose default rule skips low-entropy keys. The project config (</w:t>
+            </w:r>
+            <w:r>
+              <w:rPr>
+                <w:rStyle w:val="VerbatimChar"/>
+              </w:rPr>
+              <w:t xml:space="preserve">gitleaks.toml</w:t>
+            </w:r>
+            <w:r>
+              <w:t xml:space="preserve">) catches it anyway (Step 7.2).</w:t>
+            </w:r>
+          </w:p>
+        </w:tc>
+      </w:tr>
+    </w:tbl>
     <w:bookmarkStart w:id="99" w:name="what-i-learned-the-short-version"/>
+    <w:bookmarkEnd w:id="99"/>
     <w:p>
       <w:pPr>
         <w:pStyle w:val="Heading2"/>
@@ -15845,7 +19874,6 @@
         <w:t xml:space="preserve">The violation PR proved it.</w:t>
       </w:r>
     </w:p>
-    <w:bookmarkEnd w:id="99"/>
     <w:bookmarkStart w:id="100" w:name="evidence-index"/>
     <w:p>
       <w:pPr>
@@ -17037,6 +21065,59 @@
       <w:b w:val="0"/>
       <w:bCs w:val="0"/>
       <w:color w:themeColor="accent1" w:themeShade="BF" w:val="365F91"/>
+    </w:rPr>
+  </w:style>
+  <w:style w:type="paragraph" w:styleId="TOC1">
+    <w:name w:val="toc 1"/>
+    <w:basedOn w:val="Normal"/>
+    <w:next w:val="Normal"/>
+    <w:autoRedefine/>
+    <w:uiPriority w:val="39"/>
+    <w:unhideWhenUsed/>
+    <w:pPr>
+      <w:keepNext/>
+      <w:keepLines/>
+      <w:outlineLvl w:val="9"/>
+    </w:pPr>
+    <w:rPr>
+      <w:sz w:val="22"/>
+      <w:szCs w:val="22"/>
+    </w:rPr>
+  </w:style>
+  <w:style w:type="paragraph" w:styleId="TOC2">
+    <w:name w:val="toc 2"/>
+    <w:basedOn w:val="Normal"/>
+    <w:next w:val="Normal"/>
+    <w:autoRedefine/>
+    <w:uiPriority w:val="39"/>
+    <w:unhideWhenUsed/>
+    <w:pPr>
+      <w:keepNext/>
+      <w:keepLines/>
+      <w:ind w:left="240"/>
+      <w:outlineLvl w:val="9"/>
+    </w:pPr>
+    <w:rPr>
+      <w:sz w:val="22"/>
+      <w:szCs w:val="22"/>
+    </w:rPr>
+  </w:style>
+  <w:style w:type="paragraph" w:styleId="TOC3">
+    <w:name w:val="toc 3"/>
+    <w:basedOn w:val="Normal"/>
+    <w:next w:val="Normal"/>
+    <w:autoRedefine/>
+    <w:uiPriority w:val="39"/>
+    <w:unhideWhenUsed/>
+    <w:pPr>
+      <w:keepNext/>
+      <w:keepLines/>
+      <w:ind w:left="480"/>
+      <w:outlineLvl w:val="9"/>
+    </w:pPr>
+    <w:rPr>
+      <w:sz w:val="22"/>
+      <w:szCs w:val="22"/>
     </w:rPr>
   </w:style>
   <w:style w:type="paragraph" w:customStyle="1" w:styleId="SourceCode">

</xml_diff>

<commit_message>
docs: point new users to the project1-starter branch
</commit_message>
<xml_diff>
--- a/docs/walkthrough.docx
+++ b/docs/walkthrough.docx
@@ -257,7 +257,7 @@
         <w:rPr>
           <w:rStyle w:val="VerbatimChar"/>
         </w:rPr>
-        <w:t xml:space="preserve">starter</w:t>
+        <w:t xml:space="preserve">project1-starter</w:t>
       </w:r>
       <w:r>
         <w:t xml:space="preserve"> </w:t>
@@ -306,7 +306,7 @@
           <w:rStyle w:val="NormalTok"/>
           <w:color w:val="C00000"/>
         </w:rPr>
-        <w:t xml:space="preserve"> checkout starter</w:t>
+        <w:t xml:space="preserve"> checkout project1-starter</w:t>
       </w:r>
     </w:p>
     <w:p>

</xml_diff>